<commit_message>
Evening session 27 Sep: rule vs brain on a dry leaky box, dead-mister fault not detected (negative result); paper, results and data index updated; session figures named by start time
Co-Authored-By: Claude Fable 5.1 <noreply@anthropic.com>
</commit_message>
<xml_diff>
--- a/docs/paper/terrarium-brain-paper.docx
+++ b/docs/paper/terrarium-brain-paper.docx
@@ -647,7 +647,7 @@
           <w:sz w:val="20"/>
           <w:szCs w:val="20"/>
         </w:rPr>
-        <w:t xml:space="preserve">—Low-cost terrarium and small-greenhouse controllers keep humidity with a fixed hysteresis rule that neither adapts to the enclosure nor notices when a part fails. This paper presents a controller in which one small model of the enclosure, six weights fitted by recursive least squares in absolute humidity, is used for three purposes at once: it is learned from the enclosure's own response, it plans the length of each mist burst, and it detects and names faults by comparing what should happen with what does. The model is physics-shaped, so each weight corresponds to a part (mister strength, leakage, fan, background), and a suspect-then-test procedure separates a leak from a dead mister by a short quiet watch followed by a mist test. The controller was evaluated on a real acrylic enclosure with an ultrasonic mist maker, two BME280 sensors and an ESP32, against the enclosure's existing 75 to 90 percent hysteresis rule, with all readings logged at 1 Hz. A three-round step test characterised the enclosure (mister ceiling 89.5 plus or minus 0.4 percent RH reached in 104 plus or minus 7 s). In one hour of alternating 30 min blocks on the same enclosure the learning controller held the target band 100 percent of the time with no misting, where the hysteresis rule held it 99.4 percent of the time using 14.6 min of mist. With the lid removed as an injected fault, the controller flagged an anomaly within 1 s, kept the band with three 35 s test bursts, and named the fault as a leak after 400 s; a later false alarm caused by a drying sensor was tested and cleared by the controller itself in 6.5 min. The model also re-fitted itself to the leakier, opened enclosure within 25 min without any misting data. Limitations are stated: the controller executed on a laptop over USB at 5 s steps rather than on the ESP32, the evaluation covers three hours on one enclosure without plants, and burst planning was exercised on the real enclosure only during the fault.</w:t>
+        <w:t xml:space="preserve">—Low-cost terrarium and small-greenhouse controllers keep humidity with a fixed hysteresis rule that neither adapts to the enclosure nor notices when a part fails. This paper presents a controller in which one small model of the enclosure, six weights fitted by recursive least squares in absolute humidity, is used for three purposes at once: it is learned from the enclosure's own response, it plans the length of each mist burst, and it detects and names faults by comparing what should happen with what does. The model is physics-shaped, so each weight corresponds to a part (mister strength, leakage, fan, background), and a suspect-then-test procedure separates a leak from a dead mister by a short quiet watch followed by a mist test. The controller was evaluated on a real acrylic enclosure with an ultrasonic mist maker, two BME280 sensors and an ESP32, against the enclosure's existing 75 to 90 percent hysteresis rule, with all readings logged at 1 Hz. A three-round step test characterised the enclosure (mister ceiling 89.5 plus or minus 0.4 percent RH reached in 104 plus or minus 7 s). In alternating 30 min blocks on the same enclosure, on a night when the enclosure held its own humidity the learning controller kept the target band 100 percent of the time with no misting where the hysteresis rule used 14.6 min of mist for 99.4 percent; on a drier evening when the enclosure needed continual misting it kept the band 74 and 99 percent of the time against the rule's 66 and 91 percent in paired blocks, at about 40 percent more mist. With the lid removed as an injected fault, the controller flagged an anomaly within 1 s, kept the band with three 35 s test bursts, and named the fault as a leak after 400 s; a later false alarm caused by a drying sensor was tested and cleared by the controller itself in 6.5 min. The model also re-fitted itself to the leakier, opened enclosure within 25 min without any misting data. A software-injected dead mister was not detected within 12 min, because on a leaky enclosure near its passive equilibrium the humidity signature of a dead mister lies inside the model's error; this negative result and its remedy are reported. Limitations are stated: the controller executed on a laptop over USB at 5 s steps rather than on the ESP32, and the evaluation covers five and a half hours on one enclosure without plants.</w:t>
       </w:r>
     </w:p>
     <w:p>
@@ -1056,7 +1056,7 @@
           <w:sz w:val="20"/>
           <w:szCs w:val="20"/>
         </w:rPr>
-        <w:t xml:space="preserve">With the lid propped 4 cm, the wiring redone and both sensors verified at 100 percent valid readings over 2 min, the two controllers alternated in 30 min blocks: rule, learning, rule, learning, on the same enclosure in one uninterrupted two-hour night session, each block starting from the state the previous one left. Metrics per block are the fraction of valid control-sensor readings inside the 75 to 90 percent band, above 90 and below 75 percent, mist minutes, and the number of mist switch-ons. Mist minutes are used as the water measure; the water volume was not weighed.</w:t>
+        <w:t xml:space="preserve">With the lid propped 4 cm, the wiring redone and both sensors verified at 100 percent valid readings over 2 min, the two controllers alternated in 30 min blocks: rule, learning, rule, learning, on the same enclosure in one uninterrupted two-hour night session, each block starting from the state the previous one left. The same design was repeated the following evening, when the room had dried to 69 percent RH and the enclosure stood at 69 percent, in the order learning, rule, learning, rule, followed by a fifth learning block in which, from minute 6 to minute 18, the mist commands issued by the controller were dropped before reaching the firmware, so that the mister was effectively dead while the controller believed it was misting. Metrics per block are the fraction of valid control-sensor readings inside the 75 to 90 percent band, above 90 and below 75 percent, mist minutes, and the number of mist switch-ons. Mist minutes are used as the water measure; the water volume was not weighed.</w:t>
       </w:r>
     </w:p>
     <w:p>
@@ -4364,7 +4364,917 @@
           <w:sz w:val="16"/>
           <w:szCs w:val="16"/>
         </w:rPr>
-        <w:t xml:space="preserve">Fig. 3. Alternating session: the rule mists to its 300 s cap whenever the enclosure reaches 75 %; the learning controller, judging the enclosure's own equilibrium sufficient, never mists.</w:t>
+        <w:t xml:space="preserve">Fig. 3. Alternating session, night: the rule mists to its 300 s cap whenever the enclosure reaches 75 %; the learning controller, judging the enclosure's own equilibrium sufficient, never mists.</w:t>
+      </w:r>
+    </w:p>
+    <w:p>
+      <w:pPr>
+        <w:spacing w:after="0" w:line="240"/>
+        <w:ind w:firstLine="200"/>
+        <w:jc w:val="both"/>
+      </w:pPr>
+      <w:r>
+        <w:rPr>
+          <w:sz w:val="20"/>
+          <w:szCs w:val="20"/>
+        </w:rPr>
+        <w:t xml:space="preserve">The following evening the room had dried to 69 percent and the enclosure to 69 percent, and the picture reversed: the enclosure's passive equilibrium was now about 74 percent, just below the band, and one mist maker could raise the control reading only to about 82 percent, short of the controller's 88 percent target. Both controllers therefore misted most of the time (Table V, Fig. 4). Taking the blocks as pairs on the same enclosure, the learning controller held the band 74.3 percent of the time against the rule's 65.6 percent starting from the dry enclosure, and 99.4 against 90.9 percent starting from an enclosure the previous block had left in band. It did so by holding the band from below with full-length bursts separated by 60 s rests, where the rule's fixed 180 s rest let the enclosure fall below 75 percent in every cycle; the cost was about 40 percent more mist time, 24 min against 16 to 18 min per half hour. The slow model's leak weight moved from the seeded minus 0.036 to minus 0.23, minus 0.16 and minus 0.13 per step over the three learning blocks. All 9,000 samples of the evening were valid, and no chip restart occurred.</w:t>
+      </w:r>
+    </w:p>
+    <w:p>
+      <w:pPr>
+        <w:keepNext/>
+        <w:spacing w:after="60" w:before="120"/>
+        <w:jc w:val="center"/>
+      </w:pPr>
+      <w:r>
+        <w:rPr>
+          <w:smallCaps/>
+          <w:sz w:val="16"/>
+          <w:szCs w:val="16"/>
+        </w:rPr>
+        <w:t xml:space="preserve">TABLE V.  Alternating 30 min Blocks on a Dry Enclosure, Lid 4 cm (27 Sep 2026, evening)</w:t>
+      </w:r>
+    </w:p>
+    <w:tbl>
+      <w:tblPr>
+        <w:tblW w:type="dxa" w:w="4700"/>
+        <w:tblBorders>
+          <w:top w:val="single" w:color="auto" w:sz="4"/>
+          <w:left w:val="single" w:color="auto" w:sz="4"/>
+          <w:bottom w:val="single" w:color="auto" w:sz="4"/>
+          <w:right w:val="single" w:color="auto" w:sz="4"/>
+          <w:insideH w:val="single" w:color="auto" w:sz="4"/>
+          <w:insideV w:val="single" w:color="auto" w:sz="4"/>
+        </w:tblBorders>
+      </w:tblPr>
+      <w:tblGrid>
+        <w:gridCol w:w="1700"/>
+        <w:gridCol w:w="760"/>
+        <w:gridCol w:w="760"/>
+        <w:gridCol w:w="780"/>
+        <w:gridCol w:w="700"/>
+      </w:tblGrid>
+      <w:tr>
+        <w:trPr>
+          <w:cantSplit/>
+          <w:tblHeader/>
+        </w:trPr>
+        <w:tc>
+          <w:tcPr>
+            <w:tcW w:type="dxa" w:w="1700"/>
+            <w:shd w:fill="E7E6E6" w:color="auto" w:val="clear"/>
+            <w:tcMar>
+              <w:top w:type="dxa" w:w="40"/>
+              <w:left w:type="dxa" w:w="80"/>
+              <w:bottom w:type="dxa" w:w="40"/>
+              <w:right w:type="dxa" w:w="80"/>
+            </w:tcMar>
+            <w:vAlign w:val="center"/>
+          </w:tcPr>
+          <w:p>
+            <w:pPr>
+              <w:spacing w:after="0"/>
+              <w:jc w:val="left"/>
+            </w:pPr>
+            <w:r>
+              <w:rPr>
+                <w:b/>
+                <w:bCs/>
+                <w:sz w:val="15"/>
+                <w:szCs w:val="15"/>
+              </w:rPr>
+              <w:t xml:space="preserve">Block</w:t>
+            </w:r>
+          </w:p>
+        </w:tc>
+        <w:tc>
+          <w:tcPr>
+            <w:tcW w:type="dxa" w:w="760"/>
+            <w:shd w:fill="E7E6E6" w:color="auto" w:val="clear"/>
+            <w:tcMar>
+              <w:top w:type="dxa" w:w="40"/>
+              <w:left w:type="dxa" w:w="80"/>
+              <w:bottom w:type="dxa" w:w="40"/>
+              <w:right w:type="dxa" w:w="80"/>
+            </w:tcMar>
+            <w:vAlign w:val="center"/>
+          </w:tcPr>
+          <w:p>
+            <w:pPr>
+              <w:spacing w:after="0"/>
+              <w:jc w:val="center"/>
+            </w:pPr>
+            <w:r>
+              <w:rPr>
+                <w:b/>
+                <w:bCs/>
+                <w:sz w:val="15"/>
+                <w:szCs w:val="15"/>
+              </w:rPr>
+              <w:t xml:space="preserve">In 75–90 %</w:t>
+            </w:r>
+          </w:p>
+        </w:tc>
+        <w:tc>
+          <w:tcPr>
+            <w:tcW w:type="dxa" w:w="760"/>
+            <w:shd w:fill="E7E6E6" w:color="auto" w:val="clear"/>
+            <w:tcMar>
+              <w:top w:type="dxa" w:w="40"/>
+              <w:left w:type="dxa" w:w="80"/>
+              <w:bottom w:type="dxa" w:w="40"/>
+              <w:right w:type="dxa" w:w="80"/>
+            </w:tcMar>
+            <w:vAlign w:val="center"/>
+          </w:tcPr>
+          <w:p>
+            <w:pPr>
+              <w:spacing w:after="0"/>
+              <w:jc w:val="center"/>
+            </w:pPr>
+            <w:r>
+              <w:rPr>
+                <w:b/>
+                <w:bCs/>
+                <w:sz w:val="15"/>
+                <w:szCs w:val="15"/>
+              </w:rPr>
+              <w:t xml:space="preserve">Below 75 %</w:t>
+            </w:r>
+          </w:p>
+        </w:tc>
+        <w:tc>
+          <w:tcPr>
+            <w:tcW w:type="dxa" w:w="780"/>
+            <w:shd w:fill="E7E6E6" w:color="auto" w:val="clear"/>
+            <w:tcMar>
+              <w:top w:type="dxa" w:w="40"/>
+              <w:left w:type="dxa" w:w="80"/>
+              <w:bottom w:type="dxa" w:w="40"/>
+              <w:right w:type="dxa" w:w="80"/>
+            </w:tcMar>
+            <w:vAlign w:val="center"/>
+          </w:tcPr>
+          <w:p>
+            <w:pPr>
+              <w:spacing w:after="0"/>
+              <w:jc w:val="center"/>
+            </w:pPr>
+            <w:r>
+              <w:rPr>
+                <w:b/>
+                <w:bCs/>
+                <w:sz w:val="15"/>
+                <w:szCs w:val="15"/>
+              </w:rPr>
+              <w:t xml:space="preserve">Mist min</w:t>
+            </w:r>
+          </w:p>
+        </w:tc>
+        <w:tc>
+          <w:tcPr>
+            <w:tcW w:type="dxa" w:w="700"/>
+            <w:shd w:fill="E7E6E6" w:color="auto" w:val="clear"/>
+            <w:tcMar>
+              <w:top w:type="dxa" w:w="40"/>
+              <w:left w:type="dxa" w:w="80"/>
+              <w:bottom w:type="dxa" w:w="40"/>
+              <w:right w:type="dxa" w:w="80"/>
+            </w:tcMar>
+            <w:vAlign w:val="center"/>
+          </w:tcPr>
+          <w:p>
+            <w:pPr>
+              <w:spacing w:after="0"/>
+              <w:jc w:val="center"/>
+            </w:pPr>
+            <w:r>
+              <w:rPr>
+                <w:b/>
+                <w:bCs/>
+                <w:sz w:val="15"/>
+                <w:szCs w:val="15"/>
+              </w:rPr>
+              <w:t xml:space="preserve">Bursts</w:t>
+            </w:r>
+          </w:p>
+        </w:tc>
+      </w:tr>
+      <w:tr>
+        <w:trPr>
+          <w:cantSplit/>
+          <w:tblHeader w:val="false"/>
+        </w:trPr>
+        <w:tc>
+          <w:tcPr>
+            <w:tcW w:type="dxa" w:w="1700"/>
+            <w:tcMar>
+              <w:top w:type="dxa" w:w="40"/>
+              <w:left w:type="dxa" w:w="80"/>
+              <w:bottom w:type="dxa" w:w="40"/>
+              <w:right w:type="dxa" w:w="80"/>
+            </w:tcMar>
+            <w:vAlign w:val="center"/>
+          </w:tcPr>
+          <w:p>
+            <w:pPr>
+              <w:spacing w:after="0"/>
+              <w:jc w:val="left"/>
+            </w:pPr>
+            <w:r>
+              <w:rPr>
+                <w:sz w:val="15"/>
+                <w:szCs w:val="15"/>
+              </w:rPr>
+              <w:t xml:space="preserve">Learning, 20:03 (dry start)</w:t>
+            </w:r>
+          </w:p>
+        </w:tc>
+        <w:tc>
+          <w:tcPr>
+            <w:tcW w:type="dxa" w:w="760"/>
+            <w:tcMar>
+              <w:top w:type="dxa" w:w="40"/>
+              <w:left w:type="dxa" w:w="80"/>
+              <w:bottom w:type="dxa" w:w="40"/>
+              <w:right w:type="dxa" w:w="80"/>
+            </w:tcMar>
+            <w:vAlign w:val="center"/>
+          </w:tcPr>
+          <w:p>
+            <w:pPr>
+              <w:spacing w:after="0"/>
+              <w:jc w:val="center"/>
+            </w:pPr>
+            <w:r>
+              <w:rPr>
+                <w:sz w:val="15"/>
+                <w:szCs w:val="15"/>
+              </w:rPr>
+              <w:t xml:space="preserve">74.3 %</w:t>
+            </w:r>
+          </w:p>
+        </w:tc>
+        <w:tc>
+          <w:tcPr>
+            <w:tcW w:type="dxa" w:w="760"/>
+            <w:tcMar>
+              <w:top w:type="dxa" w:w="40"/>
+              <w:left w:type="dxa" w:w="80"/>
+              <w:bottom w:type="dxa" w:w="40"/>
+              <w:right w:type="dxa" w:w="80"/>
+            </w:tcMar>
+            <w:vAlign w:val="center"/>
+          </w:tcPr>
+          <w:p>
+            <w:pPr>
+              <w:spacing w:after="0"/>
+              <w:jc w:val="center"/>
+            </w:pPr>
+            <w:r>
+              <w:rPr>
+                <w:sz w:val="15"/>
+                <w:szCs w:val="15"/>
+              </w:rPr>
+              <w:t xml:space="preserve">25.7 %</w:t>
+            </w:r>
+          </w:p>
+        </w:tc>
+        <w:tc>
+          <w:tcPr>
+            <w:tcW w:type="dxa" w:w="780"/>
+            <w:tcMar>
+              <w:top w:type="dxa" w:w="40"/>
+              <w:left w:type="dxa" w:w="80"/>
+              <w:bottom w:type="dxa" w:w="40"/>
+              <w:right w:type="dxa" w:w="80"/>
+            </w:tcMar>
+            <w:vAlign w:val="center"/>
+          </w:tcPr>
+          <w:p>
+            <w:pPr>
+              <w:spacing w:after="0"/>
+              <w:jc w:val="center"/>
+            </w:pPr>
+            <w:r>
+              <w:rPr>
+                <w:sz w:val="15"/>
+                <w:szCs w:val="15"/>
+              </w:rPr>
+              <w:t xml:space="preserve">24.1</w:t>
+            </w:r>
+          </w:p>
+        </w:tc>
+        <w:tc>
+          <w:tcPr>
+            <w:tcW w:type="dxa" w:w="700"/>
+            <w:tcMar>
+              <w:top w:type="dxa" w:w="40"/>
+              <w:left w:type="dxa" w:w="80"/>
+              <w:bottom w:type="dxa" w:w="40"/>
+              <w:right w:type="dxa" w:w="80"/>
+            </w:tcMar>
+            <w:vAlign w:val="center"/>
+          </w:tcPr>
+          <w:p>
+            <w:pPr>
+              <w:spacing w:after="0"/>
+              <w:jc w:val="center"/>
+            </w:pPr>
+            <w:r>
+              <w:rPr>
+                <w:sz w:val="15"/>
+                <w:szCs w:val="15"/>
+              </w:rPr>
+              <w:t xml:space="preserve">6</w:t>
+            </w:r>
+          </w:p>
+        </w:tc>
+      </w:tr>
+      <w:tr>
+        <w:trPr>
+          <w:cantSplit/>
+          <w:tblHeader w:val="false"/>
+        </w:trPr>
+        <w:tc>
+          <w:tcPr>
+            <w:tcW w:type="dxa" w:w="1700"/>
+            <w:tcMar>
+              <w:top w:type="dxa" w:w="40"/>
+              <w:left w:type="dxa" w:w="80"/>
+              <w:bottom w:type="dxa" w:w="40"/>
+              <w:right w:type="dxa" w:w="80"/>
+            </w:tcMar>
+            <w:vAlign w:val="center"/>
+          </w:tcPr>
+          <w:p>
+            <w:pPr>
+              <w:spacing w:after="0"/>
+              <w:jc w:val="left"/>
+            </w:pPr>
+            <w:r>
+              <w:rPr>
+                <w:sz w:val="15"/>
+                <w:szCs w:val="15"/>
+              </w:rPr>
+              <w:t xml:space="preserve">Rule, 20:33</w:t>
+            </w:r>
+          </w:p>
+        </w:tc>
+        <w:tc>
+          <w:tcPr>
+            <w:tcW w:type="dxa" w:w="760"/>
+            <w:tcMar>
+              <w:top w:type="dxa" w:w="40"/>
+              <w:left w:type="dxa" w:w="80"/>
+              <w:bottom w:type="dxa" w:w="40"/>
+              <w:right w:type="dxa" w:w="80"/>
+            </w:tcMar>
+            <w:vAlign w:val="center"/>
+          </w:tcPr>
+          <w:p>
+            <w:pPr>
+              <w:spacing w:after="0"/>
+              <w:jc w:val="center"/>
+            </w:pPr>
+            <w:r>
+              <w:rPr>
+                <w:sz w:val="15"/>
+                <w:szCs w:val="15"/>
+              </w:rPr>
+              <w:t xml:space="preserve">65.6 %</w:t>
+            </w:r>
+          </w:p>
+        </w:tc>
+        <w:tc>
+          <w:tcPr>
+            <w:tcW w:type="dxa" w:w="760"/>
+            <w:tcMar>
+              <w:top w:type="dxa" w:w="40"/>
+              <w:left w:type="dxa" w:w="80"/>
+              <w:bottom w:type="dxa" w:w="40"/>
+              <w:right w:type="dxa" w:w="80"/>
+            </w:tcMar>
+            <w:vAlign w:val="center"/>
+          </w:tcPr>
+          <w:p>
+            <w:pPr>
+              <w:spacing w:after="0"/>
+              <w:jc w:val="center"/>
+            </w:pPr>
+            <w:r>
+              <w:rPr>
+                <w:sz w:val="15"/>
+                <w:szCs w:val="15"/>
+              </w:rPr>
+              <w:t xml:space="preserve">34.4 %</w:t>
+            </w:r>
+          </w:p>
+        </w:tc>
+        <w:tc>
+          <w:tcPr>
+            <w:tcW w:type="dxa" w:w="780"/>
+            <w:tcMar>
+              <w:top w:type="dxa" w:w="40"/>
+              <w:left w:type="dxa" w:w="80"/>
+              <w:bottom w:type="dxa" w:w="40"/>
+              <w:right w:type="dxa" w:w="80"/>
+            </w:tcMar>
+            <w:vAlign w:val="center"/>
+          </w:tcPr>
+          <w:p>
+            <w:pPr>
+              <w:spacing w:after="0"/>
+              <w:jc w:val="center"/>
+            </w:pPr>
+            <w:r>
+              <w:rPr>
+                <w:sz w:val="15"/>
+                <w:szCs w:val="15"/>
+              </w:rPr>
+              <w:t xml:space="preserve">18.2</w:t>
+            </w:r>
+          </w:p>
+        </w:tc>
+        <w:tc>
+          <w:tcPr>
+            <w:tcW w:type="dxa" w:w="700"/>
+            <w:tcMar>
+              <w:top w:type="dxa" w:w="40"/>
+              <w:left w:type="dxa" w:w="80"/>
+              <w:bottom w:type="dxa" w:w="40"/>
+              <w:right w:type="dxa" w:w="80"/>
+            </w:tcMar>
+            <w:vAlign w:val="center"/>
+          </w:tcPr>
+          <w:p>
+            <w:pPr>
+              <w:spacing w:after="0"/>
+              <w:jc w:val="center"/>
+            </w:pPr>
+            <w:r>
+              <w:rPr>
+                <w:sz w:val="15"/>
+                <w:szCs w:val="15"/>
+              </w:rPr>
+              <w:t xml:space="preserve">4</w:t>
+            </w:r>
+          </w:p>
+        </w:tc>
+      </w:tr>
+      <w:tr>
+        <w:trPr>
+          <w:cantSplit/>
+          <w:tblHeader w:val="false"/>
+        </w:trPr>
+        <w:tc>
+          <w:tcPr>
+            <w:tcW w:type="dxa" w:w="1700"/>
+            <w:tcMar>
+              <w:top w:type="dxa" w:w="40"/>
+              <w:left w:type="dxa" w:w="80"/>
+              <w:bottom w:type="dxa" w:w="40"/>
+              <w:right w:type="dxa" w:w="80"/>
+            </w:tcMar>
+            <w:vAlign w:val="center"/>
+          </w:tcPr>
+          <w:p>
+            <w:pPr>
+              <w:spacing w:after="0"/>
+              <w:jc w:val="left"/>
+            </w:pPr>
+            <w:r>
+              <w:rPr>
+                <w:sz w:val="15"/>
+                <w:szCs w:val="15"/>
+              </w:rPr>
+              <w:t xml:space="preserve">Learning, 21:03</w:t>
+            </w:r>
+          </w:p>
+        </w:tc>
+        <w:tc>
+          <w:tcPr>
+            <w:tcW w:type="dxa" w:w="760"/>
+            <w:tcMar>
+              <w:top w:type="dxa" w:w="40"/>
+              <w:left w:type="dxa" w:w="80"/>
+              <w:bottom w:type="dxa" w:w="40"/>
+              <w:right w:type="dxa" w:w="80"/>
+            </w:tcMar>
+            <w:vAlign w:val="center"/>
+          </w:tcPr>
+          <w:p>
+            <w:pPr>
+              <w:spacing w:after="0"/>
+              <w:jc w:val="center"/>
+            </w:pPr>
+            <w:r>
+              <w:rPr>
+                <w:sz w:val="15"/>
+                <w:szCs w:val="15"/>
+              </w:rPr>
+              <w:t xml:space="preserve">99.4 %</w:t>
+            </w:r>
+          </w:p>
+        </w:tc>
+        <w:tc>
+          <w:tcPr>
+            <w:tcW w:type="dxa" w:w="760"/>
+            <w:tcMar>
+              <w:top w:type="dxa" w:w="40"/>
+              <w:left w:type="dxa" w:w="80"/>
+              <w:bottom w:type="dxa" w:w="40"/>
+              <w:right w:type="dxa" w:w="80"/>
+            </w:tcMar>
+            <w:vAlign w:val="center"/>
+          </w:tcPr>
+          <w:p>
+            <w:pPr>
+              <w:spacing w:after="0"/>
+              <w:jc w:val="center"/>
+            </w:pPr>
+            <w:r>
+              <w:rPr>
+                <w:sz w:val="15"/>
+                <w:szCs w:val="15"/>
+              </w:rPr>
+              <w:t xml:space="preserve">0.6 %</w:t>
+            </w:r>
+          </w:p>
+        </w:tc>
+        <w:tc>
+          <w:tcPr>
+            <w:tcW w:type="dxa" w:w="780"/>
+            <w:tcMar>
+              <w:top w:type="dxa" w:w="40"/>
+              <w:left w:type="dxa" w:w="80"/>
+              <w:bottom w:type="dxa" w:w="40"/>
+              <w:right w:type="dxa" w:w="80"/>
+            </w:tcMar>
+            <w:vAlign w:val="center"/>
+          </w:tcPr>
+          <w:p>
+            <w:pPr>
+              <w:spacing w:after="0"/>
+              <w:jc w:val="center"/>
+            </w:pPr>
+            <w:r>
+              <w:rPr>
+                <w:sz w:val="15"/>
+                <w:szCs w:val="15"/>
+              </w:rPr>
+              <w:t xml:space="preserve">24.0</w:t>
+            </w:r>
+          </w:p>
+        </w:tc>
+        <w:tc>
+          <w:tcPr>
+            <w:tcW w:type="dxa" w:w="700"/>
+            <w:tcMar>
+              <w:top w:type="dxa" w:w="40"/>
+              <w:left w:type="dxa" w:w="80"/>
+              <w:bottom w:type="dxa" w:w="40"/>
+              <w:right w:type="dxa" w:w="80"/>
+            </w:tcMar>
+            <w:vAlign w:val="center"/>
+          </w:tcPr>
+          <w:p>
+            <w:pPr>
+              <w:spacing w:after="0"/>
+              <w:jc w:val="center"/>
+            </w:pPr>
+            <w:r>
+              <w:rPr>
+                <w:sz w:val="15"/>
+                <w:szCs w:val="15"/>
+              </w:rPr>
+              <w:t xml:space="preserve">6</w:t>
+            </w:r>
+          </w:p>
+        </w:tc>
+      </w:tr>
+      <w:tr>
+        <w:trPr>
+          <w:cantSplit/>
+          <w:tblHeader w:val="false"/>
+        </w:trPr>
+        <w:tc>
+          <w:tcPr>
+            <w:tcW w:type="dxa" w:w="1700"/>
+            <w:tcMar>
+              <w:top w:type="dxa" w:w="40"/>
+              <w:left w:type="dxa" w:w="80"/>
+              <w:bottom w:type="dxa" w:w="40"/>
+              <w:right w:type="dxa" w:w="80"/>
+            </w:tcMar>
+            <w:vAlign w:val="center"/>
+          </w:tcPr>
+          <w:p>
+            <w:pPr>
+              <w:spacing w:after="0"/>
+              <w:jc w:val="left"/>
+            </w:pPr>
+            <w:r>
+              <w:rPr>
+                <w:sz w:val="15"/>
+                <w:szCs w:val="15"/>
+              </w:rPr>
+              <w:t xml:space="preserve">Rule, 21:33</w:t>
+            </w:r>
+          </w:p>
+        </w:tc>
+        <w:tc>
+          <w:tcPr>
+            <w:tcW w:type="dxa" w:w="760"/>
+            <w:tcMar>
+              <w:top w:type="dxa" w:w="40"/>
+              <w:left w:type="dxa" w:w="80"/>
+              <w:bottom w:type="dxa" w:w="40"/>
+              <w:right w:type="dxa" w:w="80"/>
+            </w:tcMar>
+            <w:vAlign w:val="center"/>
+          </w:tcPr>
+          <w:p>
+            <w:pPr>
+              <w:spacing w:after="0"/>
+              <w:jc w:val="center"/>
+            </w:pPr>
+            <w:r>
+              <w:rPr>
+                <w:sz w:val="15"/>
+                <w:szCs w:val="15"/>
+              </w:rPr>
+              <w:t xml:space="preserve">90.9 %</w:t>
+            </w:r>
+          </w:p>
+        </w:tc>
+        <w:tc>
+          <w:tcPr>
+            <w:tcW w:type="dxa" w:w="760"/>
+            <w:tcMar>
+              <w:top w:type="dxa" w:w="40"/>
+              <w:left w:type="dxa" w:w="80"/>
+              <w:bottom w:type="dxa" w:w="40"/>
+              <w:right w:type="dxa" w:w="80"/>
+            </w:tcMar>
+            <w:vAlign w:val="center"/>
+          </w:tcPr>
+          <w:p>
+            <w:pPr>
+              <w:spacing w:after="0"/>
+              <w:jc w:val="center"/>
+            </w:pPr>
+            <w:r>
+              <w:rPr>
+                <w:sz w:val="15"/>
+                <w:szCs w:val="15"/>
+              </w:rPr>
+              <w:t xml:space="preserve">9.1 %</w:t>
+            </w:r>
+          </w:p>
+        </w:tc>
+        <w:tc>
+          <w:tcPr>
+            <w:tcW w:type="dxa" w:w="780"/>
+            <w:tcMar>
+              <w:top w:type="dxa" w:w="40"/>
+              <w:left w:type="dxa" w:w="80"/>
+              <w:bottom w:type="dxa" w:w="40"/>
+              <w:right w:type="dxa" w:w="80"/>
+            </w:tcMar>
+            <w:vAlign w:val="center"/>
+          </w:tcPr>
+          <w:p>
+            <w:pPr>
+              <w:spacing w:after="0"/>
+              <w:jc w:val="center"/>
+            </w:pPr>
+            <w:r>
+              <w:rPr>
+                <w:sz w:val="15"/>
+                <w:szCs w:val="15"/>
+              </w:rPr>
+              <w:t xml:space="preserve">16.3</w:t>
+            </w:r>
+          </w:p>
+        </w:tc>
+        <w:tc>
+          <w:tcPr>
+            <w:tcW w:type="dxa" w:w="700"/>
+            <w:tcMar>
+              <w:top w:type="dxa" w:w="40"/>
+              <w:left w:type="dxa" w:w="80"/>
+              <w:bottom w:type="dxa" w:w="40"/>
+              <w:right w:type="dxa" w:w="80"/>
+            </w:tcMar>
+            <w:vAlign w:val="center"/>
+          </w:tcPr>
+          <w:p>
+            <w:pPr>
+              <w:spacing w:after="0"/>
+              <w:jc w:val="center"/>
+            </w:pPr>
+            <w:r>
+              <w:rPr>
+                <w:sz w:val="15"/>
+                <w:szCs w:val="15"/>
+              </w:rPr>
+              <w:t xml:space="preserve">4</w:t>
+            </w:r>
+          </w:p>
+        </w:tc>
+      </w:tr>
+      <w:tr>
+        <w:trPr>
+          <w:cantSplit/>
+          <w:tblHeader w:val="false"/>
+        </w:trPr>
+        <w:tc>
+          <w:tcPr>
+            <w:tcW w:type="dxa" w:w="1700"/>
+            <w:tcMar>
+              <w:top w:type="dxa" w:w="40"/>
+              <w:left w:type="dxa" w:w="80"/>
+              <w:bottom w:type="dxa" w:w="40"/>
+              <w:right w:type="dxa" w:w="80"/>
+            </w:tcMar>
+            <w:vAlign w:val="center"/>
+          </w:tcPr>
+          <w:p>
+            <w:pPr>
+              <w:spacing w:after="0"/>
+              <w:jc w:val="left"/>
+            </w:pPr>
+            <w:r>
+              <w:rPr>
+                <w:sz w:val="15"/>
+                <w:szCs w:val="15"/>
+              </w:rPr>
+              <w:t xml:space="preserve">Learning, 22:03, dead mister 22:09–22:21</w:t>
+            </w:r>
+          </w:p>
+        </w:tc>
+        <w:tc>
+          <w:tcPr>
+            <w:tcW w:type="dxa" w:w="760"/>
+            <w:tcMar>
+              <w:top w:type="dxa" w:w="40"/>
+              <w:left w:type="dxa" w:w="80"/>
+              <w:bottom w:type="dxa" w:w="40"/>
+              <w:right w:type="dxa" w:w="80"/>
+            </w:tcMar>
+            <w:vAlign w:val="center"/>
+          </w:tcPr>
+          <w:p>
+            <w:pPr>
+              <w:spacing w:after="0"/>
+              <w:jc w:val="center"/>
+            </w:pPr>
+            <w:r>
+              <w:rPr>
+                <w:sz w:val="15"/>
+                <w:szCs w:val="15"/>
+              </w:rPr>
+              <w:t xml:space="preserve">78.9 %</w:t>
+            </w:r>
+          </w:p>
+        </w:tc>
+        <w:tc>
+          <w:tcPr>
+            <w:tcW w:type="dxa" w:w="760"/>
+            <w:tcMar>
+              <w:top w:type="dxa" w:w="40"/>
+              <w:left w:type="dxa" w:w="80"/>
+              <w:bottom w:type="dxa" w:w="40"/>
+              <w:right w:type="dxa" w:w="80"/>
+            </w:tcMar>
+            <w:vAlign w:val="center"/>
+          </w:tcPr>
+          <w:p>
+            <w:pPr>
+              <w:spacing w:after="0"/>
+              <w:jc w:val="center"/>
+            </w:pPr>
+            <w:r>
+              <w:rPr>
+                <w:sz w:val="15"/>
+                <w:szCs w:val="15"/>
+              </w:rPr>
+              <w:t xml:space="preserve">21.1 %</w:t>
+            </w:r>
+          </w:p>
+        </w:tc>
+        <w:tc>
+          <w:tcPr>
+            <w:tcW w:type="dxa" w:w="780"/>
+            <w:tcMar>
+              <w:top w:type="dxa" w:w="40"/>
+              <w:left w:type="dxa" w:w="80"/>
+              <w:bottom w:type="dxa" w:w="40"/>
+              <w:right w:type="dxa" w:w="80"/>
+            </w:tcMar>
+            <w:vAlign w:val="center"/>
+          </w:tcPr>
+          <w:p>
+            <w:pPr>
+              <w:spacing w:after="0"/>
+              <w:jc w:val="center"/>
+            </w:pPr>
+            <w:r>
+              <w:rPr>
+                <w:sz w:val="15"/>
+                <w:szCs w:val="15"/>
+              </w:rPr>
+              <w:t xml:space="preserve">13.9</w:t>
+            </w:r>
+          </w:p>
+        </w:tc>
+        <w:tc>
+          <w:tcPr>
+            <w:tcW w:type="dxa" w:w="700"/>
+            <w:tcMar>
+              <w:top w:type="dxa" w:w="40"/>
+              <w:left w:type="dxa" w:w="80"/>
+              <w:bottom w:type="dxa" w:w="40"/>
+              <w:right w:type="dxa" w:w="80"/>
+            </w:tcMar>
+            <w:vAlign w:val="center"/>
+          </w:tcPr>
+          <w:p>
+            <w:pPr>
+              <w:spacing w:after="0"/>
+              <w:jc w:val="center"/>
+            </w:pPr>
+            <w:r>
+              <w:rPr>
+                <w:sz w:val="15"/>
+                <w:szCs w:val="15"/>
+              </w:rPr>
+              <w:t xml:space="preserve">5</w:t>
+            </w:r>
+          </w:p>
+        </w:tc>
+      </w:tr>
+    </w:tbl>
+    <w:p>
+      <w:pPr>
+        <w:keepNext/>
+        <w:spacing w:after="60" w:before="120"/>
+        <w:jc w:val="center"/>
+      </w:pPr>
+      <w:r>
+        <w:drawing>
+          <wp:inline distT="0" distB="0" distL="0" distR="0">
+            <wp:extent cx="3086100" cy="1800225"/>
+            <wp:effectExtent t="0" r="0" b="0" l="0"/>
+            <wp:docPr id="1" name="" descr="" title=""/>
+            <wp:cNvGraphicFramePr>
+              <a:graphicFrameLocks xmlns:a="http://schemas.openxmlformats.org/drawingml/2006/main" noChangeAspect="1"/>
+            </wp:cNvGraphicFramePr>
+            <a:graphic xmlns:a="http://schemas.openxmlformats.org/drawingml/2006/main">
+              <a:graphicData uri="http://schemas.openxmlformats.org/drawingml/2006/picture">
+                <pic:pic xmlns:pic="http://schemas.openxmlformats.org/drawingml/2006/picture">
+                  <pic:nvPicPr>
+                    <pic:cNvPr id="0" name="" descr=""/>
+                    <pic:cNvPicPr>
+                      <a:picLocks noChangeAspect="1" noChangeArrowheads="1"/>
+                    </pic:cNvPicPr>
+                  </pic:nvPicPr>
+                  <pic:blipFill>
+                    <a:blip r:embed="rId12" cstate="none"/>
+                    <a:srcRect/>
+                    <a:stretch>
+                      <a:fillRect/>
+                    </a:stretch>
+                  </pic:blipFill>
+                  <pic:spPr bwMode="auto">
+                    <a:xfrm>
+                      <a:off x="0" y="0"/>
+                      <a:ext cx="3086100" cy="1800225"/>
+                    </a:xfrm>
+                    <a:prstGeom prst="rect">
+                      <a:avLst/>
+                    </a:prstGeom>
+                  </pic:spPr>
+                </pic:pic>
+              </a:graphicData>
+            </a:graphic>
+          </wp:inline>
+        </w:drawing>
+      </w:r>
+    </w:p>
+    <w:p>
+      <w:pPr>
+        <w:spacing w:after="160"/>
+        <w:jc w:val="center"/>
+      </w:pPr>
+      <w:r>
+        <w:rPr>
+          <w:sz w:val="16"/>
+          <w:szCs w:val="16"/>
+        </w:rPr>
+        <w:t xml:space="preserve">Fig. 4. Alternating session, evening, dry enclosure: both controllers mist most of the time; the dotted lines mark the software dead-mister window in the last block.</w:t>
       </w:r>
     </w:p>
     <w:p>
@@ -4379,7 +5289,7 @@
           <w:sz w:val="20"/>
           <w:szCs w:val="20"/>
         </w:rPr>
-        <w:t xml:space="preserve">D. Simulation as a Logic Check</w:t>
+        <w:t xml:space="preserve">D. Dead-Mister Fault: a Negative Result</w:t>
       </w:r>
     </w:p>
     <w:p>
@@ -4393,6 +5303,35 @@
           <w:sz w:val="20"/>
           <w:szCs w:val="20"/>
         </w:rPr>
+        <w:t xml:space="preserve">In the last block the controller's mist commands were dropped for 12 minutes. It commanded 450 s of misting in that window, none of which reached the enclosure; the control reading fell from 80.8 to 72.3 percent and the enclosure was in band 61 percent of the time. The controller declared no fault. Replaying the block offline shows why. The mister check compares the humidity gained during misting with the model's expectation after subtracting the modelled leak, and on this enclosure the leak term is large and imprecise: the check's ratio of measured to expected gain ran from 0.46 to 1.5 during the fault and from 0.5 to 1.5 in the healthy blocks, so there was nothing to detect. A raw burst-onset check, the rise in the first 60 s of a burst against the model's expectation, was tried offline and raised false alarms in healthy blocks, because the seeded mister weight over-predicts the first-minute rise at the shielded sensor position by about four times; it was not adopted. The lid-open fault of Section V-B was detected because it changes the leak by an order of magnitude, whereas a dead mister on an enclosure near its passive equilibrium changes humidity by a few percent, inside the model's error. Two remedies are available: a direct actuator signal, such as the mist maker's supply current or a droplet sensor above the disc, or an onset signature measured once at commissioning rather than predicted by the model.</w:t>
+      </w:r>
+    </w:p>
+    <w:p>
+      <w:pPr>
+        <w:keepNext/>
+        <w:spacing w:after="60" w:before="120"/>
+      </w:pPr>
+      <w:r>
+        <w:rPr>
+          <w:i/>
+          <w:iCs/>
+          <w:sz w:val="20"/>
+          <w:szCs w:val="20"/>
+        </w:rPr>
+        <w:t xml:space="preserve">E. Simulation as a Logic Check</w:t>
+      </w:r>
+    </w:p>
+    <w:p>
+      <w:pPr>
+        <w:spacing w:after="0" w:line="240"/>
+        <w:ind w:firstLine="200"/>
+        <w:jc w:val="both"/>
+      </w:pPr>
+      <w:r>
+        <w:rPr>
+          <w:sz w:val="20"/>
+          <w:szCs w:val="20"/>
+        </w:rPr>
         <w:t xml:space="preserve">Before the hardware runs the controller was exercised on a simulated enclosure for 76 h with slow disc wear, a memory corruption and four injected faults, with the simulator's constants later replaced by the measured values of Section V-A. In that setting it held the band 99.2 percent of healthy hours against 93.1 percent for the rule, used 20 percent less mist time, named every fault correctly on seven random seeds without false alarms, and rolled back its corrupted weights in the same step. The simulation is reported only as evidence that the logic behaves as designed; it is not a result about the real enclosure.</w:t>
       </w:r>
     </w:p>
@@ -4422,7 +5361,7 @@
           <w:sz w:val="20"/>
           <w:szCs w:val="20"/>
         </w:rPr>
-        <w:t xml:space="preserve">The measured results support four claims. A six-weight model seeded from a 90 min step test and updated on the fly can control a real enclosure at least as well as the hysteresis rule it replaces, holding the band 100 percent of the time in the alternating hour against 99.4 percent, and 95.4 percent against 96.5 percent in the fault session where the learning controller also carried an injected fault. It does so with far less mist time: none against 14.6 min per hour, and 1.1 min against 5.0 min in the fault-session blocks. It detects an unexplained loss within a second, keeps control while it investigates, names a leak correctly, and withdraws its own false alarm by testing rather than by timeout. And it follows a changed enclosure, re-fitting its leak weight by a factor of 3.6 within 25 min of the lid being propped, without any misting data. The engineering lessons are also results: a wet BME280 can lock the I2C bus and be recovered by a hardware watchdog without a host restart; corrupted bus reads pass naive range checks; and a sensor that reports a fixed 179.4 degrees C and 100 percent RH is not damaged but sitting at its power-on defaults because register writes are failing, which a solid clock line fixes and a power cycle does not.</w:t>
+        <w:t xml:space="preserve">The measured results support four claims. A six-weight model seeded from a 90 min step test and updated on the fly can control a real enclosure at least as well as the hysteresis rule it replaces, holding the band 100 percent of the time in the alternating hour against 99.4 percent, and 95.4 percent against 96.5 percent in the fault session where the learning controller also carried an injected fault. On an enclosure that needed no misting it used none where the rule used 14.6 min per hour; on an enclosure that needed continual misting it held the band more of the time than the rule in both paired blocks, at about 40 percent more mist time, because it rests 60 s between bursts where the rule rests 180 s. It detects an unexplained loss within a second, keeps control while it investigates, names a leak correctly, and withdraws its own false alarm by testing rather than by timeout. And it follows a changed enclosure, re-fitting its leak weight by a factor of 3.6 within 25 min of the lid being propped, without any misting data. The engineering lessons are also results: a wet BME280 can lock the I2C bus and be recovered by a hardware watchdog without a host restart; corrupted bus reads pass naive range checks; and a sensor that reports a fixed 179.4 degrees C and 100 percent RH is not damaged but sitting at its power-on defaults because register writes are failing, which a solid clock line fixes and a power cycle does not.</w:t>
       </w:r>
     </w:p>
     <w:p>
@@ -4436,7 +5375,7 @@
           <w:sz w:val="20"/>
           <w:szCs w:val="20"/>
         </w:rPr>
-        <w:t xml:space="preserve">The limitations are stated plainly. The controller executed on a laptop over USB at 5 s steps, not on the ESP32; the code is written for a direct port and its state is about 2 kB, but the on-chip run is future work. The evaluation is three hours on one enclosure in one room, at night, without plants, and mist minutes stand in for water volume. The zero-misting result in the alternating session is a result about an enclosure that barely needed misting, so it shows the learning controller recognising that fact rather than planning bursts; the only real-enclosure bursts it planned were the three 35 s test bursts during the lid fault, where it held the band. A drier room or a scheduled fan would make the planner act and would test it properly. The dead-mister fault and the backup switchover were exercised only in simulation. The false alarm after the tissue was removed was self-cleared, but it would be prevented outright by checking the sensor's own temperature, which fell 2 degrees C as it dried; that check is a natural addition. Finally, the interrupt-watchdog restart of the ESP32 in the last block is unexplained and must be root-caused before an on-chip deployment.</w:t>
+        <w:t xml:space="preserve">The limitations are stated plainly. The controller executed on a laptop over USB at 5 s steps, not on the ESP32; the code is written for a direct port and its state is about 2 kB, but the on-chip run is future work. The evaluation is five and a half hours on one enclosure in one room, without plants, and mist minutes stand in for water volume. The evening session showed the planner's weakness: when the target is unreachable it falls back to maximum-length bursts, which wins time in band at a water cost; a mode that holds the lower edge of the band would do the same job with less water. The dead-mister fault was not detected, for the reason given in Section V-D, and until the controller has a direct actuator signal that claim cannot be made for it. The backup-mister switchover was exercised only in simulation. The false alarm after the tissue was removed was self-cleared, but it would be prevented outright by checking the sensor's own temperature, which fell 2 degrees C as it dried; that check is a natural addition. Finally, the interrupt-watchdog restart of the ESP32 in the last block is unexplained and must be root-caused before an on-chip deployment.</w:t>
       </w:r>
     </w:p>
     <w:p>
@@ -4465,7 +5404,7 @@
           <w:sz w:val="20"/>
           <w:szCs w:val="20"/>
         </w:rPr>
-        <w:t xml:space="preserve">One small learned model, updated on the fly, can serve a low-cost terrarium as its humidity planner and its fault detector at once. On a real enclosure it matched or beat the existing hysteresis rule on time in band while misting far less, named an injected leak, cleared its own false alarm, and re-fitted itself to a changed enclosure. The next steps are to port the controller to the ESP32 and repeat the alternating comparison on the chip, to run it in conditions where the enclosure needs misting so that the planner is tested, to inject the dead-mister fault with the backup channel connected, to add the sensor-temperature check, and to extend the runs to days with plants in the enclosure. The logged data, firmware and controller code are kept with the project so the results can be reproduced.</w:t>
+        <w:t xml:space="preserve">One small learned model, updated on the fly, can serve a low-cost terrarium as its humidity planner and its fault detector at once. On a real enclosure it matched or beat the existing hysteresis rule on time in band, with no water where none was needed and with more water where the enclosure needed continual misting; it named an injected leak, cleared its own false alarm, and re-fitted itself to a changed enclosure. It did not detect a dead mister, and the paper says why. The next steps are to port the controller to the ESP32 and repeat the alternating comparison on the chip, to add a direct actuator signal or a commissioning-time onset signature for the mister, to add a lower-edge holding mode to the planner and the sensor-temperature check to the fault logic, and to extend the runs to days with plants in the enclosure. The logged data, firmware and controller code are kept with the project so the results can be reproduced.</w:t>
       </w:r>
     </w:p>
     <w:p>

</xml_diff>

<commit_message>
Full paper: system block diagram, model equations, fault-logic table, all references verified against Crossref with DOIs; 7 pages
Co-Authored-By: Claude Fable 5.1 <noreply@anthropic.com>
</commit_message>
<xml_diff>
--- a/docs/paper/terrarium-brain-paper.docx
+++ b/docs/paper/terrarium-brain-paper.docx
@@ -765,7 +765,7 @@
           <w:sz w:val="20"/>
           <w:szCs w:val="20"/>
         </w:rPr>
-        <w:t xml:space="preserve">Small models on microcontrollers for greenhouse climate are established. Codeluppi et al. forecast greenhouse air temperature on an edge device with an RMSE of 0.29 to 0.40 degrees C [1]; Ihoume et al. mapped sensor readings to five actuator actions with a 151-parameter network at 96 percent label accuracy [2]; Sukowati et al. replaced thresholds with a k-nearest-neighbour classifier on an ESP32 for a mushroom house including a mist maker [3]. These models are trained once on a computer and frozen, and they are scored on label accuracy rather than on climate outcome. On-device training itself exists in TinyOL [4], in the concept-drift-aware TinyML of Disabato and Roveri [5], which names sensor and actuator faults as one cause of drift but tests on image and audio data, and in TyBox [6], which generates incremental-learning code for classification. Predictive and learned control of greenhouse humidity has been studied in simulation [7], and a grey-box humidity model identified automatically on an STM32 was used to schedule a room humidifier without plants or fault handling [8]. Bicski et al. warn that a simple autoregressive model beat an autoencoder for anomaly detection on industrial time series [9], which motivates the linear model used here and the comparison against the plain rule rather than against a larger network. Adaptive control of this form is decades old; the contribution claimed is not the algorithm but its use, on a real low-cost enclosure, as a single model for control and diagnosis, evaluated against the controller such enclosures actually run.</w:t>
+        <w:t xml:space="preserve">Small models on microcontrollers for greenhouse climate are established. Codeluppi et al. forecast greenhouse air temperature on an edge device with an RMSE of 0.29 to 0.40 degrees C [1]; Ihoume et al. mapped sensor readings to five actuator actions with a 151-parameter network at 96 percent label accuracy [2]; Sukowati et al. replaced thresholds with a k-nearest-neighbour classifier on an ESP32 for a mushroom house including a mist maker [3]. These models are trained once on a computer and frozen, and they are scored on label accuracy rather than on climate outcome. On-device training itself exists in TinyOL [4], in the concept-drift-aware TinyML of Disabato and Roveri [5], which names sensor and actuator faults as one cause of drift but tests on image and audio data, and in TyBox [6], which generates incremental-learning code for classification. Predictive and learned control of greenhouse climate has been studied against model predictive control in simulation by Morcego et al. [7]. Bicski et al. show that simple heuristics remain a viable alternative to machine-learning anomaly detection in industrial IoT [8], which motivates the linear model used here and the comparison against the plain rule rather than against a larger network. Adaptive control of this form is decades old; the contribution claimed is not the algorithm but its use, on a real low-cost enclosure, as a single model for control and diagnosis, evaluated against the controller such enclosures actually run.</w:t>
       </w:r>
     </w:p>
     <w:p>
@@ -816,6 +816,66 @@
       <w:pPr>
         <w:keepNext/>
         <w:spacing w:after="60" w:before="120"/>
+        <w:jc w:val="center"/>
+      </w:pPr>
+      <w:r>
+        <w:drawing>
+          <wp:inline distT="0" distB="0" distL="0" distR="0">
+            <wp:extent cx="3086100" cy="1752600"/>
+            <wp:effectExtent t="0" r="0" b="0" l="0"/>
+            <wp:docPr id="1" name="" descr="" title=""/>
+            <wp:cNvGraphicFramePr>
+              <a:graphicFrameLocks xmlns:a="http://schemas.openxmlformats.org/drawingml/2006/main" noChangeAspect="1"/>
+            </wp:cNvGraphicFramePr>
+            <a:graphic xmlns:a="http://schemas.openxmlformats.org/drawingml/2006/main">
+              <a:graphicData uri="http://schemas.openxmlformats.org/drawingml/2006/picture">
+                <pic:pic xmlns:pic="http://schemas.openxmlformats.org/drawingml/2006/picture">
+                  <pic:nvPicPr>
+                    <pic:cNvPr id="0" name="" descr=""/>
+                    <pic:cNvPicPr>
+                      <a:picLocks noChangeAspect="1" noChangeArrowheads="1"/>
+                    </pic:cNvPicPr>
+                  </pic:nvPicPr>
+                  <pic:blipFill>
+                    <a:blip r:embed="rId9" cstate="none"/>
+                    <a:srcRect/>
+                    <a:stretch>
+                      <a:fillRect/>
+                    </a:stretch>
+                  </pic:blipFill>
+                  <pic:spPr bwMode="auto">
+                    <a:xfrm>
+                      <a:off x="0" y="0"/>
+                      <a:ext cx="3086100" cy="1752600"/>
+                    </a:xfrm>
+                    <a:prstGeom prst="rect">
+                      <a:avLst/>
+                    </a:prstGeom>
+                  </pic:spPr>
+                </pic:pic>
+              </a:graphicData>
+            </a:graphic>
+          </wp:inline>
+        </w:drawing>
+      </w:r>
+    </w:p>
+    <w:p>
+      <w:pPr>
+        <w:spacing w:after="160"/>
+        <w:jc w:val="center"/>
+      </w:pPr>
+      <w:r>
+        <w:rPr>
+          <w:sz w:val="16"/>
+          <w:szCs w:val="16"/>
+        </w:rPr>
+        <w:t xml:space="preserve">Fig. 1. System: enclosure, ESP32 laboratory firmware and the controller with its three functions; in this study the controller ran on a laptop over USB.</w:t>
+      </w:r>
+    </w:p>
+    <w:p>
+      <w:pPr>
+        <w:keepNext/>
+        <w:spacing w:after="60" w:before="120"/>
       </w:pPr>
       <w:r>
         <w:rPr>
@@ -872,6 +932,20 @@
     </w:p>
     <w:p>
       <w:pPr>
+        <w:spacing w:after="0" w:line="240"/>
+        <w:ind w:firstLine="200"/>
+        <w:jc w:val="both"/>
+      </w:pPr>
+      <w:r>
+        <w:rPr>
+          <w:sz w:val="20"/>
+          <w:szCs w:val="20"/>
+        </w:rPr>
+        <w:t xml:space="preserve">Written out, with x(k) the absolute humidity at step k and u(k) the mist command, the model and its update are: x(k+1) minus x(k) equals theta transposed times phi(k), with phi(k) equal to [g(k) m1(k), g(k) m2(k), x(k) minus 20, f(k)(x(k) minus 20), f(k), 1]; m1(k+1) equals m1(k) plus (u(k) minus m1(k)) times DT over 5 s and m2 likewise with 30 s; and for each learner, with e(k) the prediction error clipped to three times its running standard deviation, K(k) equals P(k) phi(k) divided by (lambda plus phi(k) transposed P(k) phi(k)), theta(k+1) equals theta(k) plus K(k) e(k), and P(k+1) equals (P(k) minus K(k) phi(k) transposed P(k)) divided by lambda, followed by symmetrisation, a diagonal floor beta and a cap. The fast learner's weights are then pulled toward the slow learner's by 0.2 percent of the difference per step. The one-step prediction error normalised by its running standard deviation, z(k), drives the CUSUM statistics used in Section III-E.</w:t>
+      </w:r>
+    </w:p>
+    <w:p>
+      <w:pPr>
         <w:keepNext/>
         <w:spacing w:after="60" w:before="120"/>
       </w:pPr>
@@ -932,6 +1006,863 @@
       <w:pPr>
         <w:keepNext/>
         <w:spacing w:after="60" w:before="120"/>
+        <w:jc w:val="center"/>
+      </w:pPr>
+      <w:r>
+        <w:rPr>
+          <w:smallCaps/>
+          <w:sz w:val="16"/>
+          <w:szCs w:val="16"/>
+        </w:rPr>
+        <w:t xml:space="preserve">TABLE I.  Fault Logic: Detectors, Verdicts and Responses</w:t>
+      </w:r>
+    </w:p>
+    <w:tbl>
+      <w:tblPr>
+        <w:tblW w:type="dxa" w:w="4866"/>
+        <w:tblBorders>
+          <w:top w:val="single" w:color="auto" w:sz="4"/>
+          <w:left w:val="single" w:color="auto" w:sz="4"/>
+          <w:bottom w:val="single" w:color="auto" w:sz="4"/>
+          <w:right w:val="single" w:color="auto" w:sz="4"/>
+          <w:insideH w:val="single" w:color="auto" w:sz="4"/>
+          <w:insideV w:val="single" w:color="auto" w:sz="4"/>
+        </w:tblBorders>
+      </w:tblPr>
+      <w:tblGrid>
+        <w:gridCol w:w="1250"/>
+        <w:gridCol w:w="1900"/>
+        <w:gridCol w:w="1716"/>
+      </w:tblGrid>
+      <w:tr>
+        <w:trPr>
+          <w:cantSplit/>
+          <w:tblHeader/>
+        </w:trPr>
+        <w:tc>
+          <w:tcPr>
+            <w:tcW w:type="dxa" w:w="1250"/>
+            <w:shd w:fill="E7E6E6" w:color="auto" w:val="clear"/>
+            <w:tcMar>
+              <w:top w:type="dxa" w:w="40"/>
+              <w:left w:type="dxa" w:w="80"/>
+              <w:bottom w:type="dxa" w:w="40"/>
+              <w:right w:type="dxa" w:w="80"/>
+            </w:tcMar>
+            <w:vAlign w:val="center"/>
+          </w:tcPr>
+          <w:p>
+            <w:pPr>
+              <w:spacing w:after="0"/>
+              <w:jc w:val="left"/>
+            </w:pPr>
+            <w:r>
+              <w:rPr>
+                <w:b/>
+                <w:bCs/>
+                <w:sz w:val="14"/>
+                <w:szCs w:val="14"/>
+              </w:rPr>
+              <w:t xml:space="preserve">Detector</w:t>
+            </w:r>
+          </w:p>
+        </w:tc>
+        <w:tc>
+          <w:tcPr>
+            <w:tcW w:type="dxa" w:w="1900"/>
+            <w:shd w:fill="E7E6E6" w:color="auto" w:val="clear"/>
+            <w:tcMar>
+              <w:top w:type="dxa" w:w="40"/>
+              <w:left w:type="dxa" w:w="80"/>
+              <w:bottom w:type="dxa" w:w="40"/>
+              <w:right w:type="dxa" w:w="80"/>
+            </w:tcMar>
+            <w:vAlign w:val="center"/>
+          </w:tcPr>
+          <w:p>
+            <w:pPr>
+              <w:spacing w:after="0"/>
+              <w:jc w:val="left"/>
+            </w:pPr>
+            <w:r>
+              <w:rPr>
+                <w:b/>
+                <w:bCs/>
+                <w:sz w:val="14"/>
+                <w:szCs w:val="14"/>
+              </w:rPr>
+              <w:t xml:space="preserve">Verdict</w:t>
+            </w:r>
+          </w:p>
+        </w:tc>
+        <w:tc>
+          <w:tcPr>
+            <w:tcW w:type="dxa" w:w="1716"/>
+            <w:shd w:fill="E7E6E6" w:color="auto" w:val="clear"/>
+            <w:tcMar>
+              <w:top w:type="dxa" w:w="40"/>
+              <w:left w:type="dxa" w:w="80"/>
+              <w:bottom w:type="dxa" w:w="40"/>
+              <w:right w:type="dxa" w:w="80"/>
+            </w:tcMar>
+            <w:vAlign w:val="center"/>
+          </w:tcPr>
+          <w:p>
+            <w:pPr>
+              <w:spacing w:after="0"/>
+              <w:jc w:val="left"/>
+            </w:pPr>
+            <w:r>
+              <w:rPr>
+                <w:b/>
+                <w:bCs/>
+                <w:sz w:val="14"/>
+                <w:szCs w:val="14"/>
+              </w:rPr>
+              <w:t xml:space="preserve">Response</w:t>
+            </w:r>
+          </w:p>
+        </w:tc>
+      </w:tr>
+      <w:tr>
+        <w:trPr>
+          <w:cantSplit/>
+          <w:tblHeader w:val="false"/>
+        </w:trPr>
+        <w:tc>
+          <w:tcPr>
+            <w:tcW w:type="dxa" w:w="1250"/>
+            <w:tcMar>
+              <w:top w:type="dxa" w:w="40"/>
+              <w:left w:type="dxa" w:w="80"/>
+              <w:bottom w:type="dxa" w:w="40"/>
+              <w:right w:type="dxa" w:w="80"/>
+            </w:tcMar>
+            <w:vAlign w:val="center"/>
+          </w:tcPr>
+          <w:p>
+            <w:pPr>
+              <w:spacing w:after="0"/>
+              <w:jc w:val="left"/>
+            </w:pPr>
+            <w:r>
+              <w:rPr>
+                <w:sz w:val="14"/>
+                <w:szCs w:val="14"/>
+              </w:rPr>
+              <w:t xml:space="preserve">No reading, or 12 identical readings</w:t>
+            </w:r>
+          </w:p>
+        </w:tc>
+        <w:tc>
+          <w:tcPr>
+            <w:tcW w:type="dxa" w:w="1900"/>
+            <w:tcMar>
+              <w:top w:type="dxa" w:w="40"/>
+              <w:left w:type="dxa" w:w="80"/>
+              <w:bottom w:type="dxa" w:w="40"/>
+              <w:right w:type="dxa" w:w="80"/>
+            </w:tcMar>
+            <w:vAlign w:val="center"/>
+          </w:tcPr>
+          <w:p>
+            <w:pPr>
+              <w:spacing w:after="0"/>
+              <w:jc w:val="left"/>
+            </w:pPr>
+            <w:r>
+              <w:rPr>
+                <w:sz w:val="14"/>
+                <w:szCs w:val="14"/>
+              </w:rPr>
+              <w:t xml:space="preserve">sensor lost / stuck</w:t>
+            </w:r>
+          </w:p>
+        </w:tc>
+        <w:tc>
+          <w:tcPr>
+            <w:tcW w:type="dxa" w:w="1716"/>
+            <w:tcMar>
+              <w:top w:type="dxa" w:w="40"/>
+              <w:left w:type="dxa" w:w="80"/>
+              <w:bottom w:type="dxa" w:w="40"/>
+              <w:right w:type="dxa" w:w="80"/>
+            </w:tcMar>
+            <w:vAlign w:val="center"/>
+          </w:tcPr>
+          <w:p>
+            <w:pPr>
+              <w:spacing w:after="0"/>
+              <w:jc w:val="left"/>
+            </w:pPr>
+            <w:r>
+              <w:rPr>
+                <w:sz w:val="14"/>
+                <w:szCs w:val="14"/>
+              </w:rPr>
+              <w:t xml:space="preserve">replay the learned misting rhythm; clear when readings resume</w:t>
+            </w:r>
+          </w:p>
+        </w:tc>
+      </w:tr>
+      <w:tr>
+        <w:trPr>
+          <w:cantSplit/>
+          <w:tblHeader w:val="false"/>
+        </w:trPr>
+        <w:tc>
+          <w:tcPr>
+            <w:tcW w:type="dxa" w:w="1250"/>
+            <w:tcMar>
+              <w:top w:type="dxa" w:w="40"/>
+              <w:left w:type="dxa" w:w="80"/>
+              <w:bottom w:type="dxa" w:w="40"/>
+              <w:right w:type="dxa" w:w="80"/>
+            </w:tcMar>
+            <w:vAlign w:val="center"/>
+          </w:tcPr>
+          <w:p>
+            <w:pPr>
+              <w:spacing w:after="0"/>
+              <w:jc w:val="left"/>
+            </w:pPr>
+            <w:r>
+              <w:rPr>
+                <w:sz w:val="14"/>
+                <w:szCs w:val="14"/>
+              </w:rPr>
+              <w:t xml:space="preserve">Part check after 2 min of misting: gain &lt; 0.3 of expected, twice</w:t>
+            </w:r>
+          </w:p>
+        </w:tc>
+        <w:tc>
+          <w:tcPr>
+            <w:tcW w:type="dxa" w:w="1900"/>
+            <w:tcMar>
+              <w:top w:type="dxa" w:w="40"/>
+              <w:left w:type="dxa" w:w="80"/>
+              <w:bottom w:type="dxa" w:w="40"/>
+              <w:right w:type="dxa" w:w="80"/>
+            </w:tcMar>
+            <w:vAlign w:val="center"/>
+          </w:tcPr>
+          <w:p>
+            <w:pPr>
+              <w:spacing w:after="0"/>
+              <w:jc w:val="left"/>
+            </w:pPr>
+            <w:r>
+              <w:rPr>
+                <w:sz w:val="14"/>
+                <w:szCs w:val="14"/>
+              </w:rPr>
+              <w:t xml:space="preserve">main mister dead</w:t>
+            </w:r>
+          </w:p>
+        </w:tc>
+        <w:tc>
+          <w:tcPr>
+            <w:tcW w:type="dxa" w:w="1716"/>
+            <w:tcMar>
+              <w:top w:type="dxa" w:w="40"/>
+              <w:left w:type="dxa" w:w="80"/>
+              <w:bottom w:type="dxa" w:w="40"/>
+              <w:right w:type="dxa" w:w="80"/>
+            </w:tcMar>
+            <w:vAlign w:val="center"/>
+          </w:tcPr>
+          <w:p>
+            <w:pPr>
+              <w:spacing w:after="0"/>
+              <w:jc w:val="left"/>
+            </w:pPr>
+            <w:r>
+              <w:rPr>
+                <w:sz w:val="14"/>
+                <w:szCs w:val="14"/>
+              </w:rPr>
+              <w:t xml:space="preserve">switch to the second channel; after two good bursts accept as new normal</w:t>
+            </w:r>
+          </w:p>
+        </w:tc>
+      </w:tr>
+      <w:tr>
+        <w:trPr>
+          <w:cantSplit/>
+          <w:tblHeader w:val="false"/>
+        </w:trPr>
+        <w:tc>
+          <w:tcPr>
+            <w:tcW w:type="dxa" w:w="1250"/>
+            <w:tcMar>
+              <w:top w:type="dxa" w:w="40"/>
+              <w:left w:type="dxa" w:w="80"/>
+              <w:bottom w:type="dxa" w:w="40"/>
+              <w:right w:type="dxa" w:w="80"/>
+            </w:tcMar>
+            <w:vAlign w:val="center"/>
+          </w:tcPr>
+          <w:p>
+            <w:pPr>
+              <w:spacing w:after="0"/>
+              <w:jc w:val="left"/>
+            </w:pPr>
+            <w:r>
+              <w:rPr>
+                <w:sz w:val="14"/>
+                <w:szCs w:val="14"/>
+              </w:rPr>
+              <w:t xml:space="preserve">Part check after a fan run: removal &lt; 0.3 of expected, twice</w:t>
+            </w:r>
+          </w:p>
+        </w:tc>
+        <w:tc>
+          <w:tcPr>
+            <w:tcW w:type="dxa" w:w="1900"/>
+            <w:tcMar>
+              <w:top w:type="dxa" w:w="40"/>
+              <w:left w:type="dxa" w:w="80"/>
+              <w:bottom w:type="dxa" w:w="40"/>
+              <w:right w:type="dxa" w:w="80"/>
+            </w:tcMar>
+            <w:vAlign w:val="center"/>
+          </w:tcPr>
+          <w:p>
+            <w:pPr>
+              <w:spacing w:after="0"/>
+              <w:jc w:val="left"/>
+            </w:pPr>
+            <w:r>
+              <w:rPr>
+                <w:sz w:val="14"/>
+                <w:szCs w:val="14"/>
+              </w:rPr>
+              <w:t xml:space="preserve">fan stalled</w:t>
+            </w:r>
+          </w:p>
+        </w:tc>
+        <w:tc>
+          <w:tcPr>
+            <w:tcW w:type="dxa" w:w="1716"/>
+            <w:tcMar>
+              <w:top w:type="dxa" w:w="40"/>
+              <w:left w:type="dxa" w:w="80"/>
+              <w:bottom w:type="dxa" w:w="40"/>
+              <w:right w:type="dxa" w:w="80"/>
+            </w:tcMar>
+            <w:vAlign w:val="center"/>
+          </w:tcPr>
+          <w:p>
+            <w:pPr>
+              <w:spacing w:after="0"/>
+              <w:jc w:val="left"/>
+            </w:pPr>
+            <w:r>
+              <w:rPr>
+                <w:sz w:val="14"/>
+                <w:szCs w:val="14"/>
+              </w:rPr>
+              <w:t xml:space="preserve">alarm; keep controlling with the fast model</w:t>
+            </w:r>
+          </w:p>
+        </w:tc>
+      </w:tr>
+      <w:tr>
+        <w:trPr>
+          <w:cantSplit/>
+          <w:tblHeader w:val="false"/>
+        </w:trPr>
+        <w:tc>
+          <w:tcPr>
+            <w:tcW w:type="dxa" w:w="1250"/>
+            <w:tcMar>
+              <w:top w:type="dxa" w:w="40"/>
+              <w:left w:type="dxa" w:w="80"/>
+              <w:bottom w:type="dxa" w:w="40"/>
+              <w:right w:type="dxa" w:w="80"/>
+            </w:tcMar>
+            <w:vAlign w:val="center"/>
+          </w:tcPr>
+          <w:p>
+            <w:pPr>
+              <w:spacing w:after="0"/>
+              <w:jc w:val="left"/>
+            </w:pPr>
+            <w:r>
+              <w:rPr>
+                <w:sz w:val="14"/>
+                <w:szCs w:val="14"/>
+              </w:rPr>
+              <w:t xml:space="preserve">CUSUM on z(k) falling below −20</w:t>
+            </w:r>
+          </w:p>
+        </w:tc>
+        <w:tc>
+          <w:tcPr>
+            <w:tcW w:type="dxa" w:w="1900"/>
+            <w:tcMar>
+              <w:top w:type="dxa" w:w="40"/>
+              <w:left w:type="dxa" w:w="80"/>
+              <w:bottom w:type="dxa" w:w="40"/>
+              <w:right w:type="dxa" w:w="80"/>
+            </w:tcMar>
+            <w:vAlign w:val="center"/>
+          </w:tcPr>
+          <w:p>
+            <w:pPr>
+              <w:spacing w:after="0"/>
+              <w:jc w:val="left"/>
+            </w:pPr>
+            <w:r>
+              <w:rPr>
+                <w:sz w:val="14"/>
+                <w:szCs w:val="14"/>
+              </w:rPr>
+              <w:t xml:space="preserve">suspect loss</w:t>
+            </w:r>
+          </w:p>
+        </w:tc>
+        <w:tc>
+          <w:tcPr>
+            <w:tcW w:type="dxa" w:w="1716"/>
+            <w:tcMar>
+              <w:top w:type="dxa" w:w="40"/>
+              <w:left w:type="dxa" w:w="80"/>
+              <w:bottom w:type="dxa" w:w="40"/>
+              <w:right w:type="dxa" w:w="80"/>
+            </w:tcMar>
+            <w:vAlign w:val="center"/>
+          </w:tcPr>
+          <w:p>
+            <w:pPr>
+              <w:spacing w:after="0"/>
+              <w:jc w:val="left"/>
+            </w:pPr>
+            <w:r>
+              <w:rPr>
+                <w:sz w:val="14"/>
+                <w:szCs w:val="14"/>
+              </w:rPr>
+              <w:t xml:space="preserve">freeze slow learner; 4 min quiet watch, then mist test</w:t>
+            </w:r>
+          </w:p>
+        </w:tc>
+      </w:tr>
+      <w:tr>
+        <w:trPr>
+          <w:cantSplit/>
+          <w:tblHeader w:val="false"/>
+        </w:trPr>
+        <w:tc>
+          <w:tcPr>
+            <w:tcW w:type="dxa" w:w="1250"/>
+            <w:tcMar>
+              <w:top w:type="dxa" w:w="40"/>
+              <w:left w:type="dxa" w:w="80"/>
+              <w:bottom w:type="dxa" w:w="40"/>
+              <w:right w:type="dxa" w:w="80"/>
+            </w:tcMar>
+            <w:vAlign w:val="center"/>
+          </w:tcPr>
+          <w:p>
+            <w:pPr>
+              <w:spacing w:after="0"/>
+              <w:jc w:val="left"/>
+            </w:pPr>
+            <w:r>
+              <w:rPr>
+                <w:sz w:val="14"/>
+                <w:szCs w:val="14"/>
+              </w:rPr>
+              <w:t xml:space="preserve">Mist test: loss in both phases</w:t>
+            </w:r>
+          </w:p>
+        </w:tc>
+        <w:tc>
+          <w:tcPr>
+            <w:tcW w:type="dxa" w:w="1900"/>
+            <w:tcMar>
+              <w:top w:type="dxa" w:w="40"/>
+              <w:left w:type="dxa" w:w="80"/>
+              <w:bottom w:type="dxa" w:w="40"/>
+              <w:right w:type="dxa" w:w="80"/>
+            </w:tcMar>
+            <w:vAlign w:val="center"/>
+          </w:tcPr>
+          <w:p>
+            <w:pPr>
+              <w:spacing w:after="0"/>
+              <w:jc w:val="left"/>
+            </w:pPr>
+            <w:r>
+              <w:rPr>
+                <w:sz w:val="14"/>
+                <w:szCs w:val="14"/>
+              </w:rPr>
+              <w:t xml:space="preserve">lid open / leak</w:t>
+            </w:r>
+          </w:p>
+        </w:tc>
+        <w:tc>
+          <w:tcPr>
+            <w:tcW w:type="dxa" w:w="1716"/>
+            <w:tcMar>
+              <w:top w:type="dxa" w:w="40"/>
+              <w:left w:type="dxa" w:w="80"/>
+              <w:bottom w:type="dxa" w:w="40"/>
+              <w:right w:type="dxa" w:w="80"/>
+            </w:tcMar>
+            <w:vAlign w:val="center"/>
+          </w:tcPr>
+          <w:p>
+            <w:pPr>
+              <w:spacing w:after="0"/>
+              <w:jc w:val="left"/>
+            </w:pPr>
+            <w:r>
+              <w:rPr>
+                <w:sz w:val="14"/>
+                <w:szCs w:val="14"/>
+              </w:rPr>
+              <w:t xml:space="preserve">alarm; control with the fast model; clear after 10 min of agreement</w:t>
+            </w:r>
+          </w:p>
+        </w:tc>
+      </w:tr>
+      <w:tr>
+        <w:trPr>
+          <w:cantSplit/>
+          <w:tblHeader w:val="false"/>
+        </w:trPr>
+        <w:tc>
+          <w:tcPr>
+            <w:tcW w:type="dxa" w:w="1250"/>
+            <w:tcMar>
+              <w:top w:type="dxa" w:w="40"/>
+              <w:left w:type="dxa" w:w="80"/>
+              <w:bottom w:type="dxa" w:w="40"/>
+              <w:right w:type="dxa" w:w="80"/>
+            </w:tcMar>
+            <w:vAlign w:val="center"/>
+          </w:tcPr>
+          <w:p>
+            <w:pPr>
+              <w:spacing w:after="0"/>
+              <w:jc w:val="left"/>
+            </w:pPr>
+            <w:r>
+              <w:rPr>
+                <w:sz w:val="14"/>
+                <w:szCs w:val="14"/>
+              </w:rPr>
+              <w:t xml:space="preserve">Mist test: loss only while misting</w:t>
+            </w:r>
+          </w:p>
+        </w:tc>
+        <w:tc>
+          <w:tcPr>
+            <w:tcW w:type="dxa" w:w="1900"/>
+            <w:tcMar>
+              <w:top w:type="dxa" w:w="40"/>
+              <w:left w:type="dxa" w:w="80"/>
+              <w:bottom w:type="dxa" w:w="40"/>
+              <w:right w:type="dxa" w:w="80"/>
+            </w:tcMar>
+            <w:vAlign w:val="center"/>
+          </w:tcPr>
+          <w:p>
+            <w:pPr>
+              <w:spacing w:after="0"/>
+              <w:jc w:val="left"/>
+            </w:pPr>
+            <w:r>
+              <w:rPr>
+                <w:sz w:val="14"/>
+                <w:szCs w:val="14"/>
+              </w:rPr>
+              <w:t xml:space="preserve">main mister dead</w:t>
+            </w:r>
+          </w:p>
+        </w:tc>
+        <w:tc>
+          <w:tcPr>
+            <w:tcW w:type="dxa" w:w="1716"/>
+            <w:tcMar>
+              <w:top w:type="dxa" w:w="40"/>
+              <w:left w:type="dxa" w:w="80"/>
+              <w:bottom w:type="dxa" w:w="40"/>
+              <w:right w:type="dxa" w:w="80"/>
+            </w:tcMar>
+            <w:vAlign w:val="center"/>
+          </w:tcPr>
+          <w:p>
+            <w:pPr>
+              <w:spacing w:after="0"/>
+              <w:jc w:val="left"/>
+            </w:pPr>
+            <w:r>
+              <w:rPr>
+                <w:sz w:val="14"/>
+                <w:szCs w:val="14"/>
+              </w:rPr>
+              <w:t xml:space="preserve">as above</w:t>
+            </w:r>
+          </w:p>
+        </w:tc>
+      </w:tr>
+      <w:tr>
+        <w:trPr>
+          <w:cantSplit/>
+          <w:tblHeader w:val="false"/>
+        </w:trPr>
+        <w:tc>
+          <w:tcPr>
+            <w:tcW w:type="dxa" w:w="1250"/>
+            <w:tcMar>
+              <w:top w:type="dxa" w:w="40"/>
+              <w:left w:type="dxa" w:w="80"/>
+              <w:bottom w:type="dxa" w:w="40"/>
+              <w:right w:type="dxa" w:w="80"/>
+            </w:tcMar>
+            <w:vAlign w:val="center"/>
+          </w:tcPr>
+          <w:p>
+            <w:pPr>
+              <w:spacing w:after="0"/>
+              <w:jc w:val="left"/>
+            </w:pPr>
+            <w:r>
+              <w:rPr>
+                <w:sz w:val="14"/>
+                <w:szCs w:val="14"/>
+              </w:rPr>
+              <w:t xml:space="preserve">Mist test: normal in both phases</w:t>
+            </w:r>
+          </w:p>
+        </w:tc>
+        <w:tc>
+          <w:tcPr>
+            <w:tcW w:type="dxa" w:w="1900"/>
+            <w:tcMar>
+              <w:top w:type="dxa" w:w="40"/>
+              <w:left w:type="dxa" w:w="80"/>
+              <w:bottom w:type="dxa" w:w="40"/>
+              <w:right w:type="dxa" w:w="80"/>
+            </w:tcMar>
+            <w:vAlign w:val="center"/>
+          </w:tcPr>
+          <w:p>
+            <w:pPr>
+              <w:spacing w:after="0"/>
+              <w:jc w:val="left"/>
+            </w:pPr>
+            <w:r>
+              <w:rPr>
+                <w:sz w:val="14"/>
+                <w:szCs w:val="14"/>
+              </w:rPr>
+              <w:t xml:space="preserve">false alarm</w:t>
+            </w:r>
+          </w:p>
+        </w:tc>
+        <w:tc>
+          <w:tcPr>
+            <w:tcW w:type="dxa" w:w="1716"/>
+            <w:tcMar>
+              <w:top w:type="dxa" w:w="40"/>
+              <w:left w:type="dxa" w:w="80"/>
+              <w:bottom w:type="dxa" w:w="40"/>
+              <w:right w:type="dxa" w:w="80"/>
+            </w:tcMar>
+            <w:vAlign w:val="center"/>
+          </w:tcPr>
+          <w:p>
+            <w:pPr>
+              <w:spacing w:after="0"/>
+              <w:jc w:val="left"/>
+            </w:pPr>
+            <w:r>
+              <w:rPr>
+                <w:sz w:val="14"/>
+                <w:szCs w:val="14"/>
+              </w:rPr>
+              <w:t xml:space="preserve">clear, resume learning</w:t>
+            </w:r>
+          </w:p>
+        </w:tc>
+      </w:tr>
+      <w:tr>
+        <w:trPr>
+          <w:cantSplit/>
+          <w:tblHeader w:val="false"/>
+        </w:trPr>
+        <w:tc>
+          <w:tcPr>
+            <w:tcW w:type="dxa" w:w="1250"/>
+            <w:tcMar>
+              <w:top w:type="dxa" w:w="40"/>
+              <w:left w:type="dxa" w:w="80"/>
+              <w:bottom w:type="dxa" w:w="40"/>
+              <w:right w:type="dxa" w:w="80"/>
+            </w:tcMar>
+            <w:vAlign w:val="center"/>
+          </w:tcPr>
+          <w:p>
+            <w:pPr>
+              <w:spacing w:after="0"/>
+              <w:jc w:val="left"/>
+            </w:pPr>
+            <w:r>
+              <w:rPr>
+                <w:sz w:val="14"/>
+                <w:szCs w:val="14"/>
+              </w:rPr>
+              <w:t xml:space="preserve">Slow weights changed without learning, or predict 2× worse than the snapshot for 30 min</w:t>
+            </w:r>
+          </w:p>
+        </w:tc>
+        <w:tc>
+          <w:tcPr>
+            <w:tcW w:type="dxa" w:w="1900"/>
+            <w:tcMar>
+              <w:top w:type="dxa" w:w="40"/>
+              <w:left w:type="dxa" w:w="80"/>
+              <w:bottom w:type="dxa" w:w="40"/>
+              <w:right w:type="dxa" w:w="80"/>
+            </w:tcMar>
+            <w:vAlign w:val="center"/>
+          </w:tcPr>
+          <w:p>
+            <w:pPr>
+              <w:spacing w:after="0"/>
+              <w:jc w:val="left"/>
+            </w:pPr>
+            <w:r>
+              <w:rPr>
+                <w:sz w:val="14"/>
+                <w:szCs w:val="14"/>
+              </w:rPr>
+              <w:t xml:space="preserve">corrupted model</w:t>
+            </w:r>
+          </w:p>
+        </w:tc>
+        <w:tc>
+          <w:tcPr>
+            <w:tcW w:type="dxa" w:w="1716"/>
+            <w:tcMar>
+              <w:top w:type="dxa" w:w="40"/>
+              <w:left w:type="dxa" w:w="80"/>
+              <w:bottom w:type="dxa" w:w="40"/>
+              <w:right w:type="dxa" w:w="80"/>
+            </w:tcMar>
+            <w:vAlign w:val="center"/>
+          </w:tcPr>
+          <w:p>
+            <w:pPr>
+              <w:spacing w:after="0"/>
+              <w:jc w:val="left"/>
+            </w:pPr>
+            <w:r>
+              <w:rPr>
+                <w:sz w:val="14"/>
+                <w:szCs w:val="14"/>
+              </w:rPr>
+              <w:t xml:space="preserve">restore the snapshot</w:t>
+            </w:r>
+          </w:p>
+        </w:tc>
+      </w:tr>
+      <w:tr>
+        <w:trPr>
+          <w:cantSplit/>
+          <w:tblHeader w:val="false"/>
+        </w:trPr>
+        <w:tc>
+          <w:tcPr>
+            <w:tcW w:type="dxa" w:w="1250"/>
+            <w:tcMar>
+              <w:top w:type="dxa" w:w="40"/>
+              <w:left w:type="dxa" w:w="80"/>
+              <w:bottom w:type="dxa" w:w="40"/>
+              <w:right w:type="dxa" w:w="80"/>
+            </w:tcMar>
+            <w:vAlign w:val="center"/>
+          </w:tcPr>
+          <w:p>
+            <w:pPr>
+              <w:spacing w:after="0"/>
+              <w:jc w:val="left"/>
+            </w:pPr>
+            <w:r>
+              <w:rPr>
+                <w:sz w:val="14"/>
+                <w:szCs w:val="14"/>
+              </w:rPr>
+              <w:t xml:space="preserve">Mister weight below 80 % of day-one value</w:t>
+            </w:r>
+          </w:p>
+        </w:tc>
+        <w:tc>
+          <w:tcPr>
+            <w:tcW w:type="dxa" w:w="1900"/>
+            <w:tcMar>
+              <w:top w:type="dxa" w:w="40"/>
+              <w:left w:type="dxa" w:w="80"/>
+              <w:bottom w:type="dxa" w:w="40"/>
+              <w:right w:type="dxa" w:w="80"/>
+            </w:tcMar>
+            <w:vAlign w:val="center"/>
+          </w:tcPr>
+          <w:p>
+            <w:pPr>
+              <w:spacing w:after="0"/>
+              <w:jc w:val="left"/>
+            </w:pPr>
+            <w:r>
+              <w:rPr>
+                <w:sz w:val="14"/>
+                <w:szCs w:val="14"/>
+              </w:rPr>
+              <w:t xml:space="preserve">wear</w:t>
+            </w:r>
+          </w:p>
+        </w:tc>
+        <w:tc>
+          <w:tcPr>
+            <w:tcW w:type="dxa" w:w="1716"/>
+            <w:tcMar>
+              <w:top w:type="dxa" w:w="40"/>
+              <w:left w:type="dxa" w:w="80"/>
+              <w:bottom w:type="dxa" w:w="40"/>
+              <w:right w:type="dxa" w:w="80"/>
+            </w:tcMar>
+            <w:vAlign w:val="center"/>
+          </w:tcPr>
+          <w:p>
+            <w:pPr>
+              <w:spacing w:after="0"/>
+              <w:jc w:val="left"/>
+            </w:pPr>
+            <w:r>
+              <w:rPr>
+                <w:sz w:val="14"/>
+                <w:szCs w:val="14"/>
+              </w:rPr>
+              <w:t xml:space="preserve">maintenance warning, no fault</w:t>
+            </w:r>
+          </w:p>
+        </w:tc>
+      </w:tr>
+    </w:tbl>
+    <w:p>
+      <w:pPr>
+        <w:spacing w:after="60"/>
+      </w:pPr>
+    </w:p>
+    <w:p>
+      <w:pPr>
+        <w:keepNext/>
+        <w:spacing w:after="60" w:before="120"/>
       </w:pPr>
       <w:r>
         <w:rPr>
@@ -1129,7 +2060,7 @@
           <w:sz w:val="20"/>
           <w:szCs w:val="20"/>
         </w:rPr>
-        <w:t xml:space="preserve">Table I and Fig. 1 give the three rounds; all 4825 samples were valid. The mister raises the control reading to a ceiling of 89.5 plus or minus 0.4 percent RH in 104 plus or minus 7 s and cannot exceed it; longer bursts add droplets to surfaces, not vapour to the air. The dry-air strength was 0.098 plus or minus 0.012 g per cubic metre per second. The closed enclosure lost only 1.7 plus or minus 0.4 percent RH in 20 min with the room at 75 percent, too little to fit a decay constant; an earlier run the same day with one end of the box open lost 5 percent in 11 min. The air warmed 0.2 to 0.4 degrees C while the disc ran and then cooled about 0.5 degrees C below the start as the fog evaporated. Two practical consequences follow: the production firmware's 300 s burst cap is three times longer than useful for this enclosure, and its 90 percent upper threshold is never reached, so every rule burst runs to the cap.</w:t>
+        <w:t xml:space="preserve">Table II and Fig. 2 give the three rounds; all 4825 samples were valid. The mister raises the control reading to a ceiling of 89.5 plus or minus 0.4 percent RH in 104 plus or minus 7 s and cannot exceed it; longer bursts add droplets to surfaces, not vapour to the air. The dry-air strength was 0.098 plus or minus 0.012 g per cubic metre per second. The closed enclosure lost only 1.7 plus or minus 0.4 percent RH in 20 min with the room at 75 percent, too little to fit a decay constant; an earlier run the same day with one end of the box open lost 5 percent in 11 min. The air warmed 0.2 to 0.4 degrees C while the disc ran and then cooled about 0.5 degrees C below the start as the fog evaporated. Two practical consequences follow: the production firmware's 300 s burst cap is three times longer than useful for this enclosure, and its 90 percent upper threshold is never reached, so every rule burst runs to the cap.</w:t>
       </w:r>
     </w:p>
     <w:p>
@@ -1144,7 +2075,7 @@
           <w:sz w:val="16"/>
           <w:szCs w:val="16"/>
         </w:rPr>
-        <w:t xml:space="preserve">TABLE I.  Step Test, Lid Closed, One Mist Maker (25 Sep 2026)</w:t>
+        <w:t xml:space="preserve">TABLE II.  Step Test, Lid Closed, One Mist Maker (25 Sep 2026)</w:t>
       </w:r>
     </w:p>
     <w:tbl>
@@ -2039,7 +2970,7 @@
                     </pic:cNvPicPr>
                   </pic:nvPicPr>
                   <pic:blipFill>
-                    <a:blip r:embed="rId9" cstate="none"/>
+                    <a:blip r:embed="rId10" cstate="none"/>
                     <a:srcRect/>
                     <a:stretch>
                       <a:fillRect/>
@@ -2071,7 +3002,7 @@
           <w:sz w:val="16"/>
           <w:szCs w:val="16"/>
         </w:rPr>
-        <w:t xml:space="preserve">Fig. 1. Step test: inside and outside humidity (top) and temperature (bottom) over three mist rounds; shaded bands mark mist on.</w:t>
+        <w:t xml:space="preserve">Fig. 2. Step test: inside and outside humidity (top) and temperature (bottom) over three mist rounds; shaded bands mark mist on.</w:t>
       </w:r>
     </w:p>
     <w:p>
@@ -2100,7 +3031,7 @@
           <w:sz w:val="20"/>
           <w:szCs w:val="20"/>
         </w:rPr>
-        <w:t xml:space="preserve">Table II summarises the blocks of the fault session and Table III the controller's responses; Fig. 2 shows the traces. The hysteresis rule's single burst ran the full 300 s cap and took the enclosure from 70.8 to 88.2 percent. Before the fault the learning controller correctly did nothing for 25 min, since the rule had left the enclosure at 87 percent and the 1 cm gap drained it only slowly; in that time its slow leak weight moved from minus 0.036 to minus 0.131 per step and the background weight from 0.19 to 1.00, a re-fit of the opened enclosure made without any misting data. When the lid was removed the CUSUM raised suspect-loss within 1 s of the marker. The controller ran its 4 min quiet watch, then three test bursts of about 35 s at 60 s intervals, keeping the enclosure inside the band, and declared lid open / leak 400 s after the marker. The wet tissue did not latch the sensor, but it locked the I2C bus; the firmware watchdog restarted the chip within 15 s and both sensors were re-found in 1 s, while the laptop-side controller, which at that time did not handle a chip restart, had to be relaunched (six seconds of control lost; the handling was added afterwards). When the tissue was removed the reading fell from 90 to 74 percent in 40 s as the sensor dried; the controller raised suspect-loss again, ran its quiet-then-mist test, and cleared the alarm as a false alarm 6.5 min later, having found the enclosure behaving normally in both phases.</w:t>
+        <w:t xml:space="preserve">Table III summarises the blocks of the fault session and Table IV the controller's responses; Fig. 3 shows the traces. The hysteresis rule's single burst ran the full 300 s cap and took the enclosure from 70.8 to 88.2 percent. Before the fault the learning controller correctly did nothing for 25 min, since the rule had left the enclosure at 87 percent and the 1 cm gap drained it only slowly; in that time its slow leak weight moved from minus 0.036 to minus 0.131 per step and the background weight from 0.19 to 1.00, a re-fit of the opened enclosure made without any misting data. When the lid was removed the CUSUM raised suspect-loss within 1 s of the marker. The controller ran its 4 min quiet watch, then three test bursts of about 35 s at 60 s intervals, keeping the enclosure inside the band, and declared lid open / leak 400 s after the marker. The wet tissue did not latch the sensor, but it locked the I2C bus; the firmware watchdog restarted the chip within 15 s and both sensors were re-found in 1 s, while the laptop-side controller, which at that time did not handle a chip restart, had to be relaunched (six seconds of control lost; the handling was added afterwards). When the tissue was removed the reading fell from 90 to 74 percent in 40 s as the sensor dried; the controller raised suspect-loss again, ran its quiet-then-mist test, and cleared the alarm as a false alarm 6.5 min later, having found the enclosure behaving normally in both phases.</w:t>
       </w:r>
     </w:p>
     <w:p>
@@ -2115,7 +3046,7 @@
           <w:sz w:val="16"/>
           <w:szCs w:val="16"/>
         </w:rPr>
-        <w:t xml:space="preserve">TABLE II.  Fault Session Blocks, Lid 1 cm (26 Sep 2026)</w:t>
+        <w:t xml:space="preserve">TABLE III.  Fault Session Blocks, Lid 1 cm (26 Sep 2026)</w:t>
       </w:r>
     </w:p>
     <w:tbl>
@@ -2694,7 +3625,7 @@
           <w:sz w:val="16"/>
           <w:szCs w:val="16"/>
         </w:rPr>
-        <w:t xml:space="preserve">TABLE III.  Injected Faults and the Controller's Response</w:t>
+        <w:t xml:space="preserve">TABLE IV.  Injected Faults and the Controller's Response</w:t>
       </w:r>
     </w:p>
     <w:tbl>
@@ -2995,1313 +3926,6 @@
                 <w:szCs w:val="15"/>
               </w:rPr>
               <w:t xml:space="preserve">reading fell 90 to 74 % in 40 s; suspect-loss raised; tested; cleared as false alarm after 6.5 min</w:t>
-            </w:r>
-          </w:p>
-        </w:tc>
-      </w:tr>
-    </w:tbl>
-    <w:p>
-      <w:pPr>
-        <w:keepNext/>
-        <w:spacing w:after="60" w:before="120"/>
-        <w:jc w:val="center"/>
-      </w:pPr>
-      <w:r>
-        <w:drawing>
-          <wp:inline distT="0" distB="0" distL="0" distR="0">
-            <wp:extent cx="3086100" cy="1800225"/>
-            <wp:effectExtent t="0" r="0" b="0" l="0"/>
-            <wp:docPr id="1" name="" descr="" title=""/>
-            <wp:cNvGraphicFramePr>
-              <a:graphicFrameLocks xmlns:a="http://schemas.openxmlformats.org/drawingml/2006/main" noChangeAspect="1"/>
-            </wp:cNvGraphicFramePr>
-            <a:graphic xmlns:a="http://schemas.openxmlformats.org/drawingml/2006/main">
-              <a:graphicData uri="http://schemas.openxmlformats.org/drawingml/2006/picture">
-                <pic:pic xmlns:pic="http://schemas.openxmlformats.org/drawingml/2006/picture">
-                  <pic:nvPicPr>
-                    <pic:cNvPr id="0" name="" descr=""/>
-                    <pic:cNvPicPr>
-                      <a:picLocks noChangeAspect="1" noChangeArrowheads="1"/>
-                    </pic:cNvPicPr>
-                  </pic:nvPicPr>
-                  <pic:blipFill>
-                    <a:blip r:embed="rId10" cstate="none"/>
-                    <a:srcRect/>
-                    <a:stretch>
-                      <a:fillRect/>
-                    </a:stretch>
-                  </pic:blipFill>
-                  <pic:spPr bwMode="auto">
-                    <a:xfrm>
-                      <a:off x="0" y="0"/>
-                      <a:ext cx="3086100" cy="1800225"/>
-                    </a:xfrm>
-                    <a:prstGeom prst="rect">
-                      <a:avLst/>
-                    </a:prstGeom>
-                  </pic:spPr>
-                </pic:pic>
-              </a:graphicData>
-            </a:graphic>
-          </wp:inline>
-        </w:drawing>
-      </w:r>
-    </w:p>
-    <w:p>
-      <w:pPr>
-        <w:spacing w:after="160"/>
-        <w:jc w:val="center"/>
-      </w:pPr>
-      <w:r>
-        <w:rPr>
-          <w:sz w:val="16"/>
-          <w:szCs w:val="16"/>
-        </w:rPr>
-        <w:t xml:space="preserve">Fig. 2. Fault session: humidity (top) and inside temperature (bottom); dotted red lines mark injected events, green labels the controller's verdicts.</w:t>
-      </w:r>
-    </w:p>
-    <w:p>
-      <w:pPr>
-        <w:keepNext/>
-        <w:spacing w:after="60" w:before="120"/>
-      </w:pPr>
-      <w:r>
-        <w:rPr>
-          <w:i/>
-          <w:iCs/>
-          <w:sz w:val="20"/>
-          <w:szCs w:val="20"/>
-        </w:rPr>
-        <w:t xml:space="preserve">C. Alternating Comparison</w:t>
-      </w:r>
-    </w:p>
-    <w:p>
-      <w:pPr>
-        <w:spacing w:after="0" w:line="240"/>
-        <w:ind w:firstLine="200"/>
-        <w:jc w:val="both"/>
-      </w:pPr>
-      <w:r>
-        <w:rPr>
-          <w:sz w:val="20"/>
-          <w:szCs w:val="20"/>
-        </w:rPr>
-        <w:t xml:space="preserve">Table IV gives the four blocks; every sample in all four was valid. Fig. 3 shows the traces. In each rule block the enclosure fell to 75 percent, the rule misted for the full 300 s cap to 87 to 88 percent, and the enclosure drained back in about 10 min; over its hour the rule misted 14.6 min in four bursts and held the band 99.4 percent of the time, the remainder being the dips below 75 percent that trigger it. In both learning blocks the enclosure, left alone, settled between 77 and 82 percent RH: with the 4 cm gap and the water tray, the enclosure's own equilibrium lies inside the band. The learning controller's planner, which acts only below 77 percent, was never triggered; it held the band 100 percent of the time with zero misting, and its slow model moved again (leak weight minus 0.036 to minus 0.093 per step over the two blocks). The blocks alternated, and each learning block inherited the enclosure at 75 to 88 percent from the preceding rule block; the reference sensor drifted from 73 to 71 percent over the two hours, so conditions were slightly drier for the later blocks. One interrupt-watchdog restart of the ESP32 occurred at 02:50 in the last block; the controller detected the restart from the uptime counter, re-armed manual mode and continued with its memory intact, losing six seconds.</w:t>
-      </w:r>
-    </w:p>
-    <w:p>
-      <w:pPr>
-        <w:keepNext/>
-        <w:spacing w:after="60" w:before="120"/>
-        <w:jc w:val="center"/>
-      </w:pPr>
-      <w:r>
-        <w:rPr>
-          <w:smallCaps/>
-          <w:sz w:val="16"/>
-          <w:szCs w:val="16"/>
-        </w:rPr>
-        <w:t xml:space="preserve">TABLE IV.  Alternating 30 min Blocks, Lid 4 cm (27 Sep 2026)</w:t>
-      </w:r>
-    </w:p>
-    <w:tbl>
-      <w:tblPr>
-        <w:tblW w:type="dxa" w:w="4866"/>
-        <w:tblBorders>
-          <w:top w:val="single" w:color="auto" w:sz="4"/>
-          <w:left w:val="single" w:color="auto" w:sz="4"/>
-          <w:bottom w:val="single" w:color="auto" w:sz="4"/>
-          <w:right w:val="single" w:color="auto" w:sz="4"/>
-          <w:insideH w:val="single" w:color="auto" w:sz="4"/>
-          <w:insideV w:val="single" w:color="auto" w:sz="4"/>
-        </w:tblBorders>
-      </w:tblPr>
-      <w:tblGrid>
-        <w:gridCol w:w="1330"/>
-        <w:gridCol w:w="760"/>
-        <w:gridCol w:w="760"/>
-        <w:gridCol w:w="780"/>
-        <w:gridCol w:w="700"/>
-        <w:gridCol w:w="536"/>
-      </w:tblGrid>
-      <w:tr>
-        <w:trPr>
-          <w:cantSplit/>
-          <w:tblHeader/>
-        </w:trPr>
-        <w:tc>
-          <w:tcPr>
-            <w:tcW w:type="dxa" w:w="1330"/>
-            <w:shd w:fill="E7E6E6" w:color="auto" w:val="clear"/>
-            <w:tcMar>
-              <w:top w:type="dxa" w:w="40"/>
-              <w:left w:type="dxa" w:w="80"/>
-              <w:bottom w:type="dxa" w:w="40"/>
-              <w:right w:type="dxa" w:w="80"/>
-            </w:tcMar>
-            <w:vAlign w:val="center"/>
-          </w:tcPr>
-          <w:p>
-            <w:pPr>
-              <w:spacing w:after="0"/>
-              <w:jc w:val="left"/>
-            </w:pPr>
-            <w:r>
-              <w:rPr>
-                <w:b/>
-                <w:bCs/>
-                <w:sz w:val="15"/>
-                <w:szCs w:val="15"/>
-              </w:rPr>
-              <w:t xml:space="preserve">Block</w:t>
-            </w:r>
-          </w:p>
-        </w:tc>
-        <w:tc>
-          <w:tcPr>
-            <w:tcW w:type="dxa" w:w="760"/>
-            <w:shd w:fill="E7E6E6" w:color="auto" w:val="clear"/>
-            <w:tcMar>
-              <w:top w:type="dxa" w:w="40"/>
-              <w:left w:type="dxa" w:w="80"/>
-              <w:bottom w:type="dxa" w:w="40"/>
-              <w:right w:type="dxa" w:w="80"/>
-            </w:tcMar>
-            <w:vAlign w:val="center"/>
-          </w:tcPr>
-          <w:p>
-            <w:pPr>
-              <w:spacing w:after="0"/>
-              <w:jc w:val="center"/>
-            </w:pPr>
-            <w:r>
-              <w:rPr>
-                <w:b/>
-                <w:bCs/>
-                <w:sz w:val="15"/>
-                <w:szCs w:val="15"/>
-              </w:rPr>
-              <w:t xml:space="preserve">In 75–90 %</w:t>
-            </w:r>
-          </w:p>
-        </w:tc>
-        <w:tc>
-          <w:tcPr>
-            <w:tcW w:type="dxa" w:w="760"/>
-            <w:shd w:fill="E7E6E6" w:color="auto" w:val="clear"/>
-            <w:tcMar>
-              <w:top w:type="dxa" w:w="40"/>
-              <w:left w:type="dxa" w:w="80"/>
-              <w:bottom w:type="dxa" w:w="40"/>
-              <w:right w:type="dxa" w:w="80"/>
-            </w:tcMar>
-            <w:vAlign w:val="center"/>
-          </w:tcPr>
-          <w:p>
-            <w:pPr>
-              <w:spacing w:after="0"/>
-              <w:jc w:val="center"/>
-            </w:pPr>
-            <w:r>
-              <w:rPr>
-                <w:b/>
-                <w:bCs/>
-                <w:sz w:val="15"/>
-                <w:szCs w:val="15"/>
-              </w:rPr>
-              <w:t xml:space="preserve">Below 75 %</w:t>
-            </w:r>
-          </w:p>
-        </w:tc>
-        <w:tc>
-          <w:tcPr>
-            <w:tcW w:type="dxa" w:w="780"/>
-            <w:shd w:fill="E7E6E6" w:color="auto" w:val="clear"/>
-            <w:tcMar>
-              <w:top w:type="dxa" w:w="40"/>
-              <w:left w:type="dxa" w:w="80"/>
-              <w:bottom w:type="dxa" w:w="40"/>
-              <w:right w:type="dxa" w:w="80"/>
-            </w:tcMar>
-            <w:vAlign w:val="center"/>
-          </w:tcPr>
-          <w:p>
-            <w:pPr>
-              <w:spacing w:after="0"/>
-              <w:jc w:val="center"/>
-            </w:pPr>
-            <w:r>
-              <w:rPr>
-                <w:b/>
-                <w:bCs/>
-                <w:sz w:val="15"/>
-                <w:szCs w:val="15"/>
-              </w:rPr>
-              <w:t xml:space="preserve">Mist min</w:t>
-            </w:r>
-          </w:p>
-        </w:tc>
-        <w:tc>
-          <w:tcPr>
-            <w:tcW w:type="dxa" w:w="700"/>
-            <w:shd w:fill="E7E6E6" w:color="auto" w:val="clear"/>
-            <w:tcMar>
-              <w:top w:type="dxa" w:w="40"/>
-              <w:left w:type="dxa" w:w="80"/>
-              <w:bottom w:type="dxa" w:w="40"/>
-              <w:right w:type="dxa" w:w="80"/>
-            </w:tcMar>
-            <w:vAlign w:val="center"/>
-          </w:tcPr>
-          <w:p>
-            <w:pPr>
-              <w:spacing w:after="0"/>
-              <w:jc w:val="center"/>
-            </w:pPr>
-            <w:r>
-              <w:rPr>
-                <w:b/>
-                <w:bCs/>
-                <w:sz w:val="15"/>
-                <w:szCs w:val="15"/>
-              </w:rPr>
-              <w:t xml:space="preserve">Bursts</w:t>
-            </w:r>
-          </w:p>
-        </w:tc>
-        <w:tc>
-          <w:tcPr>
-            <w:tcW w:type="dxa" w:w="536"/>
-            <w:shd w:fill="E7E6E6" w:color="auto" w:val="clear"/>
-            <w:tcMar>
-              <w:top w:type="dxa" w:w="40"/>
-              <w:left w:type="dxa" w:w="80"/>
-              <w:bottom w:type="dxa" w:w="40"/>
-              <w:right w:type="dxa" w:w="80"/>
-            </w:tcMar>
-            <w:vAlign w:val="center"/>
-          </w:tcPr>
-          <w:p>
-            <w:pPr>
-              <w:spacing w:after="0"/>
-              <w:jc w:val="center"/>
-            </w:pPr>
-            <w:r>
-              <w:rPr>
-                <w:b/>
-                <w:bCs/>
-                <w:sz w:val="15"/>
-                <w:szCs w:val="15"/>
-              </w:rPr>
-              <w:t xml:space="preserve">%RH range</w:t>
-            </w:r>
-          </w:p>
-        </w:tc>
-      </w:tr>
-      <w:tr>
-        <w:trPr>
-          <w:cantSplit/>
-          <w:tblHeader w:val="false"/>
-        </w:trPr>
-        <w:tc>
-          <w:tcPr>
-            <w:tcW w:type="dxa" w:w="1330"/>
-            <w:tcMar>
-              <w:top w:type="dxa" w:w="40"/>
-              <w:left w:type="dxa" w:w="80"/>
-              <w:bottom w:type="dxa" w:w="40"/>
-              <w:right w:type="dxa" w:w="80"/>
-            </w:tcMar>
-            <w:vAlign w:val="center"/>
-          </w:tcPr>
-          <w:p>
-            <w:pPr>
-              <w:spacing w:after="0"/>
-              <w:jc w:val="left"/>
-            </w:pPr>
-            <w:r>
-              <w:rPr>
-                <w:b w:val="false"/>
-                <w:bCs w:val="false"/>
-                <w:sz w:val="15"/>
-                <w:szCs w:val="15"/>
-              </w:rPr>
-              <w:t xml:space="preserve">Rule, 00:55</w:t>
-            </w:r>
-          </w:p>
-        </w:tc>
-        <w:tc>
-          <w:tcPr>
-            <w:tcW w:type="dxa" w:w="760"/>
-            <w:tcMar>
-              <w:top w:type="dxa" w:w="40"/>
-              <w:left w:type="dxa" w:w="80"/>
-              <w:bottom w:type="dxa" w:w="40"/>
-              <w:right w:type="dxa" w:w="80"/>
-            </w:tcMar>
-            <w:vAlign w:val="center"/>
-          </w:tcPr>
-          <w:p>
-            <w:pPr>
-              <w:spacing w:after="0"/>
-              <w:jc w:val="center"/>
-            </w:pPr>
-            <w:r>
-              <w:rPr>
-                <w:b w:val="false"/>
-                <w:bCs w:val="false"/>
-                <w:sz w:val="15"/>
-                <w:szCs w:val="15"/>
-              </w:rPr>
-              <w:t xml:space="preserve">98.9 %</w:t>
-            </w:r>
-          </w:p>
-        </w:tc>
-        <w:tc>
-          <w:tcPr>
-            <w:tcW w:type="dxa" w:w="760"/>
-            <w:tcMar>
-              <w:top w:type="dxa" w:w="40"/>
-              <w:left w:type="dxa" w:w="80"/>
-              <w:bottom w:type="dxa" w:w="40"/>
-              <w:right w:type="dxa" w:w="80"/>
-            </w:tcMar>
-            <w:vAlign w:val="center"/>
-          </w:tcPr>
-          <w:p>
-            <w:pPr>
-              <w:spacing w:after="0"/>
-              <w:jc w:val="center"/>
-            </w:pPr>
-            <w:r>
-              <w:rPr>
-                <w:b w:val="false"/>
-                <w:bCs w:val="false"/>
-                <w:sz w:val="15"/>
-                <w:szCs w:val="15"/>
-              </w:rPr>
-              <w:t xml:space="preserve">1.1 %</w:t>
-            </w:r>
-          </w:p>
-        </w:tc>
-        <w:tc>
-          <w:tcPr>
-            <w:tcW w:type="dxa" w:w="780"/>
-            <w:tcMar>
-              <w:top w:type="dxa" w:w="40"/>
-              <w:left w:type="dxa" w:w="80"/>
-              <w:bottom w:type="dxa" w:w="40"/>
-              <w:right w:type="dxa" w:w="80"/>
-            </w:tcMar>
-            <w:vAlign w:val="center"/>
-          </w:tcPr>
-          <w:p>
-            <w:pPr>
-              <w:spacing w:after="0"/>
-              <w:jc w:val="center"/>
-            </w:pPr>
-            <w:r>
-              <w:rPr>
-                <w:b w:val="false"/>
-                <w:bCs w:val="false"/>
-                <w:sz w:val="15"/>
-                <w:szCs w:val="15"/>
-              </w:rPr>
-              <w:t xml:space="preserve">10.2</w:t>
-            </w:r>
-          </w:p>
-        </w:tc>
-        <w:tc>
-          <w:tcPr>
-            <w:tcW w:type="dxa" w:w="700"/>
-            <w:tcMar>
-              <w:top w:type="dxa" w:w="40"/>
-              <w:left w:type="dxa" w:w="80"/>
-              <w:bottom w:type="dxa" w:w="40"/>
-              <w:right w:type="dxa" w:w="80"/>
-            </w:tcMar>
-            <w:vAlign w:val="center"/>
-          </w:tcPr>
-          <w:p>
-            <w:pPr>
-              <w:spacing w:after="0"/>
-              <w:jc w:val="center"/>
-            </w:pPr>
-            <w:r>
-              <w:rPr>
-                <w:b w:val="false"/>
-                <w:bCs w:val="false"/>
-                <w:sz w:val="15"/>
-                <w:szCs w:val="15"/>
-              </w:rPr>
-              <w:t xml:space="preserve">3</w:t>
-            </w:r>
-          </w:p>
-        </w:tc>
-        <w:tc>
-          <w:tcPr>
-            <w:tcW w:type="dxa" w:w="536"/>
-            <w:tcMar>
-              <w:top w:type="dxa" w:w="40"/>
-              <w:left w:type="dxa" w:w="80"/>
-              <w:bottom w:type="dxa" w:w="40"/>
-              <w:right w:type="dxa" w:w="80"/>
-            </w:tcMar>
-            <w:vAlign w:val="center"/>
-          </w:tcPr>
-          <w:p>
-            <w:pPr>
-              <w:spacing w:after="0"/>
-              <w:jc w:val="center"/>
-            </w:pPr>
-            <w:r>
-              <w:rPr>
-                <w:b w:val="false"/>
-                <w:bCs w:val="false"/>
-                <w:sz w:val="15"/>
-                <w:szCs w:val="15"/>
-              </w:rPr>
-              <w:t xml:space="preserve">72–87</w:t>
-            </w:r>
-          </w:p>
-        </w:tc>
-      </w:tr>
-      <w:tr>
-        <w:trPr>
-          <w:cantSplit/>
-          <w:tblHeader w:val="false"/>
-        </w:trPr>
-        <w:tc>
-          <w:tcPr>
-            <w:tcW w:type="dxa" w:w="1330"/>
-            <w:tcMar>
-              <w:top w:type="dxa" w:w="40"/>
-              <w:left w:type="dxa" w:w="80"/>
-              <w:bottom w:type="dxa" w:w="40"/>
-              <w:right w:type="dxa" w:w="80"/>
-            </w:tcMar>
-            <w:vAlign w:val="center"/>
-          </w:tcPr>
-          <w:p>
-            <w:pPr>
-              <w:spacing w:after="0"/>
-              <w:jc w:val="left"/>
-            </w:pPr>
-            <w:r>
-              <w:rPr>
-                <w:b w:val="false"/>
-                <w:bCs w:val="false"/>
-                <w:sz w:val="15"/>
-                <w:szCs w:val="15"/>
-              </w:rPr>
-              <w:t xml:space="preserve">Learning, 01:25</w:t>
-            </w:r>
-          </w:p>
-        </w:tc>
-        <w:tc>
-          <w:tcPr>
-            <w:tcW w:type="dxa" w:w="760"/>
-            <w:tcMar>
-              <w:top w:type="dxa" w:w="40"/>
-              <w:left w:type="dxa" w:w="80"/>
-              <w:bottom w:type="dxa" w:w="40"/>
-              <w:right w:type="dxa" w:w="80"/>
-            </w:tcMar>
-            <w:vAlign w:val="center"/>
-          </w:tcPr>
-          <w:p>
-            <w:pPr>
-              <w:spacing w:after="0"/>
-              <w:jc w:val="center"/>
-            </w:pPr>
-            <w:r>
-              <w:rPr>
-                <w:b w:val="false"/>
-                <w:bCs w:val="false"/>
-                <w:sz w:val="15"/>
-                <w:szCs w:val="15"/>
-              </w:rPr>
-              <w:t xml:space="preserve">100.0 %</w:t>
-            </w:r>
-          </w:p>
-        </w:tc>
-        <w:tc>
-          <w:tcPr>
-            <w:tcW w:type="dxa" w:w="760"/>
-            <w:tcMar>
-              <w:top w:type="dxa" w:w="40"/>
-              <w:left w:type="dxa" w:w="80"/>
-              <w:bottom w:type="dxa" w:w="40"/>
-              <w:right w:type="dxa" w:w="80"/>
-            </w:tcMar>
-            <w:vAlign w:val="center"/>
-          </w:tcPr>
-          <w:p>
-            <w:pPr>
-              <w:spacing w:after="0"/>
-              <w:jc w:val="center"/>
-            </w:pPr>
-            <w:r>
-              <w:rPr>
-                <w:b w:val="false"/>
-                <w:bCs w:val="false"/>
-                <w:sz w:val="15"/>
-                <w:szCs w:val="15"/>
-              </w:rPr>
-              <w:t xml:space="preserve">0.0 %</w:t>
-            </w:r>
-          </w:p>
-        </w:tc>
-        <w:tc>
-          <w:tcPr>
-            <w:tcW w:type="dxa" w:w="780"/>
-            <w:tcMar>
-              <w:top w:type="dxa" w:w="40"/>
-              <w:left w:type="dxa" w:w="80"/>
-              <w:bottom w:type="dxa" w:w="40"/>
-              <w:right w:type="dxa" w:w="80"/>
-            </w:tcMar>
-            <w:vAlign w:val="center"/>
-          </w:tcPr>
-          <w:p>
-            <w:pPr>
-              <w:spacing w:after="0"/>
-              <w:jc w:val="center"/>
-            </w:pPr>
-            <w:r>
-              <w:rPr>
-                <w:b w:val="false"/>
-                <w:bCs w:val="false"/>
-                <w:sz w:val="15"/>
-                <w:szCs w:val="15"/>
-              </w:rPr>
-              <w:t xml:space="preserve">0.0</w:t>
-            </w:r>
-          </w:p>
-        </w:tc>
-        <w:tc>
-          <w:tcPr>
-            <w:tcW w:type="dxa" w:w="700"/>
-            <w:tcMar>
-              <w:top w:type="dxa" w:w="40"/>
-              <w:left w:type="dxa" w:w="80"/>
-              <w:bottom w:type="dxa" w:w="40"/>
-              <w:right w:type="dxa" w:w="80"/>
-            </w:tcMar>
-            <w:vAlign w:val="center"/>
-          </w:tcPr>
-          <w:p>
-            <w:pPr>
-              <w:spacing w:after="0"/>
-              <w:jc w:val="center"/>
-            </w:pPr>
-            <w:r>
-              <w:rPr>
-                <w:b w:val="false"/>
-                <w:bCs w:val="false"/>
-                <w:sz w:val="15"/>
-                <w:szCs w:val="15"/>
-              </w:rPr>
-              <w:t xml:space="preserve">0</w:t>
-            </w:r>
-          </w:p>
-        </w:tc>
-        <w:tc>
-          <w:tcPr>
-            <w:tcW w:type="dxa" w:w="536"/>
-            <w:tcMar>
-              <w:top w:type="dxa" w:w="40"/>
-              <w:left w:type="dxa" w:w="80"/>
-              <w:bottom w:type="dxa" w:w="40"/>
-              <w:right w:type="dxa" w:w="80"/>
-            </w:tcMar>
-            <w:vAlign w:val="center"/>
-          </w:tcPr>
-          <w:p>
-            <w:pPr>
-              <w:spacing w:after="0"/>
-              <w:jc w:val="center"/>
-            </w:pPr>
-            <w:r>
-              <w:rPr>
-                <w:b w:val="false"/>
-                <w:bCs w:val="false"/>
-                <w:sz w:val="15"/>
-                <w:szCs w:val="15"/>
-              </w:rPr>
-              <w:t xml:space="preserve">77–82</w:t>
-            </w:r>
-          </w:p>
-        </w:tc>
-      </w:tr>
-      <w:tr>
-        <w:trPr>
-          <w:cantSplit/>
-          <w:tblHeader w:val="false"/>
-        </w:trPr>
-        <w:tc>
-          <w:tcPr>
-            <w:tcW w:type="dxa" w:w="1330"/>
-            <w:tcMar>
-              <w:top w:type="dxa" w:w="40"/>
-              <w:left w:type="dxa" w:w="80"/>
-              <w:bottom w:type="dxa" w:w="40"/>
-              <w:right w:type="dxa" w:w="80"/>
-            </w:tcMar>
-            <w:vAlign w:val="center"/>
-          </w:tcPr>
-          <w:p>
-            <w:pPr>
-              <w:spacing w:after="0"/>
-              <w:jc w:val="left"/>
-            </w:pPr>
-            <w:r>
-              <w:rPr>
-                <w:b w:val="false"/>
-                <w:bCs w:val="false"/>
-                <w:sz w:val="15"/>
-                <w:szCs w:val="15"/>
-              </w:rPr>
-              <w:t xml:space="preserve">Rule, 01:55</w:t>
-            </w:r>
-          </w:p>
-        </w:tc>
-        <w:tc>
-          <w:tcPr>
-            <w:tcW w:type="dxa" w:w="760"/>
-            <w:tcMar>
-              <w:top w:type="dxa" w:w="40"/>
-              <w:left w:type="dxa" w:w="80"/>
-              <w:bottom w:type="dxa" w:w="40"/>
-              <w:right w:type="dxa" w:w="80"/>
-            </w:tcMar>
-            <w:vAlign w:val="center"/>
-          </w:tcPr>
-          <w:p>
-            <w:pPr>
-              <w:spacing w:after="0"/>
-              <w:jc w:val="center"/>
-            </w:pPr>
-            <w:r>
-              <w:rPr>
-                <w:b w:val="false"/>
-                <w:bCs w:val="false"/>
-                <w:sz w:val="15"/>
-                <w:szCs w:val="15"/>
-              </w:rPr>
-              <w:t xml:space="preserve">99.9 %</w:t>
-            </w:r>
-          </w:p>
-        </w:tc>
-        <w:tc>
-          <w:tcPr>
-            <w:tcW w:type="dxa" w:w="760"/>
-            <w:tcMar>
-              <w:top w:type="dxa" w:w="40"/>
-              <w:left w:type="dxa" w:w="80"/>
-              <w:bottom w:type="dxa" w:w="40"/>
-              <w:right w:type="dxa" w:w="80"/>
-            </w:tcMar>
-            <w:vAlign w:val="center"/>
-          </w:tcPr>
-          <w:p>
-            <w:pPr>
-              <w:spacing w:after="0"/>
-              <w:jc w:val="center"/>
-            </w:pPr>
-            <w:r>
-              <w:rPr>
-                <w:b w:val="false"/>
-                <w:bCs w:val="false"/>
-                <w:sz w:val="15"/>
-                <w:szCs w:val="15"/>
-              </w:rPr>
-              <w:t xml:space="preserve">0.1 %</w:t>
-            </w:r>
-          </w:p>
-        </w:tc>
-        <w:tc>
-          <w:tcPr>
-            <w:tcW w:type="dxa" w:w="780"/>
-            <w:tcMar>
-              <w:top w:type="dxa" w:w="40"/>
-              <w:left w:type="dxa" w:w="80"/>
-              <w:bottom w:type="dxa" w:w="40"/>
-              <w:right w:type="dxa" w:w="80"/>
-            </w:tcMar>
-            <w:vAlign w:val="center"/>
-          </w:tcPr>
-          <w:p>
-            <w:pPr>
-              <w:spacing w:after="0"/>
-              <w:jc w:val="center"/>
-            </w:pPr>
-            <w:r>
-              <w:rPr>
-                <w:b w:val="false"/>
-                <w:bCs w:val="false"/>
-                <w:sz w:val="15"/>
-                <w:szCs w:val="15"/>
-              </w:rPr>
-              <w:t xml:space="preserve">4.4</w:t>
-            </w:r>
-          </w:p>
-        </w:tc>
-        <w:tc>
-          <w:tcPr>
-            <w:tcW w:type="dxa" w:w="700"/>
-            <w:tcMar>
-              <w:top w:type="dxa" w:w="40"/>
-              <w:left w:type="dxa" w:w="80"/>
-              <w:bottom w:type="dxa" w:w="40"/>
-              <w:right w:type="dxa" w:w="80"/>
-            </w:tcMar>
-            <w:vAlign w:val="center"/>
-          </w:tcPr>
-          <w:p>
-            <w:pPr>
-              <w:spacing w:after="0"/>
-              <w:jc w:val="center"/>
-            </w:pPr>
-            <w:r>
-              <w:rPr>
-                <w:b w:val="false"/>
-                <w:bCs w:val="false"/>
-                <w:sz w:val="15"/>
-                <w:szCs w:val="15"/>
-              </w:rPr>
-              <w:t xml:space="preserve">1</w:t>
-            </w:r>
-          </w:p>
-        </w:tc>
-        <w:tc>
-          <w:tcPr>
-            <w:tcW w:type="dxa" w:w="536"/>
-            <w:tcMar>
-              <w:top w:type="dxa" w:w="40"/>
-              <w:left w:type="dxa" w:w="80"/>
-              <w:bottom w:type="dxa" w:w="40"/>
-              <w:right w:type="dxa" w:w="80"/>
-            </w:tcMar>
-            <w:vAlign w:val="center"/>
-          </w:tcPr>
-          <w:p>
-            <w:pPr>
-              <w:spacing w:after="0"/>
-              <w:jc w:val="center"/>
-            </w:pPr>
-            <w:r>
-              <w:rPr>
-                <w:b w:val="false"/>
-                <w:bCs w:val="false"/>
-                <w:sz w:val="15"/>
-                <w:szCs w:val="15"/>
-              </w:rPr>
-              <w:t xml:space="preserve">75–88</w:t>
-            </w:r>
-          </w:p>
-        </w:tc>
-      </w:tr>
-      <w:tr>
-        <w:trPr>
-          <w:cantSplit/>
-          <w:tblHeader w:val="false"/>
-        </w:trPr>
-        <w:tc>
-          <w:tcPr>
-            <w:tcW w:type="dxa" w:w="1330"/>
-            <w:tcMar>
-              <w:top w:type="dxa" w:w="40"/>
-              <w:left w:type="dxa" w:w="80"/>
-              <w:bottom w:type="dxa" w:w="40"/>
-              <w:right w:type="dxa" w:w="80"/>
-            </w:tcMar>
-            <w:vAlign w:val="center"/>
-          </w:tcPr>
-          <w:p>
-            <w:pPr>
-              <w:spacing w:after="0"/>
-              <w:jc w:val="left"/>
-            </w:pPr>
-            <w:r>
-              <w:rPr>
-                <w:b w:val="false"/>
-                <w:bCs w:val="false"/>
-                <w:sz w:val="15"/>
-                <w:szCs w:val="15"/>
-              </w:rPr>
-              <w:t xml:space="preserve">Learning, 02:25</w:t>
-            </w:r>
-          </w:p>
-        </w:tc>
-        <w:tc>
-          <w:tcPr>
-            <w:tcW w:type="dxa" w:w="760"/>
-            <w:tcMar>
-              <w:top w:type="dxa" w:w="40"/>
-              <w:left w:type="dxa" w:w="80"/>
-              <w:bottom w:type="dxa" w:w="40"/>
-              <w:right w:type="dxa" w:w="80"/>
-            </w:tcMar>
-            <w:vAlign w:val="center"/>
-          </w:tcPr>
-          <w:p>
-            <w:pPr>
-              <w:spacing w:after="0"/>
-              <w:jc w:val="center"/>
-            </w:pPr>
-            <w:r>
-              <w:rPr>
-                <w:b w:val="false"/>
-                <w:bCs w:val="false"/>
-                <w:sz w:val="15"/>
-                <w:szCs w:val="15"/>
-              </w:rPr>
-              <w:t xml:space="preserve">100.0 %</w:t>
-            </w:r>
-          </w:p>
-        </w:tc>
-        <w:tc>
-          <w:tcPr>
-            <w:tcW w:type="dxa" w:w="760"/>
-            <w:tcMar>
-              <w:top w:type="dxa" w:w="40"/>
-              <w:left w:type="dxa" w:w="80"/>
-              <w:bottom w:type="dxa" w:w="40"/>
-              <w:right w:type="dxa" w:w="80"/>
-            </w:tcMar>
-            <w:vAlign w:val="center"/>
-          </w:tcPr>
-          <w:p>
-            <w:pPr>
-              <w:spacing w:after="0"/>
-              <w:jc w:val="center"/>
-            </w:pPr>
-            <w:r>
-              <w:rPr>
-                <w:b w:val="false"/>
-                <w:bCs w:val="false"/>
-                <w:sz w:val="15"/>
-                <w:szCs w:val="15"/>
-              </w:rPr>
-              <w:t xml:space="preserve">0.0 %</w:t>
-            </w:r>
-          </w:p>
-        </w:tc>
-        <w:tc>
-          <w:tcPr>
-            <w:tcW w:type="dxa" w:w="780"/>
-            <w:tcMar>
-              <w:top w:type="dxa" w:w="40"/>
-              <w:left w:type="dxa" w:w="80"/>
-              <w:bottom w:type="dxa" w:w="40"/>
-              <w:right w:type="dxa" w:w="80"/>
-            </w:tcMar>
-            <w:vAlign w:val="center"/>
-          </w:tcPr>
-          <w:p>
-            <w:pPr>
-              <w:spacing w:after="0"/>
-              <w:jc w:val="center"/>
-            </w:pPr>
-            <w:r>
-              <w:rPr>
-                <w:b w:val="false"/>
-                <w:bCs w:val="false"/>
-                <w:sz w:val="15"/>
-                <w:szCs w:val="15"/>
-              </w:rPr>
-              <w:t xml:space="preserve">0.0</w:t>
-            </w:r>
-          </w:p>
-        </w:tc>
-        <w:tc>
-          <w:tcPr>
-            <w:tcW w:type="dxa" w:w="700"/>
-            <w:tcMar>
-              <w:top w:type="dxa" w:w="40"/>
-              <w:left w:type="dxa" w:w="80"/>
-              <w:bottom w:type="dxa" w:w="40"/>
-              <w:right w:type="dxa" w:w="80"/>
-            </w:tcMar>
-            <w:vAlign w:val="center"/>
-          </w:tcPr>
-          <w:p>
-            <w:pPr>
-              <w:spacing w:after="0"/>
-              <w:jc w:val="center"/>
-            </w:pPr>
-            <w:r>
-              <w:rPr>
-                <w:b w:val="false"/>
-                <w:bCs w:val="false"/>
-                <w:sz w:val="15"/>
-                <w:szCs w:val="15"/>
-              </w:rPr>
-              <w:t xml:space="preserve">0</w:t>
-            </w:r>
-          </w:p>
-        </w:tc>
-        <w:tc>
-          <w:tcPr>
-            <w:tcW w:type="dxa" w:w="536"/>
-            <w:tcMar>
-              <w:top w:type="dxa" w:w="40"/>
-              <w:left w:type="dxa" w:w="80"/>
-              <w:bottom w:type="dxa" w:w="40"/>
-              <w:right w:type="dxa" w:w="80"/>
-            </w:tcMar>
-            <w:vAlign w:val="center"/>
-          </w:tcPr>
-          <w:p>
-            <w:pPr>
-              <w:spacing w:after="0"/>
-              <w:jc w:val="center"/>
-            </w:pPr>
-            <w:r>
-              <w:rPr>
-                <w:b w:val="false"/>
-                <w:bCs w:val="false"/>
-                <w:sz w:val="15"/>
-                <w:szCs w:val="15"/>
-              </w:rPr>
-              <w:t xml:space="preserve">79–88</w:t>
-            </w:r>
-          </w:p>
-        </w:tc>
-      </w:tr>
-      <w:tr>
-        <w:trPr>
-          <w:cantSplit/>
-          <w:tblHeader w:val="false"/>
-        </w:trPr>
-        <w:tc>
-          <w:tcPr>
-            <w:tcW w:type="dxa" w:w="1330"/>
-            <w:tcMar>
-              <w:top w:type="dxa" w:w="40"/>
-              <w:left w:type="dxa" w:w="80"/>
-              <w:bottom w:type="dxa" w:w="40"/>
-              <w:right w:type="dxa" w:w="80"/>
-            </w:tcMar>
-            <w:vAlign w:val="center"/>
-          </w:tcPr>
-          <w:p>
-            <w:pPr>
-              <w:spacing w:after="0"/>
-              <w:jc w:val="left"/>
-            </w:pPr>
-            <w:r>
-              <w:rPr>
-                <w:b/>
-                <w:bCs/>
-                <w:sz w:val="15"/>
-                <w:szCs w:val="15"/>
-              </w:rPr>
-              <w:t xml:space="preserve">Rule, 60 min</w:t>
-            </w:r>
-          </w:p>
-        </w:tc>
-        <w:tc>
-          <w:tcPr>
-            <w:tcW w:type="dxa" w:w="760"/>
-            <w:tcMar>
-              <w:top w:type="dxa" w:w="40"/>
-              <w:left w:type="dxa" w:w="80"/>
-              <w:bottom w:type="dxa" w:w="40"/>
-              <w:right w:type="dxa" w:w="80"/>
-            </w:tcMar>
-            <w:vAlign w:val="center"/>
-          </w:tcPr>
-          <w:p>
-            <w:pPr>
-              <w:spacing w:after="0"/>
-              <w:jc w:val="center"/>
-            </w:pPr>
-            <w:r>
-              <w:rPr>
-                <w:b/>
-                <w:bCs/>
-                <w:sz w:val="15"/>
-                <w:szCs w:val="15"/>
-              </w:rPr>
-              <w:t xml:space="preserve">99.4 %</w:t>
-            </w:r>
-          </w:p>
-        </w:tc>
-        <w:tc>
-          <w:tcPr>
-            <w:tcW w:type="dxa" w:w="760"/>
-            <w:tcMar>
-              <w:top w:type="dxa" w:w="40"/>
-              <w:left w:type="dxa" w:w="80"/>
-              <w:bottom w:type="dxa" w:w="40"/>
-              <w:right w:type="dxa" w:w="80"/>
-            </w:tcMar>
-            <w:vAlign w:val="center"/>
-          </w:tcPr>
-          <w:p>
-            <w:pPr>
-              <w:spacing w:after="0"/>
-              <w:jc w:val="center"/>
-            </w:pPr>
-            <w:r>
-              <w:rPr>
-                <w:b/>
-                <w:bCs/>
-                <w:sz w:val="15"/>
-                <w:szCs w:val="15"/>
-              </w:rPr>
-              <w:t xml:space="preserve">0.6 %</w:t>
-            </w:r>
-          </w:p>
-        </w:tc>
-        <w:tc>
-          <w:tcPr>
-            <w:tcW w:type="dxa" w:w="780"/>
-            <w:tcMar>
-              <w:top w:type="dxa" w:w="40"/>
-              <w:left w:type="dxa" w:w="80"/>
-              <w:bottom w:type="dxa" w:w="40"/>
-              <w:right w:type="dxa" w:w="80"/>
-            </w:tcMar>
-            <w:vAlign w:val="center"/>
-          </w:tcPr>
-          <w:p>
-            <w:pPr>
-              <w:spacing w:after="0"/>
-              <w:jc w:val="center"/>
-            </w:pPr>
-            <w:r>
-              <w:rPr>
-                <w:b/>
-                <w:bCs/>
-                <w:sz w:val="15"/>
-                <w:szCs w:val="15"/>
-              </w:rPr>
-              <w:t xml:space="preserve">14.6</w:t>
-            </w:r>
-          </w:p>
-        </w:tc>
-        <w:tc>
-          <w:tcPr>
-            <w:tcW w:type="dxa" w:w="700"/>
-            <w:tcMar>
-              <w:top w:type="dxa" w:w="40"/>
-              <w:left w:type="dxa" w:w="80"/>
-              <w:bottom w:type="dxa" w:w="40"/>
-              <w:right w:type="dxa" w:w="80"/>
-            </w:tcMar>
-            <w:vAlign w:val="center"/>
-          </w:tcPr>
-          <w:p>
-            <w:pPr>
-              <w:spacing w:after="0"/>
-              <w:jc w:val="center"/>
-            </w:pPr>
-            <w:r>
-              <w:rPr>
-                <w:b/>
-                <w:bCs/>
-                <w:sz w:val="15"/>
-                <w:szCs w:val="15"/>
-              </w:rPr>
-              <w:t xml:space="preserve">4</w:t>
-            </w:r>
-          </w:p>
-        </w:tc>
-        <w:tc>
-          <w:tcPr>
-            <w:tcW w:type="dxa" w:w="536"/>
-            <w:tcMar>
-              <w:top w:type="dxa" w:w="40"/>
-              <w:left w:type="dxa" w:w="80"/>
-              <w:bottom w:type="dxa" w:w="40"/>
-              <w:right w:type="dxa" w:w="80"/>
-            </w:tcMar>
-            <w:vAlign w:val="center"/>
-          </w:tcPr>
-          <w:p>
-            <w:pPr>
-              <w:spacing w:after="0"/>
-              <w:jc w:val="center"/>
-            </w:pPr>
-            <w:r>
-              <w:rPr>
-                <w:b/>
-                <w:bCs/>
-                <w:sz w:val="15"/>
-                <w:szCs w:val="15"/>
-              </w:rPr>
-              <w:t xml:space="preserve"/>
-            </w:r>
-          </w:p>
-        </w:tc>
-      </w:tr>
-      <w:tr>
-        <w:trPr>
-          <w:cantSplit/>
-          <w:tblHeader w:val="false"/>
-        </w:trPr>
-        <w:tc>
-          <w:tcPr>
-            <w:tcW w:type="dxa" w:w="1330"/>
-            <w:tcMar>
-              <w:top w:type="dxa" w:w="40"/>
-              <w:left w:type="dxa" w:w="80"/>
-              <w:bottom w:type="dxa" w:w="40"/>
-              <w:right w:type="dxa" w:w="80"/>
-            </w:tcMar>
-            <w:vAlign w:val="center"/>
-          </w:tcPr>
-          <w:p>
-            <w:pPr>
-              <w:spacing w:after="0"/>
-              <w:jc w:val="left"/>
-            </w:pPr>
-            <w:r>
-              <w:rPr>
-                <w:b/>
-                <w:bCs/>
-                <w:sz w:val="15"/>
-                <w:szCs w:val="15"/>
-              </w:rPr>
-              <w:t xml:space="preserve">Learning, 60 min</w:t>
-            </w:r>
-          </w:p>
-        </w:tc>
-        <w:tc>
-          <w:tcPr>
-            <w:tcW w:type="dxa" w:w="760"/>
-            <w:tcMar>
-              <w:top w:type="dxa" w:w="40"/>
-              <w:left w:type="dxa" w:w="80"/>
-              <w:bottom w:type="dxa" w:w="40"/>
-              <w:right w:type="dxa" w:w="80"/>
-            </w:tcMar>
-            <w:vAlign w:val="center"/>
-          </w:tcPr>
-          <w:p>
-            <w:pPr>
-              <w:spacing w:after="0"/>
-              <w:jc w:val="center"/>
-            </w:pPr>
-            <w:r>
-              <w:rPr>
-                <w:b/>
-                <w:bCs/>
-                <w:sz w:val="15"/>
-                <w:szCs w:val="15"/>
-              </w:rPr>
-              <w:t xml:space="preserve">100.0 %</w:t>
-            </w:r>
-          </w:p>
-        </w:tc>
-        <w:tc>
-          <w:tcPr>
-            <w:tcW w:type="dxa" w:w="760"/>
-            <w:tcMar>
-              <w:top w:type="dxa" w:w="40"/>
-              <w:left w:type="dxa" w:w="80"/>
-              <w:bottom w:type="dxa" w:w="40"/>
-              <w:right w:type="dxa" w:w="80"/>
-            </w:tcMar>
-            <w:vAlign w:val="center"/>
-          </w:tcPr>
-          <w:p>
-            <w:pPr>
-              <w:spacing w:after="0"/>
-              <w:jc w:val="center"/>
-            </w:pPr>
-            <w:r>
-              <w:rPr>
-                <w:b/>
-                <w:bCs/>
-                <w:sz w:val="15"/>
-                <w:szCs w:val="15"/>
-              </w:rPr>
-              <w:t xml:space="preserve">0.0 %</w:t>
-            </w:r>
-          </w:p>
-        </w:tc>
-        <w:tc>
-          <w:tcPr>
-            <w:tcW w:type="dxa" w:w="780"/>
-            <w:tcMar>
-              <w:top w:type="dxa" w:w="40"/>
-              <w:left w:type="dxa" w:w="80"/>
-              <w:bottom w:type="dxa" w:w="40"/>
-              <w:right w:type="dxa" w:w="80"/>
-            </w:tcMar>
-            <w:vAlign w:val="center"/>
-          </w:tcPr>
-          <w:p>
-            <w:pPr>
-              <w:spacing w:after="0"/>
-              <w:jc w:val="center"/>
-            </w:pPr>
-            <w:r>
-              <w:rPr>
-                <w:b/>
-                <w:bCs/>
-                <w:sz w:val="15"/>
-                <w:szCs w:val="15"/>
-              </w:rPr>
-              <w:t xml:space="preserve">0.0</w:t>
-            </w:r>
-          </w:p>
-        </w:tc>
-        <w:tc>
-          <w:tcPr>
-            <w:tcW w:type="dxa" w:w="700"/>
-            <w:tcMar>
-              <w:top w:type="dxa" w:w="40"/>
-              <w:left w:type="dxa" w:w="80"/>
-              <w:bottom w:type="dxa" w:w="40"/>
-              <w:right w:type="dxa" w:w="80"/>
-            </w:tcMar>
-            <w:vAlign w:val="center"/>
-          </w:tcPr>
-          <w:p>
-            <w:pPr>
-              <w:spacing w:after="0"/>
-              <w:jc w:val="center"/>
-            </w:pPr>
-            <w:r>
-              <w:rPr>
-                <w:b/>
-                <w:bCs/>
-                <w:sz w:val="15"/>
-                <w:szCs w:val="15"/>
-              </w:rPr>
-              <w:t xml:space="preserve">0</w:t>
-            </w:r>
-          </w:p>
-        </w:tc>
-        <w:tc>
-          <w:tcPr>
-            <w:tcW w:type="dxa" w:w="536"/>
-            <w:tcMar>
-              <w:top w:type="dxa" w:w="40"/>
-              <w:left w:type="dxa" w:w="80"/>
-              <w:bottom w:type="dxa" w:w="40"/>
-              <w:right w:type="dxa" w:w="80"/>
-            </w:tcMar>
-            <w:vAlign w:val="center"/>
-          </w:tcPr>
-          <w:p>
-            <w:pPr>
-              <w:spacing w:after="0"/>
-              <w:jc w:val="center"/>
-            </w:pPr>
-            <w:r>
-              <w:rPr>
-                <w:b/>
-                <w:bCs/>
-                <w:sz w:val="15"/>
-                <w:szCs w:val="15"/>
-              </w:rPr>
-              <w:t xml:space="preserve"/>
             </w:r>
           </w:p>
         </w:tc>
@@ -4364,7 +3988,22 @@
           <w:sz w:val="16"/>
           <w:szCs w:val="16"/>
         </w:rPr>
-        <w:t xml:space="preserve">Fig. 3. Alternating session, night: the rule mists to its 300 s cap whenever the enclosure reaches 75 %; the learning controller, judging the enclosure's own equilibrium sufficient, never mists.</w:t>
+        <w:t xml:space="preserve">Fig. 3. Fault session: humidity (top) and inside temperature (bottom); dotted red lines mark injected events, green labels the controller's verdicts.</w:t>
+      </w:r>
+    </w:p>
+    <w:p>
+      <w:pPr>
+        <w:keepNext/>
+        <w:spacing w:after="60" w:before="120"/>
+      </w:pPr>
+      <w:r>
+        <w:rPr>
+          <w:i/>
+          <w:iCs/>
+          <w:sz w:val="20"/>
+          <w:szCs w:val="20"/>
+        </w:rPr>
+        <w:t xml:space="preserve">C. Alternating Comparison</w:t>
       </w:r>
     </w:p>
     <w:p>
@@ -4378,7 +4017,7 @@
           <w:sz w:val="20"/>
           <w:szCs w:val="20"/>
         </w:rPr>
-        <w:t xml:space="preserve">The following evening the room had dried to 69 percent and the enclosure to 69 percent, and the picture reversed: the enclosure's passive equilibrium was now about 74 percent, just below the band, and one mist maker could raise the control reading only to about 82 percent, short of the controller's 88 percent target. Both controllers therefore misted most of the time (Table V, Fig. 4). Taking the blocks as pairs on the same enclosure, the learning controller held the band 74.3 percent of the time against the rule's 65.6 percent starting from the dry enclosure, and 99.4 against 90.9 percent starting from an enclosure the previous block had left in band. It did so by holding the band from below with full-length bursts separated by 60 s rests, where the rule's fixed 180 s rest let the enclosure fall below 75 percent in every cycle; the cost was about 40 percent more mist time, 24 min against 16 to 18 min per half hour. The slow model's leak weight moved from the seeded minus 0.036 to minus 0.23, minus 0.16 and minus 0.13 per step over the three learning blocks. All 9,000 samples of the evening were valid, and no chip restart occurred.</w:t>
+        <w:t xml:space="preserve">Table V gives the four blocks; every sample in all four was valid. Fig. 4 shows the traces. In each rule block the enclosure fell to 75 percent, the rule misted for the full 300 s cap to 87 to 88 percent, and the enclosure drained back in about 10 min; over its hour the rule misted 14.6 min in four bursts and held the band 99.4 percent of the time, the remainder being the dips below 75 percent that trigger it. In both learning blocks the enclosure, left alone, settled between 77 and 82 percent RH: with the 4 cm gap and the water tray, the enclosure's own equilibrium lies inside the band. The learning controller's planner, which acts only below 77 percent, was never triggered; it held the band 100 percent of the time with zero misting, and its slow model moved again (leak weight minus 0.036 to minus 0.093 per step over the two blocks). The blocks alternated, and each learning block inherited the enclosure at 75 to 88 percent from the preceding rule block; the reference sensor drifted from 73 to 71 percent over the two hours, so conditions were slightly drier for the later blocks. One interrupt-watchdog restart of the ESP32 occurred at 02:50 in the last block; the controller detected the restart from the uptime counter, re-armed manual mode and continued with its memory intact, losing six seconds.</w:t>
       </w:r>
     </w:p>
     <w:p>
@@ -4393,12 +4032,12 @@
           <w:sz w:val="16"/>
           <w:szCs w:val="16"/>
         </w:rPr>
-        <w:t xml:space="preserve">TABLE V.  Alternating 30 min Blocks on a Dry Enclosure, Lid 4 cm (27 Sep 2026, evening)</w:t>
+        <w:t xml:space="preserve">TABLE V.  Alternating 30 min Blocks, Lid 4 cm (27 Sep 2026)</w:t>
       </w:r>
     </w:p>
     <w:tbl>
       <w:tblPr>
-        <w:tblW w:type="dxa" w:w="4700"/>
+        <w:tblW w:type="dxa" w:w="4866"/>
         <w:tblBorders>
           <w:top w:val="single" w:color="auto" w:sz="4"/>
           <w:left w:val="single" w:color="auto" w:sz="4"/>
@@ -4409,11 +4048,12 @@
         </w:tblBorders>
       </w:tblPr>
       <w:tblGrid>
-        <w:gridCol w:w="1700"/>
+        <w:gridCol w:w="1330"/>
         <w:gridCol w:w="760"/>
         <w:gridCol w:w="760"/>
         <w:gridCol w:w="780"/>
         <w:gridCol w:w="700"/>
+        <w:gridCol w:w="536"/>
       </w:tblGrid>
       <w:tr>
         <w:trPr>
@@ -4422,7 +4062,7 @@
         </w:trPr>
         <w:tc>
           <w:tcPr>
-            <w:tcW w:type="dxa" w:w="1700"/>
+            <w:tcW w:type="dxa" w:w="1330"/>
             <w:shd w:fill="E7E6E6" w:color="auto" w:val="clear"/>
             <w:tcMar>
               <w:top w:type="dxa" w:w="40"/>
@@ -4557,6 +4197,34 @@
                 <w:szCs w:val="15"/>
               </w:rPr>
               <w:t xml:space="preserve">Bursts</w:t>
+            </w:r>
+          </w:p>
+        </w:tc>
+        <w:tc>
+          <w:tcPr>
+            <w:tcW w:type="dxa" w:w="536"/>
+            <w:shd w:fill="E7E6E6" w:color="auto" w:val="clear"/>
+            <w:tcMar>
+              <w:top w:type="dxa" w:w="40"/>
+              <w:left w:type="dxa" w:w="80"/>
+              <w:bottom w:type="dxa" w:w="40"/>
+              <w:right w:type="dxa" w:w="80"/>
+            </w:tcMar>
+            <w:vAlign w:val="center"/>
+          </w:tcPr>
+          <w:p>
+            <w:pPr>
+              <w:spacing w:after="0"/>
+              <w:jc w:val="center"/>
+            </w:pPr>
+            <w:r>
+              <w:rPr>
+                <w:b/>
+                <w:bCs/>
+                <w:sz w:val="15"/>
+                <w:szCs w:val="15"/>
+              </w:rPr>
+              <w:t xml:space="preserve">%RH range</w:t>
             </w:r>
           </w:p>
         </w:tc>
@@ -4568,7 +4236,7 @@
         </w:trPr>
         <w:tc>
           <w:tcPr>
-            <w:tcW w:type="dxa" w:w="1700"/>
+            <w:tcW w:type="dxa" w:w="1330"/>
             <w:tcMar>
               <w:top w:type="dxa" w:w="40"/>
               <w:left w:type="dxa" w:w="80"/>
@@ -4584,10 +4252,12 @@
             </w:pPr>
             <w:r>
               <w:rPr>
-                <w:sz w:val="15"/>
-                <w:szCs w:val="15"/>
-              </w:rPr>
-              <w:t xml:space="preserve">Learning, 20:03 (dry start)</w:t>
+                <w:b w:val="false"/>
+                <w:bCs w:val="false"/>
+                <w:sz w:val="15"/>
+                <w:szCs w:val="15"/>
+              </w:rPr>
+              <w:t xml:space="preserve">Rule, 00:55</w:t>
             </w:r>
           </w:p>
         </w:tc>
@@ -4609,10 +4279,12 @@
             </w:pPr>
             <w:r>
               <w:rPr>
-                <w:sz w:val="15"/>
-                <w:szCs w:val="15"/>
-              </w:rPr>
-              <w:t xml:space="preserve">74.3 %</w:t>
+                <w:b w:val="false"/>
+                <w:bCs w:val="false"/>
+                <w:sz w:val="15"/>
+                <w:szCs w:val="15"/>
+              </w:rPr>
+              <w:t xml:space="preserve">98.9 %</w:t>
             </w:r>
           </w:p>
         </w:tc>
@@ -4634,10 +4306,12 @@
             </w:pPr>
             <w:r>
               <w:rPr>
-                <w:sz w:val="15"/>
-                <w:szCs w:val="15"/>
-              </w:rPr>
-              <w:t xml:space="preserve">25.7 %</w:t>
+                <w:b w:val="false"/>
+                <w:bCs w:val="false"/>
+                <w:sz w:val="15"/>
+                <w:szCs w:val="15"/>
+              </w:rPr>
+              <w:t xml:space="preserve">1.1 %</w:t>
             </w:r>
           </w:p>
         </w:tc>
@@ -4659,10 +4333,12 @@
             </w:pPr>
             <w:r>
               <w:rPr>
-                <w:sz w:val="15"/>
-                <w:szCs w:val="15"/>
-              </w:rPr>
-              <w:t xml:space="preserve">24.1</w:t>
+                <w:b w:val="false"/>
+                <w:bCs w:val="false"/>
+                <w:sz w:val="15"/>
+                <w:szCs w:val="15"/>
+              </w:rPr>
+              <w:t xml:space="preserve">10.2</w:t>
             </w:r>
           </w:p>
         </w:tc>
@@ -4684,10 +4360,39 @@
             </w:pPr>
             <w:r>
               <w:rPr>
-                <w:sz w:val="15"/>
-                <w:szCs w:val="15"/>
-              </w:rPr>
-              <w:t xml:space="preserve">6</w:t>
+                <w:b w:val="false"/>
+                <w:bCs w:val="false"/>
+                <w:sz w:val="15"/>
+                <w:szCs w:val="15"/>
+              </w:rPr>
+              <w:t xml:space="preserve">3</w:t>
+            </w:r>
+          </w:p>
+        </w:tc>
+        <w:tc>
+          <w:tcPr>
+            <w:tcW w:type="dxa" w:w="536"/>
+            <w:tcMar>
+              <w:top w:type="dxa" w:w="40"/>
+              <w:left w:type="dxa" w:w="80"/>
+              <w:bottom w:type="dxa" w:w="40"/>
+              <w:right w:type="dxa" w:w="80"/>
+            </w:tcMar>
+            <w:vAlign w:val="center"/>
+          </w:tcPr>
+          <w:p>
+            <w:pPr>
+              <w:spacing w:after="0"/>
+              <w:jc w:val="center"/>
+            </w:pPr>
+            <w:r>
+              <w:rPr>
+                <w:b w:val="false"/>
+                <w:bCs w:val="false"/>
+                <w:sz w:val="15"/>
+                <w:szCs w:val="15"/>
+              </w:rPr>
+              <w:t xml:space="preserve">72–87</w:t>
             </w:r>
           </w:p>
         </w:tc>
@@ -4699,7 +4404,7 @@
         </w:trPr>
         <w:tc>
           <w:tcPr>
-            <w:tcW w:type="dxa" w:w="1700"/>
+            <w:tcW w:type="dxa" w:w="1330"/>
             <w:tcMar>
               <w:top w:type="dxa" w:w="40"/>
               <w:left w:type="dxa" w:w="80"/>
@@ -4715,10 +4420,12 @@
             </w:pPr>
             <w:r>
               <w:rPr>
-                <w:sz w:val="15"/>
-                <w:szCs w:val="15"/>
-              </w:rPr>
-              <w:t xml:space="preserve">Rule, 20:33</w:t>
+                <w:b w:val="false"/>
+                <w:bCs w:val="false"/>
+                <w:sz w:val="15"/>
+                <w:szCs w:val="15"/>
+              </w:rPr>
+              <w:t xml:space="preserve">Learning, 01:25</w:t>
             </w:r>
           </w:p>
         </w:tc>
@@ -4740,10 +4447,12 @@
             </w:pPr>
             <w:r>
               <w:rPr>
-                <w:sz w:val="15"/>
-                <w:szCs w:val="15"/>
-              </w:rPr>
-              <w:t xml:space="preserve">65.6 %</w:t>
+                <w:b w:val="false"/>
+                <w:bCs w:val="false"/>
+                <w:sz w:val="15"/>
+                <w:szCs w:val="15"/>
+              </w:rPr>
+              <w:t xml:space="preserve">100.0 %</w:t>
             </w:r>
           </w:p>
         </w:tc>
@@ -4765,10 +4474,12 @@
             </w:pPr>
             <w:r>
               <w:rPr>
-                <w:sz w:val="15"/>
-                <w:szCs w:val="15"/>
-              </w:rPr>
-              <w:t xml:space="preserve">34.4 %</w:t>
+                <w:b w:val="false"/>
+                <w:bCs w:val="false"/>
+                <w:sz w:val="15"/>
+                <w:szCs w:val="15"/>
+              </w:rPr>
+              <w:t xml:space="preserve">0.0 %</w:t>
             </w:r>
           </w:p>
         </w:tc>
@@ -4790,10 +4501,12 @@
             </w:pPr>
             <w:r>
               <w:rPr>
-                <w:sz w:val="15"/>
-                <w:szCs w:val="15"/>
-              </w:rPr>
-              <w:t xml:space="preserve">18.2</w:t>
+                <w:b w:val="false"/>
+                <w:bCs w:val="false"/>
+                <w:sz w:val="15"/>
+                <w:szCs w:val="15"/>
+              </w:rPr>
+              <w:t xml:space="preserve">0.0</w:t>
             </w:r>
           </w:p>
         </w:tc>
@@ -4815,10 +4528,39 @@
             </w:pPr>
             <w:r>
               <w:rPr>
-                <w:sz w:val="15"/>
-                <w:szCs w:val="15"/>
-              </w:rPr>
-              <w:t xml:space="preserve">4</w:t>
+                <w:b w:val="false"/>
+                <w:bCs w:val="false"/>
+                <w:sz w:val="15"/>
+                <w:szCs w:val="15"/>
+              </w:rPr>
+              <w:t xml:space="preserve">0</w:t>
+            </w:r>
+          </w:p>
+        </w:tc>
+        <w:tc>
+          <w:tcPr>
+            <w:tcW w:type="dxa" w:w="536"/>
+            <w:tcMar>
+              <w:top w:type="dxa" w:w="40"/>
+              <w:left w:type="dxa" w:w="80"/>
+              <w:bottom w:type="dxa" w:w="40"/>
+              <w:right w:type="dxa" w:w="80"/>
+            </w:tcMar>
+            <w:vAlign w:val="center"/>
+          </w:tcPr>
+          <w:p>
+            <w:pPr>
+              <w:spacing w:after="0"/>
+              <w:jc w:val="center"/>
+            </w:pPr>
+            <w:r>
+              <w:rPr>
+                <w:b w:val="false"/>
+                <w:bCs w:val="false"/>
+                <w:sz w:val="15"/>
+                <w:szCs w:val="15"/>
+              </w:rPr>
+              <w:t xml:space="preserve">77–82</w:t>
             </w:r>
           </w:p>
         </w:tc>
@@ -4830,7 +4572,7 @@
         </w:trPr>
         <w:tc>
           <w:tcPr>
-            <w:tcW w:type="dxa" w:w="1700"/>
+            <w:tcW w:type="dxa" w:w="1330"/>
             <w:tcMar>
               <w:top w:type="dxa" w:w="40"/>
               <w:left w:type="dxa" w:w="80"/>
@@ -4846,10 +4588,12 @@
             </w:pPr>
             <w:r>
               <w:rPr>
-                <w:sz w:val="15"/>
-                <w:szCs w:val="15"/>
-              </w:rPr>
-              <w:t xml:space="preserve">Learning, 21:03</w:t>
+                <w:b w:val="false"/>
+                <w:bCs w:val="false"/>
+                <w:sz w:val="15"/>
+                <w:szCs w:val="15"/>
+              </w:rPr>
+              <w:t xml:space="preserve">Rule, 01:55</w:t>
             </w:r>
           </w:p>
         </w:tc>
@@ -4871,10 +4615,12 @@
             </w:pPr>
             <w:r>
               <w:rPr>
-                <w:sz w:val="15"/>
-                <w:szCs w:val="15"/>
-              </w:rPr>
-              <w:t xml:space="preserve">99.4 %</w:t>
+                <w:b w:val="false"/>
+                <w:bCs w:val="false"/>
+                <w:sz w:val="15"/>
+                <w:szCs w:val="15"/>
+              </w:rPr>
+              <w:t xml:space="preserve">99.9 %</w:t>
             </w:r>
           </w:p>
         </w:tc>
@@ -4896,10 +4642,12 @@
             </w:pPr>
             <w:r>
               <w:rPr>
-                <w:sz w:val="15"/>
-                <w:szCs w:val="15"/>
-              </w:rPr>
-              <w:t xml:space="preserve">0.6 %</w:t>
+                <w:b w:val="false"/>
+                <w:bCs w:val="false"/>
+                <w:sz w:val="15"/>
+                <w:szCs w:val="15"/>
+              </w:rPr>
+              <w:t xml:space="preserve">0.1 %</w:t>
             </w:r>
           </w:p>
         </w:tc>
@@ -4921,10 +4669,12 @@
             </w:pPr>
             <w:r>
               <w:rPr>
-                <w:sz w:val="15"/>
-                <w:szCs w:val="15"/>
-              </w:rPr>
-              <w:t xml:space="preserve">24.0</w:t>
+                <w:b w:val="false"/>
+                <w:bCs w:val="false"/>
+                <w:sz w:val="15"/>
+                <w:szCs w:val="15"/>
+              </w:rPr>
+              <w:t xml:space="preserve">4.4</w:t>
             </w:r>
           </w:p>
         </w:tc>
@@ -4946,10 +4696,39 @@
             </w:pPr>
             <w:r>
               <w:rPr>
-                <w:sz w:val="15"/>
-                <w:szCs w:val="15"/>
-              </w:rPr>
-              <w:t xml:space="preserve">6</w:t>
+                <w:b w:val="false"/>
+                <w:bCs w:val="false"/>
+                <w:sz w:val="15"/>
+                <w:szCs w:val="15"/>
+              </w:rPr>
+              <w:t xml:space="preserve">1</w:t>
+            </w:r>
+          </w:p>
+        </w:tc>
+        <w:tc>
+          <w:tcPr>
+            <w:tcW w:type="dxa" w:w="536"/>
+            <w:tcMar>
+              <w:top w:type="dxa" w:w="40"/>
+              <w:left w:type="dxa" w:w="80"/>
+              <w:bottom w:type="dxa" w:w="40"/>
+              <w:right w:type="dxa" w:w="80"/>
+            </w:tcMar>
+            <w:vAlign w:val="center"/>
+          </w:tcPr>
+          <w:p>
+            <w:pPr>
+              <w:spacing w:after="0"/>
+              <w:jc w:val="center"/>
+            </w:pPr>
+            <w:r>
+              <w:rPr>
+                <w:b w:val="false"/>
+                <w:bCs w:val="false"/>
+                <w:sz w:val="15"/>
+                <w:szCs w:val="15"/>
+              </w:rPr>
+              <w:t xml:space="preserve">75–88</w:t>
             </w:r>
           </w:p>
         </w:tc>
@@ -4961,7 +4740,7 @@
         </w:trPr>
         <w:tc>
           <w:tcPr>
-            <w:tcW w:type="dxa" w:w="1700"/>
+            <w:tcW w:type="dxa" w:w="1330"/>
             <w:tcMar>
               <w:top w:type="dxa" w:w="40"/>
               <w:left w:type="dxa" w:w="80"/>
@@ -4977,10 +4756,12 @@
             </w:pPr>
             <w:r>
               <w:rPr>
-                <w:sz w:val="15"/>
-                <w:szCs w:val="15"/>
-              </w:rPr>
-              <w:t xml:space="preserve">Rule, 21:33</w:t>
+                <w:b w:val="false"/>
+                <w:bCs w:val="false"/>
+                <w:sz w:val="15"/>
+                <w:szCs w:val="15"/>
+              </w:rPr>
+              <w:t xml:space="preserve">Learning, 02:25</w:t>
             </w:r>
           </w:p>
         </w:tc>
@@ -5002,10 +4783,12 @@
             </w:pPr>
             <w:r>
               <w:rPr>
-                <w:sz w:val="15"/>
-                <w:szCs w:val="15"/>
-              </w:rPr>
-              <w:t xml:space="preserve">90.9 %</w:t>
+                <w:b w:val="false"/>
+                <w:bCs w:val="false"/>
+                <w:sz w:val="15"/>
+                <w:szCs w:val="15"/>
+              </w:rPr>
+              <w:t xml:space="preserve">100.0 %</w:t>
             </w:r>
           </w:p>
         </w:tc>
@@ -5027,10 +4810,12 @@
             </w:pPr>
             <w:r>
               <w:rPr>
-                <w:sz w:val="15"/>
-                <w:szCs w:val="15"/>
-              </w:rPr>
-              <w:t xml:space="preserve">9.1 %</w:t>
+                <w:b w:val="false"/>
+                <w:bCs w:val="false"/>
+                <w:sz w:val="15"/>
+                <w:szCs w:val="15"/>
+              </w:rPr>
+              <w:t xml:space="preserve">0.0 %</w:t>
             </w:r>
           </w:p>
         </w:tc>
@@ -5052,10 +4837,12 @@
             </w:pPr>
             <w:r>
               <w:rPr>
-                <w:sz w:val="15"/>
-                <w:szCs w:val="15"/>
-              </w:rPr>
-              <w:t xml:space="preserve">16.3</w:t>
+                <w:b w:val="false"/>
+                <w:bCs w:val="false"/>
+                <w:sz w:val="15"/>
+                <w:szCs w:val="15"/>
+              </w:rPr>
+              <w:t xml:space="preserve">0.0</w:t>
             </w:r>
           </w:p>
         </w:tc>
@@ -5077,10 +4864,39 @@
             </w:pPr>
             <w:r>
               <w:rPr>
-                <w:sz w:val="15"/>
-                <w:szCs w:val="15"/>
-              </w:rPr>
-              <w:t xml:space="preserve">4</w:t>
+                <w:b w:val="false"/>
+                <w:bCs w:val="false"/>
+                <w:sz w:val="15"/>
+                <w:szCs w:val="15"/>
+              </w:rPr>
+              <w:t xml:space="preserve">0</w:t>
+            </w:r>
+          </w:p>
+        </w:tc>
+        <w:tc>
+          <w:tcPr>
+            <w:tcW w:type="dxa" w:w="536"/>
+            <w:tcMar>
+              <w:top w:type="dxa" w:w="40"/>
+              <w:left w:type="dxa" w:w="80"/>
+              <w:bottom w:type="dxa" w:w="40"/>
+              <w:right w:type="dxa" w:w="80"/>
+            </w:tcMar>
+            <w:vAlign w:val="center"/>
+          </w:tcPr>
+          <w:p>
+            <w:pPr>
+              <w:spacing w:after="0"/>
+              <w:jc w:val="center"/>
+            </w:pPr>
+            <w:r>
+              <w:rPr>
+                <w:b w:val="false"/>
+                <w:bCs w:val="false"/>
+                <w:sz w:val="15"/>
+                <w:szCs w:val="15"/>
+              </w:rPr>
+              <w:t xml:space="preserve">79–88</w:t>
             </w:r>
           </w:p>
         </w:tc>
@@ -5092,7 +4908,7 @@
         </w:trPr>
         <w:tc>
           <w:tcPr>
-            <w:tcW w:type="dxa" w:w="1700"/>
+            <w:tcW w:type="dxa" w:w="1330"/>
             <w:tcMar>
               <w:top w:type="dxa" w:w="40"/>
               <w:left w:type="dxa" w:w="80"/>
@@ -5108,10 +4924,12 @@
             </w:pPr>
             <w:r>
               <w:rPr>
-                <w:sz w:val="15"/>
-                <w:szCs w:val="15"/>
-              </w:rPr>
-              <w:t xml:space="preserve">Learning, 22:03, dead mister 22:09–22:21</w:t>
+                <w:b/>
+                <w:bCs/>
+                <w:sz w:val="15"/>
+                <w:szCs w:val="15"/>
+              </w:rPr>
+              <w:t xml:space="preserve">Rule, 60 min</w:t>
             </w:r>
           </w:p>
         </w:tc>
@@ -5133,10 +4951,12 @@
             </w:pPr>
             <w:r>
               <w:rPr>
-                <w:sz w:val="15"/>
-                <w:szCs w:val="15"/>
-              </w:rPr>
-              <w:t xml:space="preserve">78.9 %</w:t>
+                <w:b/>
+                <w:bCs/>
+                <w:sz w:val="15"/>
+                <w:szCs w:val="15"/>
+              </w:rPr>
+              <w:t xml:space="preserve">99.4 %</w:t>
             </w:r>
           </w:p>
         </w:tc>
@@ -5158,10 +4978,12 @@
             </w:pPr>
             <w:r>
               <w:rPr>
-                <w:sz w:val="15"/>
-                <w:szCs w:val="15"/>
-              </w:rPr>
-              <w:t xml:space="preserve">21.1 %</w:t>
+                <w:b/>
+                <w:bCs/>
+                <w:sz w:val="15"/>
+                <w:szCs w:val="15"/>
+              </w:rPr>
+              <w:t xml:space="preserve">0.6 %</w:t>
             </w:r>
           </w:p>
         </w:tc>
@@ -5183,10 +5005,12 @@
             </w:pPr>
             <w:r>
               <w:rPr>
-                <w:sz w:val="15"/>
-                <w:szCs w:val="15"/>
-              </w:rPr>
-              <w:t xml:space="preserve">13.9</w:t>
+                <w:b/>
+                <w:bCs/>
+                <w:sz w:val="15"/>
+                <w:szCs w:val="15"/>
+              </w:rPr>
+              <w:t xml:space="preserve">14.6</w:t>
             </w:r>
           </w:p>
         </w:tc>
@@ -5208,10 +5032,207 @@
             </w:pPr>
             <w:r>
               <w:rPr>
-                <w:sz w:val="15"/>
-                <w:szCs w:val="15"/>
-              </w:rPr>
-              <w:t xml:space="preserve">5</w:t>
+                <w:b/>
+                <w:bCs/>
+                <w:sz w:val="15"/>
+                <w:szCs w:val="15"/>
+              </w:rPr>
+              <w:t xml:space="preserve">4</w:t>
+            </w:r>
+          </w:p>
+        </w:tc>
+        <w:tc>
+          <w:tcPr>
+            <w:tcW w:type="dxa" w:w="536"/>
+            <w:tcMar>
+              <w:top w:type="dxa" w:w="40"/>
+              <w:left w:type="dxa" w:w="80"/>
+              <w:bottom w:type="dxa" w:w="40"/>
+              <w:right w:type="dxa" w:w="80"/>
+            </w:tcMar>
+            <w:vAlign w:val="center"/>
+          </w:tcPr>
+          <w:p>
+            <w:pPr>
+              <w:spacing w:after="0"/>
+              <w:jc w:val="center"/>
+            </w:pPr>
+            <w:r>
+              <w:rPr>
+                <w:b/>
+                <w:bCs/>
+                <w:sz w:val="15"/>
+                <w:szCs w:val="15"/>
+              </w:rPr>
+              <w:t xml:space="preserve"/>
+            </w:r>
+          </w:p>
+        </w:tc>
+      </w:tr>
+      <w:tr>
+        <w:trPr>
+          <w:cantSplit/>
+          <w:tblHeader w:val="false"/>
+        </w:trPr>
+        <w:tc>
+          <w:tcPr>
+            <w:tcW w:type="dxa" w:w="1330"/>
+            <w:tcMar>
+              <w:top w:type="dxa" w:w="40"/>
+              <w:left w:type="dxa" w:w="80"/>
+              <w:bottom w:type="dxa" w:w="40"/>
+              <w:right w:type="dxa" w:w="80"/>
+            </w:tcMar>
+            <w:vAlign w:val="center"/>
+          </w:tcPr>
+          <w:p>
+            <w:pPr>
+              <w:spacing w:after="0"/>
+              <w:jc w:val="left"/>
+            </w:pPr>
+            <w:r>
+              <w:rPr>
+                <w:b/>
+                <w:bCs/>
+                <w:sz w:val="15"/>
+                <w:szCs w:val="15"/>
+              </w:rPr>
+              <w:t xml:space="preserve">Learning, 60 min</w:t>
+            </w:r>
+          </w:p>
+        </w:tc>
+        <w:tc>
+          <w:tcPr>
+            <w:tcW w:type="dxa" w:w="760"/>
+            <w:tcMar>
+              <w:top w:type="dxa" w:w="40"/>
+              <w:left w:type="dxa" w:w="80"/>
+              <w:bottom w:type="dxa" w:w="40"/>
+              <w:right w:type="dxa" w:w="80"/>
+            </w:tcMar>
+            <w:vAlign w:val="center"/>
+          </w:tcPr>
+          <w:p>
+            <w:pPr>
+              <w:spacing w:after="0"/>
+              <w:jc w:val="center"/>
+            </w:pPr>
+            <w:r>
+              <w:rPr>
+                <w:b/>
+                <w:bCs/>
+                <w:sz w:val="15"/>
+                <w:szCs w:val="15"/>
+              </w:rPr>
+              <w:t xml:space="preserve">100.0 %</w:t>
+            </w:r>
+          </w:p>
+        </w:tc>
+        <w:tc>
+          <w:tcPr>
+            <w:tcW w:type="dxa" w:w="760"/>
+            <w:tcMar>
+              <w:top w:type="dxa" w:w="40"/>
+              <w:left w:type="dxa" w:w="80"/>
+              <w:bottom w:type="dxa" w:w="40"/>
+              <w:right w:type="dxa" w:w="80"/>
+            </w:tcMar>
+            <w:vAlign w:val="center"/>
+          </w:tcPr>
+          <w:p>
+            <w:pPr>
+              <w:spacing w:after="0"/>
+              <w:jc w:val="center"/>
+            </w:pPr>
+            <w:r>
+              <w:rPr>
+                <w:b/>
+                <w:bCs/>
+                <w:sz w:val="15"/>
+                <w:szCs w:val="15"/>
+              </w:rPr>
+              <w:t xml:space="preserve">0.0 %</w:t>
+            </w:r>
+          </w:p>
+        </w:tc>
+        <w:tc>
+          <w:tcPr>
+            <w:tcW w:type="dxa" w:w="780"/>
+            <w:tcMar>
+              <w:top w:type="dxa" w:w="40"/>
+              <w:left w:type="dxa" w:w="80"/>
+              <w:bottom w:type="dxa" w:w="40"/>
+              <w:right w:type="dxa" w:w="80"/>
+            </w:tcMar>
+            <w:vAlign w:val="center"/>
+          </w:tcPr>
+          <w:p>
+            <w:pPr>
+              <w:spacing w:after="0"/>
+              <w:jc w:val="center"/>
+            </w:pPr>
+            <w:r>
+              <w:rPr>
+                <w:b/>
+                <w:bCs/>
+                <w:sz w:val="15"/>
+                <w:szCs w:val="15"/>
+              </w:rPr>
+              <w:t xml:space="preserve">0.0</w:t>
+            </w:r>
+          </w:p>
+        </w:tc>
+        <w:tc>
+          <w:tcPr>
+            <w:tcW w:type="dxa" w:w="700"/>
+            <w:tcMar>
+              <w:top w:type="dxa" w:w="40"/>
+              <w:left w:type="dxa" w:w="80"/>
+              <w:bottom w:type="dxa" w:w="40"/>
+              <w:right w:type="dxa" w:w="80"/>
+            </w:tcMar>
+            <w:vAlign w:val="center"/>
+          </w:tcPr>
+          <w:p>
+            <w:pPr>
+              <w:spacing w:after="0"/>
+              <w:jc w:val="center"/>
+            </w:pPr>
+            <w:r>
+              <w:rPr>
+                <w:b/>
+                <w:bCs/>
+                <w:sz w:val="15"/>
+                <w:szCs w:val="15"/>
+              </w:rPr>
+              <w:t xml:space="preserve">0</w:t>
+            </w:r>
+          </w:p>
+        </w:tc>
+        <w:tc>
+          <w:tcPr>
+            <w:tcW w:type="dxa" w:w="536"/>
+            <w:tcMar>
+              <w:top w:type="dxa" w:w="40"/>
+              <w:left w:type="dxa" w:w="80"/>
+              <w:bottom w:type="dxa" w:w="40"/>
+              <w:right w:type="dxa" w:w="80"/>
+            </w:tcMar>
+            <w:vAlign w:val="center"/>
+          </w:tcPr>
+          <w:p>
+            <w:pPr>
+              <w:spacing w:after="0"/>
+              <w:jc w:val="center"/>
+            </w:pPr>
+            <w:r>
+              <w:rPr>
+                <w:b/>
+                <w:bCs/>
+                <w:sz w:val="15"/>
+                <w:szCs w:val="15"/>
+              </w:rPr>
+              <w:t xml:space="preserve"/>
             </w:r>
           </w:p>
         </w:tc>
@@ -5274,7 +5295,917 @@
           <w:sz w:val="16"/>
           <w:szCs w:val="16"/>
         </w:rPr>
-        <w:t xml:space="preserve">Fig. 4. Alternating session, evening, dry enclosure: both controllers mist most of the time; the dotted lines mark the software dead-mister window in the last block.</w:t>
+        <w:t xml:space="preserve">Fig. 4. Alternating session, night: the rule mists to its 300 s cap whenever the enclosure reaches 75 %; the learning controller, judging the enclosure's own equilibrium sufficient, never mists.</w:t>
+      </w:r>
+    </w:p>
+    <w:p>
+      <w:pPr>
+        <w:spacing w:after="0" w:line="240"/>
+        <w:ind w:firstLine="200"/>
+        <w:jc w:val="both"/>
+      </w:pPr>
+      <w:r>
+        <w:rPr>
+          <w:sz w:val="20"/>
+          <w:szCs w:val="20"/>
+        </w:rPr>
+        <w:t xml:space="preserve">The following evening the room had dried to 69 percent and the enclosure to 69 percent, and the picture reversed: the enclosure's passive equilibrium was now about 74 percent, just below the band, and one mist maker could raise the control reading only to about 82 percent, short of the controller's 88 percent target. Both controllers therefore misted most of the time (Table VI, Fig. 5). Taking the blocks as pairs on the same enclosure, the learning controller held the band 74.3 percent of the time against the rule's 65.6 percent starting from the dry enclosure, and 99.4 against 90.9 percent starting from an enclosure the previous block had left in band. It did so by holding the band from below with full-length bursts separated by 60 s rests, where the rule's fixed 180 s rest let the enclosure fall below 75 percent in every cycle; the cost was about 40 percent more mist time, 24 min against 16 to 18 min per half hour. The slow model's leak weight moved from the seeded minus 0.036 to minus 0.23, minus 0.16 and minus 0.13 per step over the three learning blocks. All 9,000 samples of the evening were valid, and no chip restart occurred.</w:t>
+      </w:r>
+    </w:p>
+    <w:p>
+      <w:pPr>
+        <w:keepNext/>
+        <w:spacing w:after="60" w:before="120"/>
+        <w:jc w:val="center"/>
+      </w:pPr>
+      <w:r>
+        <w:rPr>
+          <w:smallCaps/>
+          <w:sz w:val="16"/>
+          <w:szCs w:val="16"/>
+        </w:rPr>
+        <w:t xml:space="preserve">TABLE VI.  Alternating 30 min Blocks on a Dry Enclosure, Lid 4 cm (27 Sep 2026, evening)</w:t>
+      </w:r>
+    </w:p>
+    <w:tbl>
+      <w:tblPr>
+        <w:tblW w:type="dxa" w:w="4700"/>
+        <w:tblBorders>
+          <w:top w:val="single" w:color="auto" w:sz="4"/>
+          <w:left w:val="single" w:color="auto" w:sz="4"/>
+          <w:bottom w:val="single" w:color="auto" w:sz="4"/>
+          <w:right w:val="single" w:color="auto" w:sz="4"/>
+          <w:insideH w:val="single" w:color="auto" w:sz="4"/>
+          <w:insideV w:val="single" w:color="auto" w:sz="4"/>
+        </w:tblBorders>
+      </w:tblPr>
+      <w:tblGrid>
+        <w:gridCol w:w="1700"/>
+        <w:gridCol w:w="760"/>
+        <w:gridCol w:w="760"/>
+        <w:gridCol w:w="780"/>
+        <w:gridCol w:w="700"/>
+      </w:tblGrid>
+      <w:tr>
+        <w:trPr>
+          <w:cantSplit/>
+          <w:tblHeader/>
+        </w:trPr>
+        <w:tc>
+          <w:tcPr>
+            <w:tcW w:type="dxa" w:w="1700"/>
+            <w:shd w:fill="E7E6E6" w:color="auto" w:val="clear"/>
+            <w:tcMar>
+              <w:top w:type="dxa" w:w="40"/>
+              <w:left w:type="dxa" w:w="80"/>
+              <w:bottom w:type="dxa" w:w="40"/>
+              <w:right w:type="dxa" w:w="80"/>
+            </w:tcMar>
+            <w:vAlign w:val="center"/>
+          </w:tcPr>
+          <w:p>
+            <w:pPr>
+              <w:spacing w:after="0"/>
+              <w:jc w:val="left"/>
+            </w:pPr>
+            <w:r>
+              <w:rPr>
+                <w:b/>
+                <w:bCs/>
+                <w:sz w:val="15"/>
+                <w:szCs w:val="15"/>
+              </w:rPr>
+              <w:t xml:space="preserve">Block</w:t>
+            </w:r>
+          </w:p>
+        </w:tc>
+        <w:tc>
+          <w:tcPr>
+            <w:tcW w:type="dxa" w:w="760"/>
+            <w:shd w:fill="E7E6E6" w:color="auto" w:val="clear"/>
+            <w:tcMar>
+              <w:top w:type="dxa" w:w="40"/>
+              <w:left w:type="dxa" w:w="80"/>
+              <w:bottom w:type="dxa" w:w="40"/>
+              <w:right w:type="dxa" w:w="80"/>
+            </w:tcMar>
+            <w:vAlign w:val="center"/>
+          </w:tcPr>
+          <w:p>
+            <w:pPr>
+              <w:spacing w:after="0"/>
+              <w:jc w:val="center"/>
+            </w:pPr>
+            <w:r>
+              <w:rPr>
+                <w:b/>
+                <w:bCs/>
+                <w:sz w:val="15"/>
+                <w:szCs w:val="15"/>
+              </w:rPr>
+              <w:t xml:space="preserve">In 75–90 %</w:t>
+            </w:r>
+          </w:p>
+        </w:tc>
+        <w:tc>
+          <w:tcPr>
+            <w:tcW w:type="dxa" w:w="760"/>
+            <w:shd w:fill="E7E6E6" w:color="auto" w:val="clear"/>
+            <w:tcMar>
+              <w:top w:type="dxa" w:w="40"/>
+              <w:left w:type="dxa" w:w="80"/>
+              <w:bottom w:type="dxa" w:w="40"/>
+              <w:right w:type="dxa" w:w="80"/>
+            </w:tcMar>
+            <w:vAlign w:val="center"/>
+          </w:tcPr>
+          <w:p>
+            <w:pPr>
+              <w:spacing w:after="0"/>
+              <w:jc w:val="center"/>
+            </w:pPr>
+            <w:r>
+              <w:rPr>
+                <w:b/>
+                <w:bCs/>
+                <w:sz w:val="15"/>
+                <w:szCs w:val="15"/>
+              </w:rPr>
+              <w:t xml:space="preserve">Below 75 %</w:t>
+            </w:r>
+          </w:p>
+        </w:tc>
+        <w:tc>
+          <w:tcPr>
+            <w:tcW w:type="dxa" w:w="780"/>
+            <w:shd w:fill="E7E6E6" w:color="auto" w:val="clear"/>
+            <w:tcMar>
+              <w:top w:type="dxa" w:w="40"/>
+              <w:left w:type="dxa" w:w="80"/>
+              <w:bottom w:type="dxa" w:w="40"/>
+              <w:right w:type="dxa" w:w="80"/>
+            </w:tcMar>
+            <w:vAlign w:val="center"/>
+          </w:tcPr>
+          <w:p>
+            <w:pPr>
+              <w:spacing w:after="0"/>
+              <w:jc w:val="center"/>
+            </w:pPr>
+            <w:r>
+              <w:rPr>
+                <w:b/>
+                <w:bCs/>
+                <w:sz w:val="15"/>
+                <w:szCs w:val="15"/>
+              </w:rPr>
+              <w:t xml:space="preserve">Mist min</w:t>
+            </w:r>
+          </w:p>
+        </w:tc>
+        <w:tc>
+          <w:tcPr>
+            <w:tcW w:type="dxa" w:w="700"/>
+            <w:shd w:fill="E7E6E6" w:color="auto" w:val="clear"/>
+            <w:tcMar>
+              <w:top w:type="dxa" w:w="40"/>
+              <w:left w:type="dxa" w:w="80"/>
+              <w:bottom w:type="dxa" w:w="40"/>
+              <w:right w:type="dxa" w:w="80"/>
+            </w:tcMar>
+            <w:vAlign w:val="center"/>
+          </w:tcPr>
+          <w:p>
+            <w:pPr>
+              <w:spacing w:after="0"/>
+              <w:jc w:val="center"/>
+            </w:pPr>
+            <w:r>
+              <w:rPr>
+                <w:b/>
+                <w:bCs/>
+                <w:sz w:val="15"/>
+                <w:szCs w:val="15"/>
+              </w:rPr>
+              <w:t xml:space="preserve">Bursts</w:t>
+            </w:r>
+          </w:p>
+        </w:tc>
+      </w:tr>
+      <w:tr>
+        <w:trPr>
+          <w:cantSplit/>
+          <w:tblHeader w:val="false"/>
+        </w:trPr>
+        <w:tc>
+          <w:tcPr>
+            <w:tcW w:type="dxa" w:w="1700"/>
+            <w:tcMar>
+              <w:top w:type="dxa" w:w="40"/>
+              <w:left w:type="dxa" w:w="80"/>
+              <w:bottom w:type="dxa" w:w="40"/>
+              <w:right w:type="dxa" w:w="80"/>
+            </w:tcMar>
+            <w:vAlign w:val="center"/>
+          </w:tcPr>
+          <w:p>
+            <w:pPr>
+              <w:spacing w:after="0"/>
+              <w:jc w:val="left"/>
+            </w:pPr>
+            <w:r>
+              <w:rPr>
+                <w:sz w:val="15"/>
+                <w:szCs w:val="15"/>
+              </w:rPr>
+              <w:t xml:space="preserve">Learning, 20:03 (dry start)</w:t>
+            </w:r>
+          </w:p>
+        </w:tc>
+        <w:tc>
+          <w:tcPr>
+            <w:tcW w:type="dxa" w:w="760"/>
+            <w:tcMar>
+              <w:top w:type="dxa" w:w="40"/>
+              <w:left w:type="dxa" w:w="80"/>
+              <w:bottom w:type="dxa" w:w="40"/>
+              <w:right w:type="dxa" w:w="80"/>
+            </w:tcMar>
+            <w:vAlign w:val="center"/>
+          </w:tcPr>
+          <w:p>
+            <w:pPr>
+              <w:spacing w:after="0"/>
+              <w:jc w:val="center"/>
+            </w:pPr>
+            <w:r>
+              <w:rPr>
+                <w:sz w:val="15"/>
+                <w:szCs w:val="15"/>
+              </w:rPr>
+              <w:t xml:space="preserve">74.3 %</w:t>
+            </w:r>
+          </w:p>
+        </w:tc>
+        <w:tc>
+          <w:tcPr>
+            <w:tcW w:type="dxa" w:w="760"/>
+            <w:tcMar>
+              <w:top w:type="dxa" w:w="40"/>
+              <w:left w:type="dxa" w:w="80"/>
+              <w:bottom w:type="dxa" w:w="40"/>
+              <w:right w:type="dxa" w:w="80"/>
+            </w:tcMar>
+            <w:vAlign w:val="center"/>
+          </w:tcPr>
+          <w:p>
+            <w:pPr>
+              <w:spacing w:after="0"/>
+              <w:jc w:val="center"/>
+            </w:pPr>
+            <w:r>
+              <w:rPr>
+                <w:sz w:val="15"/>
+                <w:szCs w:val="15"/>
+              </w:rPr>
+              <w:t xml:space="preserve">25.7 %</w:t>
+            </w:r>
+          </w:p>
+        </w:tc>
+        <w:tc>
+          <w:tcPr>
+            <w:tcW w:type="dxa" w:w="780"/>
+            <w:tcMar>
+              <w:top w:type="dxa" w:w="40"/>
+              <w:left w:type="dxa" w:w="80"/>
+              <w:bottom w:type="dxa" w:w="40"/>
+              <w:right w:type="dxa" w:w="80"/>
+            </w:tcMar>
+            <w:vAlign w:val="center"/>
+          </w:tcPr>
+          <w:p>
+            <w:pPr>
+              <w:spacing w:after="0"/>
+              <w:jc w:val="center"/>
+            </w:pPr>
+            <w:r>
+              <w:rPr>
+                <w:sz w:val="15"/>
+                <w:szCs w:val="15"/>
+              </w:rPr>
+              <w:t xml:space="preserve">24.1</w:t>
+            </w:r>
+          </w:p>
+        </w:tc>
+        <w:tc>
+          <w:tcPr>
+            <w:tcW w:type="dxa" w:w="700"/>
+            <w:tcMar>
+              <w:top w:type="dxa" w:w="40"/>
+              <w:left w:type="dxa" w:w="80"/>
+              <w:bottom w:type="dxa" w:w="40"/>
+              <w:right w:type="dxa" w:w="80"/>
+            </w:tcMar>
+            <w:vAlign w:val="center"/>
+          </w:tcPr>
+          <w:p>
+            <w:pPr>
+              <w:spacing w:after="0"/>
+              <w:jc w:val="center"/>
+            </w:pPr>
+            <w:r>
+              <w:rPr>
+                <w:sz w:val="15"/>
+                <w:szCs w:val="15"/>
+              </w:rPr>
+              <w:t xml:space="preserve">6</w:t>
+            </w:r>
+          </w:p>
+        </w:tc>
+      </w:tr>
+      <w:tr>
+        <w:trPr>
+          <w:cantSplit/>
+          <w:tblHeader w:val="false"/>
+        </w:trPr>
+        <w:tc>
+          <w:tcPr>
+            <w:tcW w:type="dxa" w:w="1700"/>
+            <w:tcMar>
+              <w:top w:type="dxa" w:w="40"/>
+              <w:left w:type="dxa" w:w="80"/>
+              <w:bottom w:type="dxa" w:w="40"/>
+              <w:right w:type="dxa" w:w="80"/>
+            </w:tcMar>
+            <w:vAlign w:val="center"/>
+          </w:tcPr>
+          <w:p>
+            <w:pPr>
+              <w:spacing w:after="0"/>
+              <w:jc w:val="left"/>
+            </w:pPr>
+            <w:r>
+              <w:rPr>
+                <w:sz w:val="15"/>
+                <w:szCs w:val="15"/>
+              </w:rPr>
+              <w:t xml:space="preserve">Rule, 20:33</w:t>
+            </w:r>
+          </w:p>
+        </w:tc>
+        <w:tc>
+          <w:tcPr>
+            <w:tcW w:type="dxa" w:w="760"/>
+            <w:tcMar>
+              <w:top w:type="dxa" w:w="40"/>
+              <w:left w:type="dxa" w:w="80"/>
+              <w:bottom w:type="dxa" w:w="40"/>
+              <w:right w:type="dxa" w:w="80"/>
+            </w:tcMar>
+            <w:vAlign w:val="center"/>
+          </w:tcPr>
+          <w:p>
+            <w:pPr>
+              <w:spacing w:after="0"/>
+              <w:jc w:val="center"/>
+            </w:pPr>
+            <w:r>
+              <w:rPr>
+                <w:sz w:val="15"/>
+                <w:szCs w:val="15"/>
+              </w:rPr>
+              <w:t xml:space="preserve">65.6 %</w:t>
+            </w:r>
+          </w:p>
+        </w:tc>
+        <w:tc>
+          <w:tcPr>
+            <w:tcW w:type="dxa" w:w="760"/>
+            <w:tcMar>
+              <w:top w:type="dxa" w:w="40"/>
+              <w:left w:type="dxa" w:w="80"/>
+              <w:bottom w:type="dxa" w:w="40"/>
+              <w:right w:type="dxa" w:w="80"/>
+            </w:tcMar>
+            <w:vAlign w:val="center"/>
+          </w:tcPr>
+          <w:p>
+            <w:pPr>
+              <w:spacing w:after="0"/>
+              <w:jc w:val="center"/>
+            </w:pPr>
+            <w:r>
+              <w:rPr>
+                <w:sz w:val="15"/>
+                <w:szCs w:val="15"/>
+              </w:rPr>
+              <w:t xml:space="preserve">34.4 %</w:t>
+            </w:r>
+          </w:p>
+        </w:tc>
+        <w:tc>
+          <w:tcPr>
+            <w:tcW w:type="dxa" w:w="780"/>
+            <w:tcMar>
+              <w:top w:type="dxa" w:w="40"/>
+              <w:left w:type="dxa" w:w="80"/>
+              <w:bottom w:type="dxa" w:w="40"/>
+              <w:right w:type="dxa" w:w="80"/>
+            </w:tcMar>
+            <w:vAlign w:val="center"/>
+          </w:tcPr>
+          <w:p>
+            <w:pPr>
+              <w:spacing w:after="0"/>
+              <w:jc w:val="center"/>
+            </w:pPr>
+            <w:r>
+              <w:rPr>
+                <w:sz w:val="15"/>
+                <w:szCs w:val="15"/>
+              </w:rPr>
+              <w:t xml:space="preserve">18.2</w:t>
+            </w:r>
+          </w:p>
+        </w:tc>
+        <w:tc>
+          <w:tcPr>
+            <w:tcW w:type="dxa" w:w="700"/>
+            <w:tcMar>
+              <w:top w:type="dxa" w:w="40"/>
+              <w:left w:type="dxa" w:w="80"/>
+              <w:bottom w:type="dxa" w:w="40"/>
+              <w:right w:type="dxa" w:w="80"/>
+            </w:tcMar>
+            <w:vAlign w:val="center"/>
+          </w:tcPr>
+          <w:p>
+            <w:pPr>
+              <w:spacing w:after="0"/>
+              <w:jc w:val="center"/>
+            </w:pPr>
+            <w:r>
+              <w:rPr>
+                <w:sz w:val="15"/>
+                <w:szCs w:val="15"/>
+              </w:rPr>
+              <w:t xml:space="preserve">4</w:t>
+            </w:r>
+          </w:p>
+        </w:tc>
+      </w:tr>
+      <w:tr>
+        <w:trPr>
+          <w:cantSplit/>
+          <w:tblHeader w:val="false"/>
+        </w:trPr>
+        <w:tc>
+          <w:tcPr>
+            <w:tcW w:type="dxa" w:w="1700"/>
+            <w:tcMar>
+              <w:top w:type="dxa" w:w="40"/>
+              <w:left w:type="dxa" w:w="80"/>
+              <w:bottom w:type="dxa" w:w="40"/>
+              <w:right w:type="dxa" w:w="80"/>
+            </w:tcMar>
+            <w:vAlign w:val="center"/>
+          </w:tcPr>
+          <w:p>
+            <w:pPr>
+              <w:spacing w:after="0"/>
+              <w:jc w:val="left"/>
+            </w:pPr>
+            <w:r>
+              <w:rPr>
+                <w:sz w:val="15"/>
+                <w:szCs w:val="15"/>
+              </w:rPr>
+              <w:t xml:space="preserve">Learning, 21:03</w:t>
+            </w:r>
+          </w:p>
+        </w:tc>
+        <w:tc>
+          <w:tcPr>
+            <w:tcW w:type="dxa" w:w="760"/>
+            <w:tcMar>
+              <w:top w:type="dxa" w:w="40"/>
+              <w:left w:type="dxa" w:w="80"/>
+              <w:bottom w:type="dxa" w:w="40"/>
+              <w:right w:type="dxa" w:w="80"/>
+            </w:tcMar>
+            <w:vAlign w:val="center"/>
+          </w:tcPr>
+          <w:p>
+            <w:pPr>
+              <w:spacing w:after="0"/>
+              <w:jc w:val="center"/>
+            </w:pPr>
+            <w:r>
+              <w:rPr>
+                <w:sz w:val="15"/>
+                <w:szCs w:val="15"/>
+              </w:rPr>
+              <w:t xml:space="preserve">99.4 %</w:t>
+            </w:r>
+          </w:p>
+        </w:tc>
+        <w:tc>
+          <w:tcPr>
+            <w:tcW w:type="dxa" w:w="760"/>
+            <w:tcMar>
+              <w:top w:type="dxa" w:w="40"/>
+              <w:left w:type="dxa" w:w="80"/>
+              <w:bottom w:type="dxa" w:w="40"/>
+              <w:right w:type="dxa" w:w="80"/>
+            </w:tcMar>
+            <w:vAlign w:val="center"/>
+          </w:tcPr>
+          <w:p>
+            <w:pPr>
+              <w:spacing w:after="0"/>
+              <w:jc w:val="center"/>
+            </w:pPr>
+            <w:r>
+              <w:rPr>
+                <w:sz w:val="15"/>
+                <w:szCs w:val="15"/>
+              </w:rPr>
+              <w:t xml:space="preserve">0.6 %</w:t>
+            </w:r>
+          </w:p>
+        </w:tc>
+        <w:tc>
+          <w:tcPr>
+            <w:tcW w:type="dxa" w:w="780"/>
+            <w:tcMar>
+              <w:top w:type="dxa" w:w="40"/>
+              <w:left w:type="dxa" w:w="80"/>
+              <w:bottom w:type="dxa" w:w="40"/>
+              <w:right w:type="dxa" w:w="80"/>
+            </w:tcMar>
+            <w:vAlign w:val="center"/>
+          </w:tcPr>
+          <w:p>
+            <w:pPr>
+              <w:spacing w:after="0"/>
+              <w:jc w:val="center"/>
+            </w:pPr>
+            <w:r>
+              <w:rPr>
+                <w:sz w:val="15"/>
+                <w:szCs w:val="15"/>
+              </w:rPr>
+              <w:t xml:space="preserve">24.0</w:t>
+            </w:r>
+          </w:p>
+        </w:tc>
+        <w:tc>
+          <w:tcPr>
+            <w:tcW w:type="dxa" w:w="700"/>
+            <w:tcMar>
+              <w:top w:type="dxa" w:w="40"/>
+              <w:left w:type="dxa" w:w="80"/>
+              <w:bottom w:type="dxa" w:w="40"/>
+              <w:right w:type="dxa" w:w="80"/>
+            </w:tcMar>
+            <w:vAlign w:val="center"/>
+          </w:tcPr>
+          <w:p>
+            <w:pPr>
+              <w:spacing w:after="0"/>
+              <w:jc w:val="center"/>
+            </w:pPr>
+            <w:r>
+              <w:rPr>
+                <w:sz w:val="15"/>
+                <w:szCs w:val="15"/>
+              </w:rPr>
+              <w:t xml:space="preserve">6</w:t>
+            </w:r>
+          </w:p>
+        </w:tc>
+      </w:tr>
+      <w:tr>
+        <w:trPr>
+          <w:cantSplit/>
+          <w:tblHeader w:val="false"/>
+        </w:trPr>
+        <w:tc>
+          <w:tcPr>
+            <w:tcW w:type="dxa" w:w="1700"/>
+            <w:tcMar>
+              <w:top w:type="dxa" w:w="40"/>
+              <w:left w:type="dxa" w:w="80"/>
+              <w:bottom w:type="dxa" w:w="40"/>
+              <w:right w:type="dxa" w:w="80"/>
+            </w:tcMar>
+            <w:vAlign w:val="center"/>
+          </w:tcPr>
+          <w:p>
+            <w:pPr>
+              <w:spacing w:after="0"/>
+              <w:jc w:val="left"/>
+            </w:pPr>
+            <w:r>
+              <w:rPr>
+                <w:sz w:val="15"/>
+                <w:szCs w:val="15"/>
+              </w:rPr>
+              <w:t xml:space="preserve">Rule, 21:33</w:t>
+            </w:r>
+          </w:p>
+        </w:tc>
+        <w:tc>
+          <w:tcPr>
+            <w:tcW w:type="dxa" w:w="760"/>
+            <w:tcMar>
+              <w:top w:type="dxa" w:w="40"/>
+              <w:left w:type="dxa" w:w="80"/>
+              <w:bottom w:type="dxa" w:w="40"/>
+              <w:right w:type="dxa" w:w="80"/>
+            </w:tcMar>
+            <w:vAlign w:val="center"/>
+          </w:tcPr>
+          <w:p>
+            <w:pPr>
+              <w:spacing w:after="0"/>
+              <w:jc w:val="center"/>
+            </w:pPr>
+            <w:r>
+              <w:rPr>
+                <w:sz w:val="15"/>
+                <w:szCs w:val="15"/>
+              </w:rPr>
+              <w:t xml:space="preserve">90.9 %</w:t>
+            </w:r>
+          </w:p>
+        </w:tc>
+        <w:tc>
+          <w:tcPr>
+            <w:tcW w:type="dxa" w:w="760"/>
+            <w:tcMar>
+              <w:top w:type="dxa" w:w="40"/>
+              <w:left w:type="dxa" w:w="80"/>
+              <w:bottom w:type="dxa" w:w="40"/>
+              <w:right w:type="dxa" w:w="80"/>
+            </w:tcMar>
+            <w:vAlign w:val="center"/>
+          </w:tcPr>
+          <w:p>
+            <w:pPr>
+              <w:spacing w:after="0"/>
+              <w:jc w:val="center"/>
+            </w:pPr>
+            <w:r>
+              <w:rPr>
+                <w:sz w:val="15"/>
+                <w:szCs w:val="15"/>
+              </w:rPr>
+              <w:t xml:space="preserve">9.1 %</w:t>
+            </w:r>
+          </w:p>
+        </w:tc>
+        <w:tc>
+          <w:tcPr>
+            <w:tcW w:type="dxa" w:w="780"/>
+            <w:tcMar>
+              <w:top w:type="dxa" w:w="40"/>
+              <w:left w:type="dxa" w:w="80"/>
+              <w:bottom w:type="dxa" w:w="40"/>
+              <w:right w:type="dxa" w:w="80"/>
+            </w:tcMar>
+            <w:vAlign w:val="center"/>
+          </w:tcPr>
+          <w:p>
+            <w:pPr>
+              <w:spacing w:after="0"/>
+              <w:jc w:val="center"/>
+            </w:pPr>
+            <w:r>
+              <w:rPr>
+                <w:sz w:val="15"/>
+                <w:szCs w:val="15"/>
+              </w:rPr>
+              <w:t xml:space="preserve">16.3</w:t>
+            </w:r>
+          </w:p>
+        </w:tc>
+        <w:tc>
+          <w:tcPr>
+            <w:tcW w:type="dxa" w:w="700"/>
+            <w:tcMar>
+              <w:top w:type="dxa" w:w="40"/>
+              <w:left w:type="dxa" w:w="80"/>
+              <w:bottom w:type="dxa" w:w="40"/>
+              <w:right w:type="dxa" w:w="80"/>
+            </w:tcMar>
+            <w:vAlign w:val="center"/>
+          </w:tcPr>
+          <w:p>
+            <w:pPr>
+              <w:spacing w:after="0"/>
+              <w:jc w:val="center"/>
+            </w:pPr>
+            <w:r>
+              <w:rPr>
+                <w:sz w:val="15"/>
+                <w:szCs w:val="15"/>
+              </w:rPr>
+              <w:t xml:space="preserve">4</w:t>
+            </w:r>
+          </w:p>
+        </w:tc>
+      </w:tr>
+      <w:tr>
+        <w:trPr>
+          <w:cantSplit/>
+          <w:tblHeader w:val="false"/>
+        </w:trPr>
+        <w:tc>
+          <w:tcPr>
+            <w:tcW w:type="dxa" w:w="1700"/>
+            <w:tcMar>
+              <w:top w:type="dxa" w:w="40"/>
+              <w:left w:type="dxa" w:w="80"/>
+              <w:bottom w:type="dxa" w:w="40"/>
+              <w:right w:type="dxa" w:w="80"/>
+            </w:tcMar>
+            <w:vAlign w:val="center"/>
+          </w:tcPr>
+          <w:p>
+            <w:pPr>
+              <w:spacing w:after="0"/>
+              <w:jc w:val="left"/>
+            </w:pPr>
+            <w:r>
+              <w:rPr>
+                <w:sz w:val="15"/>
+                <w:szCs w:val="15"/>
+              </w:rPr>
+              <w:t xml:space="preserve">Learning, 22:03, dead mister 22:09–22:21</w:t>
+            </w:r>
+          </w:p>
+        </w:tc>
+        <w:tc>
+          <w:tcPr>
+            <w:tcW w:type="dxa" w:w="760"/>
+            <w:tcMar>
+              <w:top w:type="dxa" w:w="40"/>
+              <w:left w:type="dxa" w:w="80"/>
+              <w:bottom w:type="dxa" w:w="40"/>
+              <w:right w:type="dxa" w:w="80"/>
+            </w:tcMar>
+            <w:vAlign w:val="center"/>
+          </w:tcPr>
+          <w:p>
+            <w:pPr>
+              <w:spacing w:after="0"/>
+              <w:jc w:val="center"/>
+            </w:pPr>
+            <w:r>
+              <w:rPr>
+                <w:sz w:val="15"/>
+                <w:szCs w:val="15"/>
+              </w:rPr>
+              <w:t xml:space="preserve">78.9 %</w:t>
+            </w:r>
+          </w:p>
+        </w:tc>
+        <w:tc>
+          <w:tcPr>
+            <w:tcW w:type="dxa" w:w="760"/>
+            <w:tcMar>
+              <w:top w:type="dxa" w:w="40"/>
+              <w:left w:type="dxa" w:w="80"/>
+              <w:bottom w:type="dxa" w:w="40"/>
+              <w:right w:type="dxa" w:w="80"/>
+            </w:tcMar>
+            <w:vAlign w:val="center"/>
+          </w:tcPr>
+          <w:p>
+            <w:pPr>
+              <w:spacing w:after="0"/>
+              <w:jc w:val="center"/>
+            </w:pPr>
+            <w:r>
+              <w:rPr>
+                <w:sz w:val="15"/>
+                <w:szCs w:val="15"/>
+              </w:rPr>
+              <w:t xml:space="preserve">21.1 %</w:t>
+            </w:r>
+          </w:p>
+        </w:tc>
+        <w:tc>
+          <w:tcPr>
+            <w:tcW w:type="dxa" w:w="780"/>
+            <w:tcMar>
+              <w:top w:type="dxa" w:w="40"/>
+              <w:left w:type="dxa" w:w="80"/>
+              <w:bottom w:type="dxa" w:w="40"/>
+              <w:right w:type="dxa" w:w="80"/>
+            </w:tcMar>
+            <w:vAlign w:val="center"/>
+          </w:tcPr>
+          <w:p>
+            <w:pPr>
+              <w:spacing w:after="0"/>
+              <w:jc w:val="center"/>
+            </w:pPr>
+            <w:r>
+              <w:rPr>
+                <w:sz w:val="15"/>
+                <w:szCs w:val="15"/>
+              </w:rPr>
+              <w:t xml:space="preserve">13.9</w:t>
+            </w:r>
+          </w:p>
+        </w:tc>
+        <w:tc>
+          <w:tcPr>
+            <w:tcW w:type="dxa" w:w="700"/>
+            <w:tcMar>
+              <w:top w:type="dxa" w:w="40"/>
+              <w:left w:type="dxa" w:w="80"/>
+              <w:bottom w:type="dxa" w:w="40"/>
+              <w:right w:type="dxa" w:w="80"/>
+            </w:tcMar>
+            <w:vAlign w:val="center"/>
+          </w:tcPr>
+          <w:p>
+            <w:pPr>
+              <w:spacing w:after="0"/>
+              <w:jc w:val="center"/>
+            </w:pPr>
+            <w:r>
+              <w:rPr>
+                <w:sz w:val="15"/>
+                <w:szCs w:val="15"/>
+              </w:rPr>
+              <w:t xml:space="preserve">5</w:t>
+            </w:r>
+          </w:p>
+        </w:tc>
+      </w:tr>
+    </w:tbl>
+    <w:p>
+      <w:pPr>
+        <w:keepNext/>
+        <w:spacing w:after="60" w:before="120"/>
+        <w:jc w:val="center"/>
+      </w:pPr>
+      <w:r>
+        <w:drawing>
+          <wp:inline distT="0" distB="0" distL="0" distR="0">
+            <wp:extent cx="3086100" cy="1800225"/>
+            <wp:effectExtent t="0" r="0" b="0" l="0"/>
+            <wp:docPr id="1" name="" descr="" title=""/>
+            <wp:cNvGraphicFramePr>
+              <a:graphicFrameLocks xmlns:a="http://schemas.openxmlformats.org/drawingml/2006/main" noChangeAspect="1"/>
+            </wp:cNvGraphicFramePr>
+            <a:graphic xmlns:a="http://schemas.openxmlformats.org/drawingml/2006/main">
+              <a:graphicData uri="http://schemas.openxmlformats.org/drawingml/2006/picture">
+                <pic:pic xmlns:pic="http://schemas.openxmlformats.org/drawingml/2006/picture">
+                  <pic:nvPicPr>
+                    <pic:cNvPr id="0" name="" descr=""/>
+                    <pic:cNvPicPr>
+                      <a:picLocks noChangeAspect="1" noChangeArrowheads="1"/>
+                    </pic:cNvPicPr>
+                  </pic:nvPicPr>
+                  <pic:blipFill>
+                    <a:blip r:embed="rId13" cstate="none"/>
+                    <a:srcRect/>
+                    <a:stretch>
+                      <a:fillRect/>
+                    </a:stretch>
+                  </pic:blipFill>
+                  <pic:spPr bwMode="auto">
+                    <a:xfrm>
+                      <a:off x="0" y="0"/>
+                      <a:ext cx="3086100" cy="1800225"/>
+                    </a:xfrm>
+                    <a:prstGeom prst="rect">
+                      <a:avLst/>
+                    </a:prstGeom>
+                  </pic:spPr>
+                </pic:pic>
+              </a:graphicData>
+            </a:graphic>
+          </wp:inline>
+        </w:drawing>
+      </w:r>
+    </w:p>
+    <w:p>
+      <w:pPr>
+        <w:spacing w:after="160"/>
+        <w:jc w:val="center"/>
+      </w:pPr>
+      <w:r>
+        <w:rPr>
+          <w:sz w:val="16"/>
+          <w:szCs w:val="16"/>
+        </w:rPr>
+        <w:t xml:space="preserve">Fig. 5. Alternating session, evening, dry enclosure: both controllers mist most of the time; the dotted lines mark the software dead-mister window in the last block.</w:t>
       </w:r>
     </w:p>
     <w:p>
@@ -5465,7 +6396,7 @@
           <w:sz w:val="16"/>
           <w:szCs w:val="16"/>
         </w:rPr>
-        <w:t xml:space="preserve">[1]	M. Codeluppi, L. Davoli, and G. Ferrari, “Forecasting air temperature on edge devices with embedded AI,” Sensors, vol. 21, no. 12, Art. no. 3973, 2021.</w:t>
+        <w:t xml:space="preserve">[1]	G. Codeluppi, L. Davoli, and G. Ferrari, “Forecasting air temperature on edge devices with embedded AI,” Sensors, vol. 21, no. 12, Art. no. 3973, 2021, doi: 10.3390/s21123973.</w:t>
       </w:r>
     </w:p>
     <w:p>
@@ -5482,7 +6413,7 @@
           <w:sz w:val="16"/>
           <w:szCs w:val="16"/>
         </w:rPr>
-        <w:t xml:space="preserve">[2]	I. Ihoume, R. Tadili, N. Arbaoui, M. Benchrifa, A. Idrissi, and M. Daoudi, “Developing a multi-label tinyML machine learning model for an active and optimized greenhouse microclimate control from multivariate sensed data,” Artif. Intell. Agric., vol. 6, pp. 129–137, 2022.</w:t>
+        <w:t xml:space="preserve">[2]	I. Ihoume, R. Tadili, N. Arbaoui, M. Benchrifa, A. Idrissi, and M. Daoudi, “Developing a multi-label tinyML machine learning model for an active and optimized greenhouse microclimate control from multivariate sensed data,” Artif. Intell. Agric., vol. 6, pp. 129–137, 2022, doi: 10.1016/j.aiia.2022.08.003.</w:t>
       </w:r>
     </w:p>
     <w:p>
@@ -5499,7 +6430,7 @@
           <w:sz w:val="16"/>
           <w:szCs w:val="16"/>
         </w:rPr>
-        <w:t xml:space="preserve">[3]	K. A. D. Sukowati et al., “K-NN based TinyML on ESP32 for mushroom cultivation climate control,” J. Nas. Tek. Elektro Teknol. Inf. (JNTETI), vol. 15, no. 3, 2026, doi: 10.22146/jnteti.v15i3.25532.</w:t>
+        <w:t xml:space="preserve">[3]	A. I. Sukowati, N. Marliza, and D. Saptono, “Edge AI–based threshold-free control for mushroom farming using K-NN on ESP32,” J. Nas. Tek. Elektro Teknol. Inf., vol. 15, no. 3, pp. 239–248, 2026, doi: 10.22146/jnteti.v15i3.25532.</w:t>
       </w:r>
     </w:p>
     <w:p>
@@ -5516,7 +6447,7 @@
           <w:sz w:val="16"/>
           <w:szCs w:val="16"/>
         </w:rPr>
-        <w:t xml:space="preserve">[4]	H. Ren, D. Anicic, and T. A. Runkler, “TinyOL: TinyML with online-learning on microcontrollers,” in Proc. Int. Joint Conf. Neural Netw. (IJCNN), 2021.</w:t>
+        <w:t xml:space="preserve">[4]	H. Ren, D. Anicic, and T. A. Runkler, “TinyOL: TinyML with online-learning on microcontrollers,” in Proc. Int. Joint Conf. Neural Netw. (IJCNN), 2021, pp. 1–8, doi: 10.1109/IJCNN52387.2021.9533927.</w:t>
       </w:r>
     </w:p>
     <w:p>
@@ -5533,7 +6464,7 @@
           <w:sz w:val="16"/>
           <w:szCs w:val="16"/>
         </w:rPr>
-        <w:t xml:space="preserve">[5]	S. Disabato and M. Roveri, “Tiny machine learning for concept drift,” IEEE Trans. Neural Netw. Learn. Syst., 2022, doi: 10.1109/TNNLS.2022.3229897.</w:t>
+        <w:t xml:space="preserve">[5]	S. Disabato and M. Roveri, “Tiny machine learning for concept drift,” IEEE Trans. Neural Netw. Learn. Syst., vol. 35, no. 6, pp. 8470–8481, 2024, doi: 10.1109/TNNLS.2022.3229897.</w:t>
       </w:r>
     </w:p>
     <w:p>
@@ -5550,7 +6481,7 @@
           <w:sz w:val="16"/>
           <w:szCs w:val="16"/>
         </w:rPr>
-        <w:t xml:space="preserve">[6]	M. Pavan, E. Ostrovan, A. Caltabiano, and M. Roveri, “TyBox: An automatic design and code generation toolbox for TinyML incremental on-device learning,” ACM Trans. Embed. Comput. Syst., 2023.</w:t>
+        <w:t xml:space="preserve">[6]	M. Pavan, E. Ostrovan, A. Caltabiano, and M. Roveri, “TyBox: An automatic design and code generation toolbox for TinyML incremental on-device learning,” ACM Trans. Embed. Comput. Syst., vol. 23, no. 3, pp. 1–27, 2024, doi: 10.1145/3604566.</w:t>
       </w:r>
     </w:p>
     <w:p>
@@ -5567,7 +6498,7 @@
           <w:sz w:val="16"/>
           <w:szCs w:val="16"/>
         </w:rPr>
-        <w:t xml:space="preserve">[7]	B. Morcego, W. Yin, S. Boersma, E. van Henten, V. Puig, and C. Sun, “Reinforcement learning versus model predictive control on greenhouse climate control,” Comput. Electron. Agric., vol. 215, Art. no. 108372, 2023.</w:t>
+        <w:t xml:space="preserve">[7]	B. Morcego, W. Yin, S. Boersma, E. van Henten, V. Puig, and C. Sun, “Reinforcement learning versus model predictive control on greenhouse climate control,” Comput. Electron. Agric., vol. 215, Art. no. 108372, 2023, doi: 10.1016/j.compag.2023.108372.</w:t>
       </w:r>
     </w:p>
     <w:p>
@@ -5584,7 +6515,7 @@
           <w:sz w:val="16"/>
           <w:szCs w:val="16"/>
         </w:rPr>
-        <w:t xml:space="preserve">[8]	H. Sun et al., “Grey-box humidity model identified on an STM32 for humidifier scheduling,” 2023 (as indexed by Consensus; full citation to be verified before submission).</w:t>
+        <w:t xml:space="preserve">[8]	B. Bicski, K. Farkas, and A. Pekar, “Simple heuristics as a viable alternative to machine learning-based anomaly detection in industrial IoT,” IEEE Internet Things Mag., vol. 6, no. 3, pp. 104–109, 2023, doi: 10.1109/IOTM.001.2200232.</w:t>
       </w:r>
     </w:p>
     <w:p>
@@ -5601,7 +6532,7 @@
           <w:sz w:val="16"/>
           <w:szCs w:val="16"/>
         </w:rPr>
-        <w:t xml:space="preserve">[9]	P. Bicski et al., “A simple autoregressive model versus an autoencoder for anomaly detection on industrial time series,” IEEE Internet Things Mag., 2023 (full citation to be verified before submission).</w:t>
+        <w:t xml:space="preserve">[9]	Bosch Sensortec, “BME280: Combined humidity and pressure sensor,” Datasheet BST-BME280-DS002, Reutlingen, Germany.</w:t>
       </w:r>
     </w:p>
     <w:p>
@@ -5618,24 +6549,7 @@
           <w:sz w:val="16"/>
           <w:szCs w:val="16"/>
         </w:rPr>
-        <w:t xml:space="preserve">[10]	Bosch Sensortec, “BME280: Combined humidity and pressure sensor,” Datasheet BST-BME280-DS002, Reutlingen, Germany.</w:t>
-      </w:r>
-    </w:p>
-    <w:p>
-      <w:pPr>
-        <w:tabs>
-          <w:tab w:val="left" w:pos="360"/>
-        </w:tabs>
-        <w:spacing w:after="40"/>
-        <w:ind w:left="360" w:hanging="360"/>
-        <w:jc w:val="left"/>
-      </w:pPr>
-      <w:r>
-        <w:rPr>
-          <w:sz w:val="16"/>
-          <w:szCs w:val="16"/>
-        </w:rPr>
-        <w:t xml:space="preserve">[11]	Espressif Systems, “ESP32 series datasheet,” Shanghai, China. [Online]. Available: https://www.espressif.com/en/support/documents/technical-documents</w:t>
+        <w:t xml:space="preserve">[10]	Espressif Systems, “ESP32 series datasheet,” Shanghai, China. [Online]. Available: https://www.espressif.com/en/support/documents/technical-documents</w:t>
       </w:r>
     </w:p>
     <w:sectPr>

</xml_diff>